<commit_message>
Frame final review around completed Gen5 thesis findings
</commit_message>
<xml_diff>
--- a/university/final_review_2026_10_10/PANEL_HANDBOOK.docx
+++ b/university/final_review_2026_10_10/PANEL_HANDBOOK.docx
@@ -57,25 +57,25 @@
         <w:t xml:space="preserve"> </w:t>
       </w:r>
       <w:r>
-        <w:t xml:space="preserve">concept,</w:t>
-      </w:r>
-      <w:r>
-        <w:t xml:space="preserve"> </w:t>
-      </w:r>
-      <w:r>
-        <w:t xml:space="preserve">method,</w:t>
-      </w:r>
-      <w:r>
-        <w:t xml:space="preserve"> </w:t>
-      </w:r>
-      <w:r>
-        <w:t xml:space="preserve">results,</w:t>
-      </w:r>
-      <w:r>
-        <w:t xml:space="preserve"> </w:t>
-      </w:r>
-      <w:r>
-        <w:t xml:space="preserve">limits,</w:t>
+        <w:t xml:space="preserve">completed</w:t>
+      </w:r>
+      <w:r>
+        <w:t xml:space="preserve"> </w:t>
+      </w:r>
+      <w:r>
+        <w:t xml:space="preserve">Gen5</w:t>
+      </w:r>
+      <w:r>
+        <w:t xml:space="preserve"> </w:t>
+      </w:r>
+      <w:r>
+        <w:t xml:space="preserve">study,</w:t>
+      </w:r>
+      <w:r>
+        <w:t xml:space="preserve"> </w:t>
+      </w:r>
+      <w:r>
+        <w:t xml:space="preserve">findings,</w:t>
       </w:r>
       <w:r>
         <w:t xml:space="preserve"> </w:t>
@@ -87,13 +87,13 @@
         <w:t xml:space="preserve"> </w:t>
       </w:r>
       <w:r>
-        <w:t xml:space="preserve">next</w:t>
-      </w:r>
-      <w:r>
-        <w:t xml:space="preserve"> </w:t>
-      </w:r>
-      <w:r>
-        <w:t xml:space="preserve">evidence</w:t>
+        <w:t xml:space="preserve">future</w:t>
+      </w:r>
+      <w:r>
+        <w:t xml:space="preserve"> </w:t>
+      </w:r>
+      <w:r>
+        <w:t xml:space="preserve">direction</w:t>
       </w:r>
     </w:p>
     <w:p>
@@ -245,13 +245,13 @@
           <w:b/>
           <w:bCs/>
         </w:rPr>
-        <w:t xml:space="preserve">Evidence note.</w:t>
-      </w:r>
-      <w:r>
-        <w:t xml:space="preserve"> </w:t>
-      </w:r>
-      <w:r>
-        <w:t xml:space="preserve">VOLLEY is an engineering design and computational research project. The Gen5 results in this handbook are model predictions, with numerical cross-checks where identified. No VOLLEY hardware has been built or tested, no CubeSat has been mechanically qualified for this launcher, and no launch provider has approved accommodation. The Gen6 speed range is a research envelope, not a demonstrated specification.</w:t>
+        <w:t xml:space="preserve">Scope of the completed thesis.</w:t>
+      </w:r>
+      <w:r>
+        <w:t xml:space="preserve"> </w:t>
+      </w:r>
+      <w:r>
+        <w:t xml:space="preserve">VOLLEY is a system-level engineering design and computational research project. The Gen5 analysis, comparisons and decision record are complete for the stated models. The results are predictions, with numerical cross-checks where identified. Physical prototype testing, CubeSat qualification and provider accommodation belong to a later development phase. Gen6 is presented separately as future work.</w:t>
       </w:r>
     </w:p>
     <w:p>
@@ -323,7 +323,7 @@
         <w:pStyle w:val="FirstParagraph"/>
       </w:pPr>
       <w:r>
-        <w:t xml:space="preserve">VOLLEY investigates a last-mile problem in rideshare launches: a secondary CubeSat reaches orbit but ordinarily receives the orbit selected for the primary payload. A spring deployer separates it safely, often at roughly 1–2 m/s, and the deployment time can change its in-track phase. A larger, deliberately commanded release velocity can also change orbital energy. The proposed mission splits responsibilities between a maneuvering host, which performs coarse repositioning, and a deployer, which supplies each satellite’s commanded release condition.</w:t>
+        <w:t xml:space="preserve">VOLLEY investigates a last-mile problem in rideshare launches: a secondary CubeSat reaches orbit but ordinarily receives the orbit selected for the primary payload. A spring deployer separates it safely, often at roughly 1–2 m/s, and the deployment time can change its in-track phase. A larger, deliberately commanded release velocity can also change orbital energy. The thesis evaluates whether that added capability justifies a complete deployer system. The mission model splits responsibilities between a maneuvering host, which performs coarse repositioning, and a deployer, which supplies each satellite’s commanded release condition.</w:t>
       </w:r>
     </w:p>
     <w:p>
@@ -502,7 +502,7 @@
         <w:t xml:space="preserve"> </w:t>
       </w:r>
       <w:r>
-        <w:t xml:space="preserve">as much hardware per 3U payload and fails the preset 15% mass-parity band. Physical payload loads, magnetic cleanliness, cycle life, and provider interfaces remain unresolved. Gen5 is therefore presented as a documented computational design study, not a selected current product.</w:t>
+        <w:t xml:space="preserve">as much hardware per 3U payload and fails the preset 15% mass-parity band. The study therefore reaches a decision: the modelled orbital benefit does not make this Gen5 configuration a defensible 3U selection. The result completes the analytical comparison; it does not require a prototype to know that the modelled mass criterion failed. Physical payload loads, magnetic cleanliness, cycle life, and provider interfaces remain questions for a different evidence phase.</w:t>
       </w:r>
     </w:p>
     <w:p>
@@ -1028,31 +1028,31 @@
               <w:jc w:val="left"/>
             </w:pPr>
             <w:r>
-              <w:t xml:space="preserve">Presentation objective</w:t>
-            </w:r>
-          </w:p>
-        </w:tc>
-        <w:tc>
-          <w:tcPr/>
-          <w:p>
-            <w:pPr>
-              <w:pStyle w:val="Compact"/>
-              <w:jc w:val="left"/>
-            </w:pPr>
-            <w:r>
-              <w:t xml:space="preserve">Evidence achieved</w:t>
-            </w:r>
-          </w:p>
-        </w:tc>
-        <w:tc>
-          <w:tcPr/>
-          <w:p>
-            <w:pPr>
-              <w:pStyle w:val="Compact"/>
-              <w:jc w:val="left"/>
-            </w:pPr>
-            <w:r>
-              <w:t xml:space="preserve">Remaining condition</w:t>
+              <w:t xml:space="preserve">Analytical research objective</w:t>
+            </w:r>
+          </w:p>
+        </w:tc>
+        <w:tc>
+          <w:tcPr/>
+          <w:p>
+            <w:pPr>
+              <w:pStyle w:val="Compact"/>
+              <w:jc w:val="left"/>
+            </w:pPr>
+            <w:r>
+              <w:t xml:space="preserve">Completed outcome</w:t>
+            </w:r>
+          </w:p>
+        </w:tc>
+        <w:tc>
+          <w:tcPr/>
+          <w:p>
+            <w:pPr>
+              <w:pStyle w:val="Compact"/>
+              <w:jc w:val="left"/>
+            </w:pPr>
+            <w:r>
+              <w:t xml:space="preserve">Interpretation</w:t>
             </w:r>
           </w:p>
         </w:tc>
@@ -1066,7 +1066,7 @@
               <w:jc w:val="left"/>
             </w:pPr>
             <w:r>
-              <w:t xml:space="preserve">Define a commandable 3U deployment architecture</w:t>
+              <w:t xml:space="preserve">Model a commandable 3U system</w:t>
             </w:r>
           </w:p>
         </w:tc>
@@ -1090,7 +1090,7 @@
               <w:jc w:val="left"/>
             </w:pPr>
             <w:r>
-              <w:t xml:space="preserve">No manufactured system or qualified payload interface</w:t>
+              <w:t xml:space="preserve">System-level design record, not manufactured hardware</w:t>
             </w:r>
           </w:p>
         </w:tc>
@@ -1128,7 +1128,7 @@
               <w:jc w:val="left"/>
             </w:pPr>
             <w:r>
-              <w:t xml:space="preserve">Measure actual thrust, power, timing, acceleration and dispersion</w:t>
+              <w:t xml:space="preserve">Predicted performance under stated assumptions</w:t>
             </w:r>
           </w:p>
         </w:tc>
@@ -1142,31 +1142,31 @@
               <w:jc w:val="left"/>
             </w:pPr>
             <w:r>
-              <w:t xml:space="preserve">Quantify orbital value</w:t>
-            </w:r>
-          </w:p>
-        </w:tc>
-        <w:tc>
-          <w:tcPr/>
-          <w:p>
-            <w:pPr>
-              <w:pStyle w:val="Compact"/>
-              <w:jc w:val="left"/>
-            </w:pPr>
-            <w:r>
-              <w:t xml:space="preserve">Orbit models and some independent numerical cross-checks</w:t>
-            </w:r>
-          </w:p>
-        </w:tc>
-        <w:tc>
-          <w:tcPr/>
-          <w:p>
-            <w:pPr>
-              <w:pStyle w:val="Compact"/>
-              <w:jc w:val="left"/>
-            </w:pPr>
-            <w:r>
-              <w:t xml:space="preserve">Bind atmosphere, mission cases and host control resources</w:t>
+              <w:t xml:space="preserve">Evaluate orbital value</w:t>
+            </w:r>
+          </w:p>
+        </w:tc>
+        <w:tc>
+          <w:tcPr/>
+          <w:p>
+            <w:pPr>
+              <w:pStyle w:val="Compact"/>
+              <w:jc w:val="left"/>
+            </w:pPr>
+            <w:r>
+              <w:t xml:space="preserve">Orbit model and selected independent numerical cross-checks</w:t>
+            </w:r>
+          </w:p>
+        </w:tc>
+        <w:tc>
+          <w:tcPr/>
+          <w:p>
+            <w:pPr>
+              <w:pStyle w:val="Compact"/>
+              <w:jc w:val="left"/>
+            </w:pPr>
+            <w:r>
+              <w:t xml:space="preserve">Conditional energy and lifetime benefit</w:t>
             </w:r>
           </w:p>
         </w:tc>
@@ -1180,31 +1180,31 @@
               <w:jc w:val="left"/>
             </w:pPr>
             <w:r>
-              <w:t xml:space="preserve">Test whether the whole system is competitive</w:t>
-            </w:r>
-          </w:p>
-        </w:tc>
-        <w:tc>
-          <w:tcPr/>
-          <w:p>
-            <w:pPr>
-              <w:pStyle w:val="Compact"/>
-              <w:jc w:val="left"/>
-            </w:pPr>
-            <w:r>
-              <w:t xml:space="preserve">Mass rollup, spring/alternatives comparison and failure criteria</w:t>
-            </w:r>
-          </w:p>
-        </w:tc>
-        <w:tc>
-          <w:tcPr/>
-          <w:p>
-            <w:pPr>
-              <w:pStyle w:val="Compact"/>
-              <w:jc w:val="left"/>
-            </w:pPr>
-            <w:r>
-              <w:t xml:space="preserve">Gen5 fails the 3U mass target; compare Gen6 candidates fairly</w:t>
+              <w:t xml:space="preserve">Test whole-system competitiveness</w:t>
+            </w:r>
+          </w:p>
+        </w:tc>
+        <w:tc>
+          <w:tcPr/>
+          <w:p>
+            <w:pPr>
+              <w:pStyle w:val="Compact"/>
+              <w:jc w:val="left"/>
+            </w:pPr>
+            <w:r>
+              <w:t xml:space="preserve">Mass rollup, spring/alternatives comparison and preset criteria</w:t>
+            </w:r>
+          </w:p>
+        </w:tc>
+        <w:tc>
+          <w:tcPr/>
+          <w:p>
+            <w:pPr>
+              <w:pStyle w:val="Compact"/>
+              <w:jc w:val="left"/>
+            </w:pPr>
+            <w:r>
+              <w:t xml:space="preserve">Gen5 fails the 3U mass target</w:t>
             </w:r>
           </w:p>
         </w:tc>
@@ -1218,31 +1218,31 @@
               <w:jc w:val="left"/>
             </w:pPr>
             <w:r>
-              <w:t xml:space="preserve">Define a next test-article path</w:t>
-            </w:r>
-          </w:p>
-        </w:tc>
-        <w:tc>
-          <w:tcPr/>
-          <w:p>
-            <w:pPr>
-              <w:pStyle w:val="Compact"/>
-              <w:jc w:val="left"/>
-            </w:pPr>
-            <w:r>
-              <w:t xml:space="preserve">PLAN-R2 gates N0–N5 and evidence requirements</w:t>
-            </w:r>
-          </w:p>
-        </w:tc>
-        <w:tc>
-          <w:tcPr/>
-          <w:p>
-            <w:pPr>
-              <w:pStyle w:val="Compact"/>
-              <w:jc w:val="left"/>
-            </w:pPr>
-            <w:r>
-              <w:t xml:space="preserve">Choose a configuration and obtain independent build/test review</w:t>
+              <w:t xml:space="preserve">Challenge model credibility</w:t>
+            </w:r>
+          </w:p>
+        </w:tc>
+        <w:tc>
+          <w:tcPr/>
+          <w:p>
+            <w:pPr>
+              <w:pStyle w:val="Compact"/>
+              <w:jc w:val="left"/>
+            </w:pPr>
+            <w:r>
+              <w:t xml:space="preserve">Numerical verification, defect corrections and provenance record</w:t>
+            </w:r>
+          </w:p>
+        </w:tc>
+        <w:tc>
+          <w:tcPr/>
+          <w:p>
+            <w:pPr>
+              <w:pStyle w:val="Compact"/>
+              <w:jc w:val="left"/>
+            </w:pPr>
+            <w:r>
+              <w:t xml:space="preserve">Scope and remaining physical uncertainties made explicit</w:t>
             </w:r>
           </w:p>
         </w:tc>
@@ -1253,7 +1253,7 @@
         <w:pStyle w:val="BodyText"/>
       </w:pPr>
       <w:r>
-        <w:t xml:space="preserve">These objectives summarize the research for this final-review presentation. The table reports results and unfinished work separately; it is not a claim that a university approved this exact list in advance.</w:t>
+        <w:t xml:space="preserve">These objectives summarize the completed analytical research for this final-review presentation. They are a presentation synthesis, not a claim that the university approved this exact list in advance. The physical development tasks are shown later under future work.</w:t>
       </w:r>
     </w:p>
     <w:bookmarkEnd w:id="31"/>
@@ -1768,31 +1768,31 @@
               <w:jc w:val="left"/>
             </w:pPr>
             <w:r>
-              <w:t xml:space="preserve">September 2026 onward</w:t>
-            </w:r>
-          </w:p>
-        </w:tc>
-        <w:tc>
-          <w:tcPr/>
-          <w:p>
-            <w:pPr>
-              <w:pStyle w:val="Compact"/>
-              <w:jc w:val="left"/>
-            </w:pPr>
-            <w:r>
-              <w:t xml:space="preserve">Gen6 mission and mechanism choice reopened</w:t>
-            </w:r>
-          </w:p>
-        </w:tc>
-        <w:tc>
-          <w:tcPr/>
-          <w:p>
-            <w:pPr>
-              <w:pStyle w:val="Compact"/>
-              <w:jc w:val="left"/>
-            </w:pPr>
-            <w:r>
-              <w:t xml:space="preserve">PLAN-R2 dated 29 September 2026</w:t>
+              <w:t xml:space="preserve">October 2026</w:t>
+            </w:r>
+          </w:p>
+        </w:tc>
+        <w:tc>
+          <w:tcPr/>
+          <w:p>
+            <w:pPr>
+              <w:pStyle w:val="Compact"/>
+              <w:jc w:val="left"/>
+            </w:pPr>
+            <w:r>
+              <w:t xml:space="preserve">Gen5 findings and design decision presented for final review</w:t>
+            </w:r>
+          </w:p>
+        </w:tc>
+        <w:tc>
+          <w:tcPr/>
+          <w:p>
+            <w:pPr>
+              <w:pStyle w:val="Compact"/>
+              <w:jc w:val="left"/>
+            </w:pPr>
+            <w:r>
+              <w:t xml:space="preserve">Review package dated 10 October 2026</w:t>
             </w:r>
           </w:p>
         </w:tc>
@@ -1803,7 +1803,7 @@
         <w:pStyle w:val="BodyText"/>
       </w:pPr>
       <w:r>
-        <w:t xml:space="preserve">The thesis repository’s reconstructed history expressly marks several early milestone dates as approximate. The next research gates are ordered by dependency rather than by invented semester dates: N0 mission envelope, N1 coupled campaign evidence, N2 architecture trade, N3 installed burden/faults, N4 BOLLEY drive decision, and N5 first-test evidence package. Physical manufacture, integrated tests, qualification and flight are later milestones.</w:t>
+        <w:t xml:space="preserve">The thesis repository’s reconstructed history expressly marks several early milestone dates as approximate. The analytical baseline was revised as evidence improved: a CAD-derived sled mass displaced a lighter parametric estimate; a depth-resolved thrust calculation lowered the rated speed; an enclosure buildup exposed the 3U mass penalty; and an independent orbit check rejected an overbroad solar-invariance claim. These revisions are part of the completed study, not signs that the final numbers are placeholders. Gen6 research gates are described only in §10, Future work.</w:t>
       </w:r>
     </w:p>
     <w:bookmarkEnd w:id="40"/>
@@ -1822,7 +1822,7 @@
         <w:pStyle w:val="FirstParagraph"/>
       </w:pPr>
       <w:r>
-        <w:t xml:space="preserve">The current review package includes an authored manuscript, CAD renders and model geometry, analysis scripts/results, validation run sheets, figures, a baseline record, a defect register, and a provenance statement. Numerical investigations cover the motor field, shot dynamics, bank/circuit, mass, orbit propagation, separation and selected structural, airflow and reliability issues. A key discipline is retaining failures and superseded results rather than silently replacing them.</w:t>
+        <w:t xml:space="preserve">The thesis deliverables are in hand: an authored manuscript, CAD renders and model geometry, analysis scripts/results, numerical verification run sheets, figures, a baseline record, a defect register, and a provenance statement. Numerical investigations cover the motor field, shot dynamics, bank/circuit, mass, orbit propagation, separation and selected structural, airflow and reliability issues. The study closes by retaining failed criteria and superseded results rather than silently replacing them.</w:t>
       </w:r>
     </w:p>
     <w:p>
@@ -1830,7 +1830,7 @@
         <w:pStyle w:val="BodyText"/>
       </w:pPr>
       <w:r>
-        <w:t xml:space="preserve">Evidence is not evenly mature. Gen5 is well documented as a computational case but has no physical article. The later long gas-guide and independent spring-cell studies are historical comparators, neither a selected current architecture nor proof that Gen6 is closed. Gen6 has a mission direction and wide investigation envelope, with mechanism and exact payload/provider cases still to be selected. The published record must not be represented as a 1 km/s demonstrated launcher.</w:t>
+        <w:t xml:space="preserve">The deliverable here is a completed computational thesis, not a flight article. The later long gas-guide and independent spring-cell studies are historical comparators. Gen6 has a mission direction and investigation envelope but is not a result of the Gen5 thesis. Its mechanism and exact payload/provider cases remain future choices.</w:t>
       </w:r>
     </w:p>
     <w:bookmarkEnd w:id="42"/>
@@ -2652,13 +2652,13 @@
       </w:r>
     </w:p>
     <w:bookmarkEnd w:id="56"/>
-    <w:bookmarkStart w:id="57" w:name="decision-critical-uncertainty"/>
+    <w:bookmarkStart w:id="57" w:name="decision-and-evidence-boundary"/>
     <w:p>
       <w:pPr>
         <w:pStyle w:val="Heading2"/>
       </w:pPr>
       <w:r>
-        <w:t xml:space="preserve">Decision-critical uncertainty</w:t>
+        <w:t xml:space="preserve">Decision and evidence boundary</w:t>
       </w:r>
     </w:p>
     <w:p>
@@ -2666,7 +2666,7 @@
         <w:pStyle w:val="FirstParagraph"/>
       </w:pPr>
       <w:r>
-        <w:t xml:space="preserve">The unresolved physical risks include the release mechanism’s cycle reliability, shock and arrest loads transmitted to stowed satellites, field exposure and residual magnetisation near a customer payload, host attitude/control authority and provider approval. The known-problems register ranks several of these as potentially design-fatal. No amount of additional plotting converts those uncertainties into a measured qualification. The right next experiment is selected to discriminate a mechanism claim, not merely to improve presentation quality.</w:t>
+        <w:t xml:space="preserve">The completed analytical result has three parts. The model supports a commandable release and conditional orbital-energy benefit; the full-system 3U mass criterion fails; and the physical behavior remains unverified. The last category includes release-cycle reliability, shock and arrest loads transmitted to stowed satellites, field exposure near a customer payload, host attitude/control authority and provider approval. The known-problems register ranks several as potentially design-fatal. Their existence limits product claims but does not undo the completed analytical finding.</w:t>
       </w:r>
     </w:p>
     <w:bookmarkEnd w:id="57"/>
@@ -2685,7 +2685,7 @@
         <w:pStyle w:val="FirstParagraph"/>
       </w:pPr>
       <w:r>
-        <w:t xml:space="preserve">The Gen5 computational study supports a narrow and useful conclusion: a commandable moderate-acceleration release is plausible enough to analyse as a system, and a modelled release can change a CubeSat’s orbital energy. The same complete accounting shows Gen5 misses its 3U mass benchmark and leaves critical mechanical, magnetic and operational questions unmeasured. It cannot presently be described as flight-ready, provider-compatible or build-released.</w:t>
+        <w:t xml:space="preserve">The Gen5 computational thesis reaches a complete engineering conclusion within its stated scope. Its system-level model predicts a commandable moderate-acceleration release and a conditional orbital-energy benefit. Complete installed-mass accounting then shows the configuration misses its preset 3U benchmark. The answer to the thesis trade question is therefore conditional benefit with an unfavourable 3U system cost. Hardware behavior and interfaces remain outside the tested evidence, so the result is a research conclusion rather than a flight-readiness claim.</w:t>
       </w:r>
     </w:p>
     <w:p>
@@ -2693,7 +2693,7 @@
         <w:pStyle w:val="BodyText"/>
       </w:pPr>
       <w:r>
-        <w:t xml:space="preserve">The thesis’s strongest engineering contribution is the transparent decision record: the complete machine was modelled, independent numerical checks corrected several claims, and an unfavourable mass result was retained. This record provides a defensible starting point for the next architecture trade.</w:t>
+        <w:t xml:space="preserve">The thesis’s strongest engineering contribution is the transparent decision record: the full machine was modelled, independent numerical checks corrected several claims, and an unfavourable mass result was retained. That closes the Gen5 study and provides a defensible input to a separate future architecture trade.</w:t>
       </w:r>
     </w:p>
     <w:bookmarkEnd w:id="59"/>
@@ -2723,7 +2723,7 @@
       </w:r>
     </w:p>
     <w:bookmarkEnd w:id="60"/>
-    <w:bookmarkStart w:id="62" w:name="references-and-project-records"/>
+    <w:bookmarkStart w:id="61" w:name="references-and-project-records"/>
     <w:p>
       <w:pPr>
         <w:pStyle w:val="Heading1"/>
@@ -3118,189 +3118,7 @@
         <w:t xml:space="preserve">, controlled working baseline, 29 September 2026. Project plan, not achieved performance.</w:t>
       </w:r>
     </w:p>
-    <w:bookmarkStart w:id="61" w:name="final-review-marking-crosswalk"/>
-    <w:p>
-      <w:pPr>
-        <w:pStyle w:val="Heading2"/>
-      </w:pPr>
-      <w:r>
-        <w:t xml:space="preserve">Final-review marking crosswalk</w:t>
-      </w:r>
-    </w:p>
-    <w:tbl>
-      <w:tblPr>
-        <w:tblStyle w:val="Table"/>
-        <w:tblW w:type="pct" w:w="5000"/>
-        <w:jc w:val="left"/>
-        <w:tblLayout w:type="fixed"/>
-        <w:tblLook w:firstRow="1" w:lastRow="0" w:firstColumn="0" w:lastColumn="0" w:noHBand="0" w:noVBand="0" w:val="0020"/>
-      </w:tblPr>
-      <w:tblGrid>
-        <w:gridCol w:w="3960"/>
-        <w:gridCol w:w="3960"/>
-      </w:tblGrid>
-      <w:tr>
-        <w:trPr>
-          <w:tblHeader w:val="on"/>
-        </w:trPr>
-        <w:tc>
-          <w:tcPr/>
-          <w:p>
-            <w:pPr>
-              <w:pStyle w:val="Compact"/>
-              <w:jc w:val="left"/>
-            </w:pPr>
-            <w:r>
-              <w:t xml:space="preserve">Final-review criterion</w:t>
-            </w:r>
-          </w:p>
-        </w:tc>
-        <w:tc>
-          <w:tcPr/>
-          <w:p>
-            <w:pPr>
-              <w:pStyle w:val="Compact"/>
-              <w:jc w:val="left"/>
-            </w:pPr>
-            <w:r>
-              <w:t xml:space="preserve">Handbook sections and presentation evidence</w:t>
-            </w:r>
-          </w:p>
-        </w:tc>
-      </w:tr>
-      <w:tr>
-        <w:tc>
-          <w:tcPr/>
-          <w:p>
-            <w:pPr>
-              <w:pStyle w:val="Compact"/>
-              <w:jc w:val="left"/>
-            </w:pPr>
-            <w:r>
-              <w:t xml:space="preserve">Achievement of objectives (10 marks)</w:t>
-            </w:r>
-          </w:p>
-        </w:tc>
-        <w:tc>
-          <w:tcPr/>
-          <w:p>
-            <w:pPr>
-              <w:pStyle w:val="Compact"/>
-              <w:jc w:val="left"/>
-            </w:pPr>
-            <w:r>
-              <w:t xml:space="preserve">Objectives table; Results; Conclusion</w:t>
-            </w:r>
-          </w:p>
-        </w:tc>
-      </w:tr>
-      <w:tr>
-        <w:tc>
-          <w:tcPr/>
-          <w:p>
-            <w:pPr>
-              <w:pStyle w:val="Compact"/>
-              <w:jc w:val="left"/>
-            </w:pPr>
-            <w:r>
-              <w:t xml:space="preserve">Technical quality and innovation (10 marks)</w:t>
-            </w:r>
-          </w:p>
-        </w:tc>
-        <w:tc>
-          <w:tcPr/>
-          <w:p>
-            <w:pPr>
-              <w:pStyle w:val="Compact"/>
-              <w:jc w:val="left"/>
-            </w:pPr>
-            <w:r>
-              <w:t xml:space="preserve">Literature review; Research gap; Methodology; system architecture</w:t>
-            </w:r>
-          </w:p>
-        </w:tc>
-      </w:tr>
-      <w:tr>
-        <w:tc>
-          <w:tcPr/>
-          <w:p>
-            <w:pPr>
-              <w:pStyle w:val="Compact"/>
-              <w:jc w:val="left"/>
-            </w:pPr>
-            <w:r>
-              <w:t xml:space="preserve">Results, validation and analysis (5 marks)</w:t>
-            </w:r>
-          </w:p>
-        </w:tc>
-        <w:tc>
-          <w:tcPr/>
-          <w:p>
-            <w:pPr>
-              <w:pStyle w:val="Compact"/>
-              <w:jc w:val="left"/>
-            </w:pPr>
-            <w:r>
-              <w:t xml:space="preserve">Results tables and plots; numerical-check limits</w:t>
-            </w:r>
-          </w:p>
-        </w:tc>
-      </w:tr>
-      <w:tr>
-        <w:tc>
-          <w:tcPr/>
-          <w:p>
-            <w:pPr>
-              <w:pStyle w:val="Compact"/>
-              <w:jc w:val="left"/>
-            </w:pPr>
-            <w:r>
-              <w:t xml:space="preserve">Project report and documentation (5 marks)</w:t>
-            </w:r>
-          </w:p>
-        </w:tc>
-        <w:tc>
-          <w:tcPr/>
-          <w:p>
-            <w:pPr>
-              <w:pStyle w:val="Compact"/>
-              <w:jc w:val="left"/>
-            </w:pPr>
-            <w:r>
-              <w:t xml:space="preserve">Manuscript, baseline, provenance, defects and cited source records</w:t>
-            </w:r>
-          </w:p>
-        </w:tc>
-      </w:tr>
-      <w:tr>
-        <w:tc>
-          <w:tcPr/>
-          <w:p>
-            <w:pPr>
-              <w:pStyle w:val="Compact"/>
-              <w:jc w:val="left"/>
-            </w:pPr>
-            <w:r>
-              <w:t xml:space="preserve">Presentation, demonstration and viva (10 marks)</w:t>
-            </w:r>
-          </w:p>
-        </w:tc>
-        <w:tc>
-          <w:tcPr/>
-          <w:p>
-            <w:pPr>
-              <w:pStyle w:val="Compact"/>
-              <w:jc w:val="left"/>
-            </w:pPr>
-            <w:r>
-              <w:t xml:space="preserve">Main slides and reproducible simulation walkthrough; presenter reference book</w:t>
-            </w:r>
-          </w:p>
-        </w:tc>
-      </w:tr>
-    </w:tbl>
     <w:bookmarkEnd w:id="61"/>
-    <w:bookmarkEnd w:id="62"/>
     <w:sectPr/>
   </w:body>
 </w:document>

</xml_diff>

<commit_message>
Publish self-contained Gen5 thesis and corrected review pack
</commit_message>
<xml_diff>
--- a/university/final_review_2026_10_10/PANEL_HANDBOOK.docx
+++ b/university/final_review_2026_10_10/PANEL_HANDBOOK.docx
@@ -323,7 +323,7 @@
         <w:pStyle w:val="FirstParagraph"/>
       </w:pPr>
       <w:r>
-        <w:t xml:space="preserve">VOLLEY investigates a last-mile problem in rideshare launches: a secondary CubeSat reaches orbit but ordinarily receives the orbit selected for the primary payload. A spring deployer separates it safely, often at roughly 1–2 m/s, and the deployment time can change its in-track phase. A larger, deliberately commanded release velocity can also change orbital energy. The thesis evaluates whether that added capability justifies a complete deployer system. The mission model splits responsibilities between a maneuvering host, which performs coarse repositioning, and a deployer, which supplies each satellite’s commanded release condition.</w:t>
+        <w:t xml:space="preserve">VOLLEY investigates a last-mile problem in rideshare launches: a secondary CubeSat reaches orbit but ordinarily receives the orbit selected for the primary payload. A spring deployer separates it safely, often at roughly 1–2 m/s; that relative impulse, later drag differences, or host maneuvering can change its in-track phase. Deployment time by itself does not create persistent phase separation from an otherwise unchanged co-orbital host. A larger, deliberately commanded release velocity can also change orbital energy. The thesis evaluates whether that added capability justifies a complete deployer system. The mission model splits responsibilities between a maneuvering host, which performs coarse repositioning, and a deployer, which supplies each satellite’s commanded release condition.</w:t>
       </w:r>
     </w:p>
     <w:p>
@@ -587,13 +587,13 @@
           <w:b/>
           <w:bCs/>
         </w:rPr>
-        <w:t xml:space="preserve">release energy</w:t>
-      </w:r>
-      <w:r>
-        <w:t xml:space="preserve"> </w:t>
-      </w:r>
-      <w:r>
-        <w:t xml:space="preserve">is central. Waiting between launches can produce in-track phase spacing without spending a larger release impulse. A commanded velocity along or against orbital motion can change the satellite’s orbital energy and semi-major axis. VOLLEY studies the latter capability while retaining a clear comparison with timed spring release and other alternatives. It does not claim that all constellation phasing requires a motor.</w:t>
+        <w:t xml:space="preserve">relative-state change</w:t>
+      </w:r>
+      <w:r>
+        <w:t xml:space="preserve"> </w:t>
+      </w:r>
+      <w:r>
+        <w:t xml:space="preserve">is central. Waiting alone between zero-relative-impulse releases from an unchanged host does not produce persistent in-track phase spacing. Spring impulse, differential drag or a host maneuver can produce a relative state; a commanded velocity along or against orbital motion can change the satellite’s orbital energy and semi-major axis. VOLLEY studies the latter capability while retaining a clear comparison with spring release and other alternatives. It does not claim that all constellation phasing requires a motor.</w:t>
       </w:r>
     </w:p>
     <w:p>
@@ -771,7 +771,7 @@
               <w:jc w:val="left"/>
             </w:pPr>
             <w:r>
-              <w:t xml:space="preserve">Timed release and differential drag</w:t>
+              <w:t xml:space="preserve">Spring release and differential drag</w:t>
             </w:r>
           </w:p>
         </w:tc>
@@ -795,7 +795,7 @@
               <w:jc w:val="left"/>
             </w:pPr>
             <w:r>
-              <w:t xml:space="preserve">Timing alone can phase satellites; drag is atmosphere- and attitude-dependent.</w:t>
+              <w:t xml:space="preserve">A relative impulse or drag difference creates the separation; waiting alone from an unchanged co-orbital host does not.</w:t>
             </w:r>
           </w:p>
         </w:tc>
@@ -2417,7 +2417,7 @@
         <w:t xml:space="preserve"> </w:t>
       </w:r>
       <w:r>
-        <w:t xml:space="preserve">lifetime multiplier for a propulsionless satellite. The more defensible message is conditional: a release impulse can change orbital energy, while absolute lifetime and lifetime gain depend on atmospheric density and the orbit model. A fresh independent run of the exact current 1.60 operating point remains outstanding. Timing alone can produce in-track phasing; it does not produce the same semi-major-axis change.</w:t>
+        <w:t xml:space="preserve">lifetime multiplier for a propulsionless satellite. The more defensible message is conditional: a release impulse can change orbital energy, while absolute lifetime and lifetime gain depend on atmospheric density and the orbit model. A fresh independent run of the exact current 1.60 operating point remains outstanding. Timing alone, with zero relative impulse and no host or drag difference, produces neither persistent phasing nor this semi-major-axis change.</w:t>
       </w:r>
     </w:p>
     <w:p>

</xml_diff>

<commit_message>
Align thesis CAD provenance and rebuild final review downloads
</commit_message>
<xml_diff>
--- a/university/final_review_2026_10_10/PANEL_HANDBOOK.docx
+++ b/university/final_review_2026_10_10/PANEL_HANDBOOK.docx
@@ -360,7 +360,7 @@
         <w:t xml:space="preserve">10.07 g</w:t>
       </w:r>
       <w:r>
-        <w:t xml:space="preserve">. Its full dry system mass is</w:t>
+        <w:t xml:space="preserve">. Its modeled dry-mass rollup is</w:t>
       </w:r>
       <w:r>
         <w:t xml:space="preserve"> </w:t>
@@ -2490,7 +2490,7 @@
         <w:pStyle w:val="FirstParagraph"/>
       </w:pPr>
       <w:r>
-        <w:t xml:space="preserve">The dry Gen5 rollup is</w:t>
+        <w:t xml:space="preserve">The modeled Gen5 dry rollup is</w:t>
       </w:r>
       <w:r>
         <w:t xml:space="preserve"> </w:t>
@@ -2519,7 +2519,7 @@
         <w:t xml:space="preserve">174.6 kg</w:t>
       </w:r>
       <w:r>
-        <w:t xml:space="preserve">. At twelve 3U customers, the deployer weighs</w:t>
+        <w:t xml:space="preserve">; these include assumed hardware and historical Gen3 sled volume, not a mass extraction from a complete installed Gen5 assembly. At twelve 3U customers, the deployer weighs</w:t>
       </w:r>
       <w:r>
         <w:t xml:space="preserve"> </w:t>

</xml_diff>

<commit_message>
Integrate audited market fit into Gen5 academic review
</commit_message>
<xml_diff>
--- a/university/final_review_2026_10_10/PANEL_HANDBOOK.docx
+++ b/university/final_review_2026_10_10/PANEL_HANDBOOK.docx
@@ -530,7 +530,7 @@
       </w:r>
     </w:p>
     <w:bookmarkEnd w:id="23"/>
-    <w:bookmarkStart w:id="28" w:name="introduction"/>
+    <w:bookmarkStart w:id="34" w:name="introduction"/>
     <w:p>
       <w:pPr>
         <w:pStyle w:val="Heading1"/>
@@ -539,7 +539,7 @@
         <w:t xml:space="preserve">1. Introduction</w:t>
       </w:r>
     </w:p>
-    <w:bookmarkStart w:id="27" w:name="the-deployment-problem"/>
+    <w:bookmarkStart w:id="24" w:name="the-deployment-problem"/>
     <w:p>
       <w:pPr>
         <w:pStyle w:val="Heading2"/>
@@ -602,6 +602,151 @@
       </w:pPr>
       <w:r>
         <w:t xml:space="preserve">The host is an active participant in the mission model. After its primary mission, a suitable hosted platform would need attitude control, available resources and permission to operate. It could perform coarse orbital repositioning; VOLLEY would assign each secondary payload a local release state. No specific upper stage has been selected or approved for that role.</w:t>
+      </w:r>
+    </w:p>
+    <w:bookmarkEnd w:id="24"/>
+    <w:bookmarkStart w:id="33" w:name="buyer-and-spacecraft-fit"/>
+    <w:p>
+      <w:pPr>
+        <w:pStyle w:val="Heading2"/>
+      </w:pPr>
+      <w:r>
+        <w:t xml:space="preserve">Buyer and spacecraft fit</w:t>
+      </w:r>
+    </w:p>
+    <w:p>
+      <w:pPr>
+        <w:pStyle w:val="FirstParagraph"/>
+      </w:pPr>
+      <w:r>
+        <w:t xml:space="preserve">The</w:t>
+      </w:r>
+      <w:r>
+        <w:t xml:space="preserve"> </w:t>
+      </w:r>
+      <w:hyperlink r:id="rId25">
+        <w:r>
+          <w:rPr>
+            <w:rStyle w:val="Hyperlink"/>
+          </w:rPr>
+          <w:t xml:space="preserve">audited market and customer-fit report</w:t>
+        </w:r>
+      </w:hyperlink>
+      <w:r>
+        <w:t xml:space="preserve"> </w:t>
+      </w:r>
+      <w:r>
+        <w:t xml:space="preserve">checks the relevant Drive market thesis and independent business-case review against current primary sources.</w:t>
+      </w:r>
+      <w:r>
+        <w:t xml:space="preserve"> </w:t>
+      </w:r>
+      <w:hyperlink r:id="rId26">
+        <w:r>
+          <w:rPr>
+            <w:rStyle w:val="Hyperlink"/>
+          </w:rPr>
+          <w:t xml:space="preserve">Planet’s FY2026 filing</w:t>
+        </w:r>
+      </w:hyperlink>
+      <w:r>
+        <w:t xml:space="preserve"> </w:t>
+      </w:r>
+      <w:r>
+        <w:t xml:space="preserve">and</w:t>
+      </w:r>
+      <w:r>
+        <w:t xml:space="preserve"> </w:t>
+      </w:r>
+      <w:hyperlink r:id="rId27">
+        <w:r>
+          <w:rPr>
+            <w:rStyle w:val="Hyperlink"/>
+          </w:rPr>
+          <w:t xml:space="preserve">Spire’s 2025 filing</w:t>
+        </w:r>
+      </w:hyperlink>
+      <w:r>
+        <w:t xml:space="preserve"> </w:t>
+      </w:r>
+      <w:r>
+        <w:t xml:space="preserve">show repeatable, configurable smallsat production.</w:t>
+      </w:r>
+      <w:r>
+        <w:t xml:space="preserve"> </w:t>
+      </w:r>
+      <w:hyperlink r:id="rId28">
+        <w:r>
+          <w:rPr>
+            <w:rStyle w:val="Hyperlink"/>
+          </w:rPr>
+          <w:t xml:space="preserve">NASA’s 2026 launch review</w:t>
+        </w:r>
+      </w:hyperlink>
+      <w:r>
+        <w:t xml:space="preserve"> </w:t>
+      </w:r>
+      <w:r>
+        <w:t xml:space="preserve">confirms that a primary mission can constrain the orbit available to rideshare payloads. Together, these support a</w:t>
+      </w:r>
+      <w:r>
+        <w:t xml:space="preserve"> </w:t>
+      </w:r>
+      <w:r>
+        <w:rPr>
+          <w:i/>
+          <w:iCs/>
+        </w:rPr>
+        <w:t xml:space="preserve">mission hypothesis</w:t>
+      </w:r>
+      <w:r>
+        <w:t xml:space="preserve">, not customer demand.</w:t>
+      </w:r>
+    </w:p>
+    <w:p>
+      <w:pPr>
+        <w:pStyle w:val="BodyText"/>
+      </w:pPr>
+      <w:r>
+        <w:t xml:space="preserve">The likely party that could pay for individualized release states is a carrier, rideshare integrator or constellation operator responsible for a delivered manifest. A standardized satellite-bus maker may specify interfaces but need not buy the system. Replenishment batches and mixed-payload rideshare are candidate jobs. A one-satellite mission already in a suitable orbit is a poor fit and should favor a qualified conventional dispenser. The analyzed Gen5 system carries twelve 3U spacecraft but fails its own 3U mass screen; a PocketQube batch is a</w:t>
+      </w:r>
+      <w:r>
+        <w:t xml:space="preserve"> </w:t>
+      </w:r>
+      <w:r>
+        <w:rPr>
+          <w:b/>
+          <w:bCs/>
+        </w:rPr>
+        <w:t xml:space="preserve">future interface redesign</w:t>
+      </w:r>
+      <w:r>
+        <w:t xml:space="preserve">, not an accommodated or qualified Gen5 payload class. Payloads sensitive to magnetic fields need an explicit exclusion or design remedy. No buyer, payload or provider has confirmed these requirements.</w:t>
+      </w:r>
+    </w:p>
+    <w:p>
+      <w:pPr>
+        <w:pStyle w:val="BodyText"/>
+      </w:pPr>
+      <w:r>
+        <w:t xml:space="preserve">For an economic result, price and simulate the same manifest delivered with ordinary spring impulse, spring plus host manoeuvres, onboard propulsion, an orbital-transport service and VOLLEY. The published</w:t>
+      </w:r>
+      <w:r>
+        <w:t xml:space="preserve"> </w:t>
+      </w:r>
+      <w:hyperlink r:id="rId29">
+        <w:r>
+          <w:rPr>
+            <w:rStyle w:val="Hyperlink"/>
+          </w:rPr>
+          <w:t xml:space="preserve">SpaceX rideshare starting price</w:t>
+        </w:r>
+      </w:hyperlink>
+      <w:r>
+        <w:t xml:space="preserve"> </w:t>
+      </w:r>
+      <w:r>
+        <w:t xml:space="preserve">cannot stand in for an installed VOLLEY cost or savings quote. A three-to-five-year replacement cycle and a 5–50 m/s release range are research hypotheses from the Drive market report, not Gen5 operating requirements or established market demand. The Gen6 1 km/s upper objective is a different, unvalidated regime.</w:t>
       </w:r>
     </w:p>
     <w:p>
@@ -613,18 +758,18 @@
           <wp:inline>
             <wp:extent cx="5334000" cy="2669996"/>
             <wp:effectExtent b="0" l="0" r="0" t="0"/>
-            <wp:docPr descr="Gen5 layout and mission hardware elements. Diagram from the thesis analysis." title="" id="25" name="Picture"/>
+            <wp:docPr descr="Gen5 layout and mission hardware elements. Diagram from the thesis analysis." title="" id="31" name="Picture"/>
             <a:graphic>
               <a:graphicData uri="http://schemas.openxmlformats.org/drawingml/2006/picture">
                 <pic:pic>
                   <pic:nvPicPr>
-                    <pic:cNvPr descr="../../source/figures/D02_layout.png" id="26" name="Picture"/>
+                    <pic:cNvPr descr="../../source/figures/D02_layout.png" id="32" name="Picture"/>
                     <pic:cNvPicPr>
                       <a:picLocks noChangeArrowheads="1" noChangeAspect="1"/>
                     </pic:cNvPicPr>
                   </pic:nvPicPr>
                   <pic:blipFill>
-                    <a:blip r:embed="rId24"/>
+                    <a:blip r:embed="rId30"/>
                     <a:stretch>
                       <a:fillRect/>
                     </a:stretch>
@@ -659,9 +804,9 @@
         <w:t xml:space="preserve">Gen5 layout and mission hardware elements. Diagram from the thesis analysis.</w:t>
       </w:r>
     </w:p>
-    <w:bookmarkEnd w:id="27"/>
-    <w:bookmarkEnd w:id="28"/>
-    <w:bookmarkStart w:id="29" w:name="literature-review"/>
+    <w:bookmarkEnd w:id="33"/>
+    <w:bookmarkEnd w:id="34"/>
+    <w:bookmarkStart w:id="35" w:name="literature-review"/>
     <w:p>
       <w:pPr>
         <w:pStyle w:val="Heading1"/>
@@ -949,8 +1094,8 @@
         <w:t xml:space="preserve">satellite at a much lower acceleration while accounting for the whole installed system. No universal CubeSat quasi-static acceleration qualification is assumed; the launch provider and payload-specific limits must govern a real design [2,8].</w:t>
       </w:r>
     </w:p>
-    <w:bookmarkEnd w:id="29"/>
-    <w:bookmarkStart w:id="30" w:name="research-gap"/>
+    <w:bookmarkEnd w:id="35"/>
+    <w:bookmarkStart w:id="36" w:name="research-gap"/>
     <w:p>
       <w:pPr>
         <w:pStyle w:val="Heading1"/>
@@ -993,8 +1138,8 @@
         <w:t xml:space="preserve">The thesis addresses that gap by constructing a complete Gen5 computational configuration and testing its own claims against explicit comparisons. It also records when those tests weaken the concept. Physical viability remains a separate research gap: numerical model agreement cannot establish manufactured tolerances, actual force, payload cleanliness, cycle reliability or provider compatibility.</w:t>
       </w:r>
     </w:p>
-    <w:bookmarkEnd w:id="30"/>
-    <w:bookmarkStart w:id="31" w:name="objectives-and-outcome"/>
+    <w:bookmarkEnd w:id="36"/>
+    <w:bookmarkStart w:id="37" w:name="objectives-and-outcome"/>
     <w:p>
       <w:pPr>
         <w:pStyle w:val="Heading1"/>
@@ -1256,8 +1401,8 @@
         <w:t xml:space="preserve">These objectives summarize the completed analytical research for this final-review presentation. They are a presentation synthesis, not a claim that the university approved this exact list in advance. The physical development tasks are shown later under future work.</w:t>
       </w:r>
     </w:p>
-    <w:bookmarkEnd w:id="31"/>
-    <w:bookmarkStart w:id="39" w:name="research-methodology"/>
+    <w:bookmarkEnd w:id="37"/>
+    <w:bookmarkStart w:id="45" w:name="research-methodology"/>
     <w:p>
       <w:pPr>
         <w:pStyle w:val="Heading1"/>
@@ -1415,18 +1560,18 @@
           <wp:inline>
             <wp:extent cx="5334000" cy="2028422"/>
             <wp:effectExtent b="0" l="0" r="0" t="0"/>
-            <wp:docPr descr="Modelled shot: velocity, bank voltage and current at the rated point." title="" id="33" name="Picture"/>
+            <wp:docPr descr="Modelled shot: velocity, bank voltage and current at the rated point." title="" id="39" name="Picture"/>
             <a:graphic>
               <a:graphicData uri="http://schemas.openxmlformats.org/drawingml/2006/picture">
                 <pic:pic>
                   <pic:nvPicPr>
-                    <pic:cNvPr descr="../../source/figures/F01_shot.png" id="34" name="Picture"/>
+                    <pic:cNvPr descr="../../source/figures/F01_shot.png" id="40" name="Picture"/>
                     <pic:cNvPicPr>
                       <a:picLocks noChangeArrowheads="1" noChangeAspect="1"/>
                     </pic:cNvPicPr>
                   </pic:nvPicPr>
                   <pic:blipFill>
-                    <a:blip r:embed="rId32"/>
+                    <a:blip r:embed="rId38"/>
                     <a:stretch>
                       <a:fillRect/>
                     </a:stretch>
@@ -1461,7 +1606,7 @@
         <w:t xml:space="preserve">Modelled shot: velocity, bank voltage and current at the rated point.</w:t>
       </w:r>
     </w:p>
-    <w:bookmarkStart w:id="38" w:name="numerical-checks-and-their-limits"/>
+    <w:bookmarkStart w:id="44" w:name="numerical-checks-and-their-limits"/>
     <w:p>
       <w:pPr>
         <w:pStyle w:val="Heading2"/>
@@ -1487,18 +1632,18 @@
           <wp:inline>
             <wp:extent cx="4427220" cy="1990820"/>
             <wp:effectExtent b="0" l="0" r="0" t="0"/>
-            <wp:docPr descr="Representative magnetic-field model output. Source: thesis figure A02." title="" id="36" name="Picture"/>
+            <wp:docPr descr="Representative magnetic-field model output. Source: thesis figure A02." title="" id="42" name="Picture"/>
             <a:graphic>
               <a:graphicData uri="http://schemas.openxmlformats.org/drawingml/2006/picture">
                 <pic:pic>
                   <pic:nvPicPr>
-                    <pic:cNvPr descr="../../source/figures/A02_field_map.png" id="37" name="Picture"/>
+                    <pic:cNvPr descr="../../source/figures/A02_field_map.png" id="43" name="Picture"/>
                     <pic:cNvPicPr>
                       <a:picLocks noChangeArrowheads="1" noChangeAspect="1"/>
                     </pic:cNvPicPr>
                   </pic:nvPicPr>
                   <pic:blipFill>
-                    <a:blip r:embed="rId35"/>
+                    <a:blip r:embed="rId41"/>
                     <a:stretch>
                       <a:fillRect/>
                     </a:stretch>
@@ -1533,9 +1678,9 @@
         <w:t xml:space="preserve">Representative magnetic-field model output. Source: thesis figure A02.</w:t>
       </w:r>
     </w:p>
-    <w:bookmarkEnd w:id="38"/>
-    <w:bookmarkEnd w:id="39"/>
-    <w:bookmarkStart w:id="41" w:name="timeline"/>
+    <w:bookmarkEnd w:id="44"/>
+    <w:bookmarkEnd w:id="45"/>
+    <w:bookmarkStart w:id="47" w:name="timeline"/>
     <w:p>
       <w:pPr>
         <w:pStyle w:val="Heading1"/>
@@ -1544,7 +1689,7 @@
         <w:t xml:space="preserve">6. Timeline</w:t>
       </w:r>
     </w:p>
-    <w:bookmarkStart w:id="40" w:name="documented-evolution"/>
+    <w:bookmarkStart w:id="46" w:name="documented-evolution"/>
     <w:p>
       <w:pPr>
         <w:pStyle w:val="Heading2"/>
@@ -1806,9 +1951,9 @@
         <w:t xml:space="preserve">The thesis repository’s reconstructed history expressly marks several early milestone dates as approximate. The analytical baseline was revised as evidence improved: a CAD-derived sled mass displaced a lighter parametric estimate; a depth-resolved thrust calculation lowered the rated speed; an enclosure buildup exposed the 3U mass penalty; and an independent orbit check rejected an overbroad solar-invariance claim. These revisions are part of the completed study, not signs that the final numbers are placeholders. Gen6 research gates are described only in §10, Future work.</w:t>
       </w:r>
     </w:p>
-    <w:bookmarkEnd w:id="40"/>
-    <w:bookmarkEnd w:id="41"/>
-    <w:bookmarkStart w:id="42" w:name="work-progress"/>
+    <w:bookmarkEnd w:id="46"/>
+    <w:bookmarkEnd w:id="47"/>
+    <w:bookmarkStart w:id="48" w:name="work-progress"/>
     <w:p>
       <w:pPr>
         <w:pStyle w:val="Heading1"/>
@@ -1833,8 +1978,8 @@
         <w:t xml:space="preserve">The deliverable here is a completed computational thesis, not a flight article. The later long gas-guide and independent spring-cell studies are historical comparators. Gen6 has a mission direction and investigation envelope but is not a result of the Gen5 thesis. Its mechanism and exact payload/provider cases remain future choices.</w:t>
       </w:r>
     </w:p>
-    <w:bookmarkEnd w:id="42"/>
-    <w:bookmarkStart w:id="58" w:name="results"/>
+    <w:bookmarkEnd w:id="48"/>
+    <w:bookmarkStart w:id="64" w:name="results"/>
     <w:p>
       <w:pPr>
         <w:pStyle w:val="Heading1"/>
@@ -1843,7 +1988,7 @@
         <w:t xml:space="preserve">8. Results</w:t>
       </w:r>
     </w:p>
-    <w:bookmarkStart w:id="43" w:name="gen5-configuration"/>
+    <w:bookmarkStart w:id="49" w:name="gen5-configuration"/>
     <w:p>
       <w:pPr>
         <w:pStyle w:val="Heading2"/>
@@ -1873,8 +2018,8 @@
         <w:t xml:space="preserve">; this value reduced the exit speed relative to an earlier optimistic parametric estimate. The CAD render conveys the arrangement; it is not evidence that parts have been manufactured or assembled.</w:t>
       </w:r>
     </w:p>
-    <w:bookmarkEnd w:id="43"/>
-    <w:bookmarkStart w:id="44" w:name="rated-3u-shot"/>
+    <w:bookmarkEnd w:id="49"/>
+    <w:bookmarkStart w:id="50" w:name="rated-3u-shot"/>
     <w:p>
       <w:pPr>
         <w:pStyle w:val="Heading2"/>
@@ -2250,8 +2395,8 @@
         <w:t xml:space="preserve">The energy flow matters more than the velocity headline. The sled and its arrest hardware are the price of keeping the customer satellite unmodified. Regeneration returns only a small fraction of sled energy within the available length, so the contactless brake remains necessary. A design comparison that credits full sled recovery would misstate the system efficiency and installed burden.</w:t>
       </w:r>
     </w:p>
-    <w:bookmarkEnd w:id="44"/>
-    <w:bookmarkStart w:id="48" w:name="command-precision"/>
+    <w:bookmarkEnd w:id="50"/>
+    <w:bookmarkStart w:id="54" w:name="command-precision"/>
     <w:p>
       <w:pPr>
         <w:pStyle w:val="Heading2"/>
@@ -2324,18 +2469,18 @@
           <wp:inline>
             <wp:extent cx="3886964" cy="2792131"/>
             <wp:effectExtent b="0" l="0" r="0" t="0"/>
-            <wp:docPr descr="Closed-loop simulation distribution at the fleet setpoint." title="" id="46" name="Picture"/>
+            <wp:docPr descr="Closed-loop simulation distribution at the fleet setpoint." title="" id="52" name="Picture"/>
             <a:graphic>
               <a:graphicData uri="http://schemas.openxmlformats.org/drawingml/2006/picture">
                 <pic:pic>
                   <pic:nvPicPr>
-                    <pic:cNvPr descr="../../source/figures/F03_mc.png" id="47" name="Picture"/>
+                    <pic:cNvPr descr="../../source/figures/F03_mc.png" id="53" name="Picture"/>
                     <pic:cNvPicPr>
                       <a:picLocks noChangeArrowheads="1" noChangeAspect="1"/>
                     </pic:cNvPicPr>
                   </pic:nvPicPr>
                   <pic:blipFill>
-                    <a:blip r:embed="rId45"/>
+                    <a:blip r:embed="rId51"/>
                     <a:stretch>
                       <a:fillRect/>
                     </a:stretch>
@@ -2370,8 +2515,8 @@
         <w:t xml:space="preserve">Closed-loop simulation distribution at the fleet setpoint.</w:t>
       </w:r>
     </w:p>
-    <w:bookmarkEnd w:id="48"/>
-    <w:bookmarkStart w:id="52" w:name="orbital-utility"/>
+    <w:bookmarkEnd w:id="54"/>
+    <w:bookmarkStart w:id="58" w:name="orbital-utility"/>
     <w:p>
       <w:pPr>
         <w:pStyle w:val="Heading2"/>
@@ -2429,18 +2574,18 @@
           <wp:inline>
             <wp:extent cx="4382391" cy="2697327"/>
             <wp:effectExtent b="0" l="0" r="0" t="0"/>
-            <wp:docPr descr="Modelled orbital-lifetime response. Absolute values depend on atmosphere." title="" id="50" name="Picture"/>
+            <wp:docPr descr="Modelled orbital-lifetime response. Absolute values depend on atmosphere." title="" id="56" name="Picture"/>
             <a:graphic>
               <a:graphicData uri="http://schemas.openxmlformats.org/drawingml/2006/picture">
                 <pic:pic>
                   <pic:nvPicPr>
-                    <pic:cNvPr descr="../../source/figures/F04_life.png" id="51" name="Picture"/>
+                    <pic:cNvPr descr="../../source/figures/F04_life.png" id="57" name="Picture"/>
                     <pic:cNvPicPr>
                       <a:picLocks noChangeArrowheads="1" noChangeAspect="1"/>
                     </pic:cNvPicPr>
                   </pic:nvPicPr>
                   <pic:blipFill>
-                    <a:blip r:embed="rId49"/>
+                    <a:blip r:embed="rId55"/>
                     <a:stretch>
                       <a:fillRect/>
                     </a:stretch>
@@ -2475,8 +2620,8 @@
         <w:t xml:space="preserve">Modelled orbital-lifetime response. Absolute values depend on atmosphere.</w:t>
       </w:r>
     </w:p>
-    <w:bookmarkEnd w:id="52"/>
-    <w:bookmarkStart w:id="56" w:name="installed-mass-changes-the-decision"/>
+    <w:bookmarkEnd w:id="58"/>
+    <w:bookmarkStart w:id="62" w:name="installed-mass-changes-the-decision"/>
     <w:p>
       <w:pPr>
         <w:pStyle w:val="Heading2"/>
@@ -2605,18 +2750,18 @@
           <wp:inline>
             <wp:extent cx="5334000" cy="1915167"/>
             <wp:effectExtent b="0" l="0" r="0" t="0"/>
-            <wp:docPr descr="Constraint and mass-attribution analysis; mass is a model rollup." title="" id="54" name="Picture"/>
+            <wp:docPr descr="Constraint and mass-attribution analysis; mass is a model rollup." title="" id="60" name="Picture"/>
             <a:graphic>
               <a:graphicData uri="http://schemas.openxmlformats.org/drawingml/2006/picture">
                 <pic:pic>
                   <pic:nvPicPr>
-                    <pic:cNvPr descr="../../source/figures/A35_ledger.png" id="55" name="Picture"/>
+                    <pic:cNvPr descr="../../source/figures/A35_ledger.png" id="61" name="Picture"/>
                     <pic:cNvPicPr>
                       <a:picLocks noChangeArrowheads="1" noChangeAspect="1"/>
                     </pic:cNvPicPr>
                   </pic:nvPicPr>
                   <pic:blipFill>
-                    <a:blip r:embed="rId53"/>
+                    <a:blip r:embed="rId59"/>
                     <a:stretch>
                       <a:fillRect/>
                     </a:stretch>
@@ -2651,8 +2796,8 @@
         <w:t xml:space="preserve">Constraint and mass-attribution analysis; mass is a model rollup.</w:t>
       </w:r>
     </w:p>
-    <w:bookmarkEnd w:id="56"/>
-    <w:bookmarkStart w:id="57" w:name="decision-and-evidence-boundary"/>
+    <w:bookmarkEnd w:id="62"/>
+    <w:bookmarkStart w:id="63" w:name="decision-and-evidence-boundary"/>
     <w:p>
       <w:pPr>
         <w:pStyle w:val="Heading2"/>
@@ -2669,9 +2814,9 @@
         <w:t xml:space="preserve">The completed analytical result has three parts. The model supports a commandable release and conditional orbital-energy benefit; the full-system 3U mass criterion fails; and the physical behavior remains unverified. The last category includes release-cycle reliability, shock and arrest loads transmitted to stowed satellites, field exposure near a customer payload, host attitude/control authority and provider approval. The known-problems register ranks several as potentially design-fatal. Their existence limits product claims but does not undo the completed analytical finding.</w:t>
       </w:r>
     </w:p>
-    <w:bookmarkEnd w:id="57"/>
-    <w:bookmarkEnd w:id="58"/>
-    <w:bookmarkStart w:id="59" w:name="conclusion"/>
+    <w:bookmarkEnd w:id="63"/>
+    <w:bookmarkEnd w:id="64"/>
+    <w:bookmarkStart w:id="65" w:name="conclusion"/>
     <w:p>
       <w:pPr>
         <w:pStyle w:val="Heading1"/>
@@ -2696,8 +2841,8 @@
         <w:t xml:space="preserve">The thesis’s strongest engineering contribution is the transparent decision record: the full machine was modelled, independent numerical checks corrected several claims, and an unfavourable mass result was retained. That closes the Gen5 study and provides a defensible input to a separate future architecture trade.</w:t>
       </w:r>
     </w:p>
-    <w:bookmarkEnd w:id="59"/>
-    <w:bookmarkStart w:id="60" w:name="future-work"/>
+    <w:bookmarkEnd w:id="65"/>
+    <w:bookmarkStart w:id="66" w:name="future-work"/>
     <w:p>
       <w:pPr>
         <w:pStyle w:val="Heading1"/>
@@ -2722,8 +2867,8 @@
         <w:t xml:space="preserve">The near-term milestone is one named test-article configuration that can be independently reviewed. Its package needs controlled geometry and drawings, a bill of materials, host and payload interfaces, full installed mass/energy/thermal accounting, assembly and inspection instructions, instrumented procedures, predetermined pass/fail and stop criteria, uncertainty and model-credibility evidence, retained failures, and an explicit build/test release decision. A rejected candidate is a valid research outcome; it must not be presented as a build-ready survivor.</w:t>
       </w:r>
     </w:p>
-    <w:bookmarkEnd w:id="60"/>
-    <w:bookmarkStart w:id="61" w:name="references-and-project-records"/>
+    <w:bookmarkEnd w:id="66"/>
+    <w:bookmarkStart w:id="67" w:name="references-and-project-records"/>
     <w:p>
       <w:pPr>
         <w:pStyle w:val="Heading1"/>
@@ -3118,7 +3263,7 @@
         <w:t xml:space="preserve">, controlled working baseline, 29 September 2026. Project plan, not achieved performance.</w:t>
       </w:r>
     </w:p>
-    <w:bookmarkEnd w:id="61"/>
+    <w:bookmarkEnd w:id="67"/>
     <w:sectPr/>
   </w:body>
 </w:document>

</xml_diff>

<commit_message>
Publish Gen5 final-year report, review presentation, and native CAD evidence
</commit_message>
<xml_diff>
--- a/university/final_review_2026_10_10/PANEL_HANDBOOK.docx
+++ b/university/final_review_2026_10_10/PANEL_HANDBOOK.docx
@@ -1979,7 +1979,7 @@
       </w:r>
     </w:p>
     <w:bookmarkEnd w:id="48"/>
-    <w:bookmarkStart w:id="64" w:name="results"/>
+    <w:bookmarkStart w:id="73" w:name="results"/>
     <w:p>
       <w:pPr>
         <w:pStyle w:val="Heading1"/>
@@ -2516,7 +2516,7 @@
       </w:r>
     </w:p>
     <w:bookmarkEnd w:id="54"/>
-    <w:bookmarkStart w:id="58" w:name="orbital-utility"/>
+    <w:bookmarkStart w:id="61" w:name="orbital-utility"/>
     <w:p>
       <w:pPr>
         <w:pStyle w:val="Heading2"/>
@@ -2562,7 +2562,20 @@
         <w:t xml:space="preserve"> </w:t>
       </w:r>
       <w:r>
-        <w:t xml:space="preserve">lifetime multiplier for a propulsionless satellite. The more defensible message is conditional: a release impulse can change orbital energy, while absolute lifetime and lifetime gain depend on atmospheric density and the orbit model. A fresh independent run of the exact current 1.60 operating point remains outstanding. Timing alone, with zero relative impulse and no host or drag difference, produces neither persistent phasing nor this semi-major-axis change.</w:t>
+        <w:t xml:space="preserve">lifetime multiplier for a propulsionless satellite. A separate Cartesian two-body integration of the current rated state returns</w:t>
+      </w:r>
+      <w:r>
+        <w:t xml:space="preserve"> </w:t>
+      </w:r>
+      <w:r>
+        <w:rPr>
+          <w:b/>
+          <w:bCs/>
+        </w:rPr>
+        <w:t xml:space="preserve">28.800775 km</w:t>
+      </w:r>
+      <w:r>
+        <w:t xml:space="preserve">, agreeing within the declared numerical band. This checks only the immediate orbital-energy result. The atmospheric lifetime multiplier has not been independently reproduced at the exact current point. Timing alone, with zero relative impulse and no host or drag difference, produces neither persistent phasing nor this semi-major-axis change.</w:t>
       </w:r>
     </w:p>
     <w:p>
@@ -2572,20 +2585,75 @@
       <w:r>
         <w:drawing>
           <wp:inline>
-            <wp:extent cx="4382391" cy="2697327"/>
+            <wp:extent cx="4907280" cy="2473613"/>
             <wp:effectExtent b="0" l="0" r="0" t="0"/>
-            <wp:docPr descr="Modelled orbital-lifetime response. Absolute values depend on atmosphere." title="" id="56" name="Picture"/>
+            <wp:docPr descr="Independent rated-state two-body orbit check. The lifetime claim is outside its scope." title="" id="56" name="Picture"/>
             <a:graphic>
               <a:graphicData uri="http://schemas.openxmlformats.org/drawingml/2006/picture">
                 <pic:pic>
                   <pic:nvPicPr>
-                    <pic:cNvPr descr="../../source/figures/F04_life.png" id="57" name="Picture"/>
+                    <pic:cNvPr descr="../../figures/rated_orbit_crosscheck.png" id="57" name="Picture"/>
                     <pic:cNvPicPr>
                       <a:picLocks noChangeArrowheads="1" noChangeAspect="1"/>
                     </pic:cNvPicPr>
                   </pic:nvPicPr>
                   <pic:blipFill>
                     <a:blip r:embed="rId55"/>
+                    <a:stretch>
+                      <a:fillRect/>
+                    </a:stretch>
+                  </pic:blipFill>
+                  <pic:spPr bwMode="auto">
+                    <a:xfrm>
+                      <a:off x="0" y="0"/>
+                      <a:ext cx="4907280" cy="2473613"/>
+                    </a:xfrm>
+                    <a:prstGeom prst="rect">
+                      <a:avLst/>
+                    </a:prstGeom>
+                    <a:noFill/>
+                    <a:ln w="9525">
+                      <a:noFill/>
+                      <a:headEnd/>
+                      <a:tailEnd/>
+                    </a:ln>
+                  </pic:spPr>
+                </pic:pic>
+              </a:graphicData>
+            </a:graphic>
+          </wp:inline>
+        </w:drawing>
+      </w:r>
+    </w:p>
+    <w:p>
+      <w:pPr>
+        <w:pStyle w:val="ImageCaption"/>
+      </w:pPr>
+      <w:r>
+        <w:t xml:space="preserve">Independent rated-state two-body orbit check. The lifetime claim is outside its scope.</w:t>
+      </w:r>
+    </w:p>
+    <w:p>
+      <w:pPr>
+        <w:pStyle w:val="CaptionedFigure"/>
+      </w:pPr>
+      <w:r>
+        <w:drawing>
+          <wp:inline>
+            <wp:extent cx="4382391" cy="2697327"/>
+            <wp:effectExtent b="0" l="0" r="0" t="0"/>
+            <wp:docPr descr="Modelled orbital-lifetime response. Absolute values depend on atmosphere." title="" id="59" name="Picture"/>
+            <a:graphic>
+              <a:graphicData uri="http://schemas.openxmlformats.org/drawingml/2006/picture">
+                <pic:pic>
+                  <pic:nvPicPr>
+                    <pic:cNvPr descr="../../source/figures/F04_life.png" id="60" name="Picture"/>
+                    <pic:cNvPicPr>
+                      <a:picLocks noChangeArrowheads="1" noChangeAspect="1"/>
+                    </pic:cNvPicPr>
+                  </pic:nvPicPr>
+                  <pic:blipFill>
+                    <a:blip r:embed="rId58"/>
                     <a:stretch>
                       <a:fillRect/>
                     </a:stretch>
@@ -2620,8 +2688,8 @@
         <w:t xml:space="preserve">Modelled orbital-lifetime response. Absolute values depend on atmosphere.</w:t>
       </w:r>
     </w:p>
-    <w:bookmarkEnd w:id="58"/>
-    <w:bookmarkStart w:id="62" w:name="installed-mass-changes-the-decision"/>
+    <w:bookmarkEnd w:id="61"/>
+    <w:bookmarkStart w:id="65" w:name="installed-mass-changes-the-decision"/>
     <w:p>
       <w:pPr>
         <w:pStyle w:val="Heading2"/>
@@ -2750,18 +2818,18 @@
           <wp:inline>
             <wp:extent cx="5334000" cy="1915167"/>
             <wp:effectExtent b="0" l="0" r="0" t="0"/>
-            <wp:docPr descr="Constraint and mass-attribution analysis; mass is a model rollup." title="" id="60" name="Picture"/>
+            <wp:docPr descr="Constraint and mass-attribution analysis; mass is a model rollup." title="" id="63" name="Picture"/>
             <a:graphic>
               <a:graphicData uri="http://schemas.openxmlformats.org/drawingml/2006/picture">
                 <pic:pic>
                   <pic:nvPicPr>
-                    <pic:cNvPr descr="../../source/figures/A35_ledger.png" id="61" name="Picture"/>
+                    <pic:cNvPr descr="../../source/figures/A35_ledger.png" id="64" name="Picture"/>
                     <pic:cNvPicPr>
                       <a:picLocks noChangeArrowheads="1" noChangeAspect="1"/>
                     </pic:cNvPicPr>
                   </pic:nvPicPr>
                   <pic:blipFill>
-                    <a:blip r:embed="rId59"/>
+                    <a:blip r:embed="rId62"/>
                     <a:stretch>
                       <a:fillRect/>
                     </a:stretch>
@@ -2796,13 +2864,221 @@
         <w:t xml:space="preserve">Constraint and mass-attribution analysis; mass is a model rollup.</w:t>
       </w:r>
     </w:p>
-    <w:bookmarkEnd w:id="62"/>
-    <w:bookmarkStart w:id="63" w:name="decision-and-evidence-boundary"/>
+    <w:bookmarkEnd w:id="65"/>
+    <w:bookmarkStart w:id="71" w:name="native-cad-and-packaging-review"/>
     <w:p>
       <w:pPr>
         <w:pStyle w:val="Heading2"/>
       </w:pPr>
       <w:r>
+        <w:t xml:space="preserve">Native CAD and packaging review</w:t>
+      </w:r>
+    </w:p>
+    <w:p>
+      <w:pPr>
+        <w:pStyle w:val="FirstParagraph"/>
+      </w:pPr>
+      <w:r>
+        <w:t xml:space="preserve">The geometry package now includes a FreeCAD 1.0 native document, eight re-exported STEP parts, and a 20-instance STEP assembly. Each imported solid passed FreeCAD validity and nonzero-volume checks. The source solids were produced in CadQuery; importing them into FreeCAD does not create parametric feature history or prove that the assembly can be manufactured. The</w:t>
+      </w:r>
+      <w:r>
+        <w:t xml:space="preserve"> </w:t>
+      </w:r>
+      <w:hyperlink r:id="rId66">
+        <w:r>
+          <w:rPr>
+            <w:rStyle w:val="Hyperlink"/>
+          </w:rPr>
+          <w:t xml:space="preserve">CAD review report</w:t>
+        </w:r>
+      </w:hyperlink>
+      <w:r>
+        <w:t xml:space="preserve"> </w:t>
+      </w:r>
+      <w:r>
+        <w:t xml:space="preserve">identifies source revisions and checks, while</w:t>
+      </w:r>
+      <w:r>
+        <w:t xml:space="preserve"> </w:t>
+      </w:r>
+      <w:hyperlink r:id="rId67">
+        <w:r>
+          <w:rPr>
+            <w:rStyle w:val="Hyperlink"/>
+          </w:rPr>
+          <w:t xml:space="preserve">P116</w:t>
+        </w:r>
+      </w:hyperlink>
+      <w:r>
+        <w:t xml:space="preserve"> </w:t>
+      </w:r>
+      <w:r>
+        <w:t xml:space="preserve">records the numerical intersection result.</w:t>
+      </w:r>
+    </w:p>
+    <w:p>
+      <w:pPr>
+        <w:pStyle w:val="BodyText"/>
+      </w:pPr>
+      <w:r>
+        <w:t xml:space="preserve">The side-fed reference assembly has</w:t>
+      </w:r>
+      <w:r>
+        <w:t xml:space="preserve"> </w:t>
+      </w:r>
+      <w:r>
+        <w:rPr>
+          <w:b/>
+          <w:bCs/>
+        </w:rPr>
+        <w:t xml:space="preserve">526 mm</w:t>
+      </w:r>
+      <w:r>
+        <w:t xml:space="preserve"> </w:t>
+      </w:r>
+      <w:r>
+        <w:t xml:space="preserve">clear enclosure width. Its</w:t>
+      </w:r>
+      <w:r>
+        <w:t xml:space="preserve"> </w:t>
+      </w:r>
+      <w:r>
+        <w:rPr>
+          <w:b/>
+          <w:bCs/>
+        </w:rPr>
+        <w:t xml:space="preserve">205 mm</w:t>
+      </w:r>
+      <w:r>
+        <w:t xml:space="preserve"> </w:t>
+      </w:r>
+      <w:r>
+        <w:t xml:space="preserve">track plus two</w:t>
+      </w:r>
+      <w:r>
+        <w:t xml:space="preserve"> </w:t>
+      </w:r>
+      <w:r>
+        <w:rPr>
+          <w:b/>
+          <w:bCs/>
+        </w:rPr>
+        <w:t xml:space="preserve">166 mm</w:t>
+      </w:r>
+      <w:r>
+        <w:t xml:space="preserve"> </w:t>
+      </w:r>
+      <w:r>
+        <w:t xml:space="preserve">cassettes require</w:t>
+      </w:r>
+      <w:r>
+        <w:t xml:space="preserve"> </w:t>
+      </w:r>
+      <w:r>
+        <w:rPr>
+          <w:b/>
+          <w:bCs/>
+        </w:rPr>
+        <w:t xml:space="preserve">537 mm</w:t>
+      </w:r>
+      <w:r>
+        <w:t xml:space="preserve">, an</w:t>
+      </w:r>
+      <w:r>
+        <w:t xml:space="preserve"> </w:t>
+      </w:r>
+      <w:r>
+        <w:rPr>
+          <w:b/>
+          <w:bCs/>
+        </w:rPr>
+        <w:t xml:space="preserve">11 mm</w:t>
+      </w:r>
+      <w:r>
+        <w:t xml:space="preserve"> </w:t>
+      </w:r>
+      <w:r>
+        <w:t xml:space="preserve">shortfall even before running clearance. The exact solids overlap by</w:t>
+      </w:r>
+      <w:r>
+        <w:t xml:space="preserve"> </w:t>
+      </w:r>
+      <w:r>
+        <w:rPr>
+          <w:b/>
+          <w:bCs/>
+        </w:rPr>
+        <w:t xml:space="preserve">32,915 mm³ per side</w:t>
+      </w:r>
+      <w:r>
+        <w:t xml:space="preserve"> </w:t>
+      </w:r>
+      <w:r>
+        <w:t xml:space="preserve">in this placement. This fails that packaging arrangement. A different feed architecture, enclosure or dimension set requires a new configuration and reassessment; the current render must not be presented as an assembled flight article.</w:t>
+      </w:r>
+    </w:p>
+    <w:p>
+      <w:pPr>
+        <w:pStyle w:val="CaptionedFigure"/>
+      </w:pPr>
+      <w:r>
+        <w:drawing>
+          <wp:inline>
+            <wp:extent cx="4907280" cy="6642781"/>
+            <wp:effectExtent b="0" l="0" r="0" t="0"/>
+            <wp:docPr descr="Dimensioned side-fed reference cross-section; this configuration fails the width check." title="" id="69" name="Picture"/>
+            <a:graphic>
+              <a:graphicData uri="http://schemas.openxmlformats.org/drawingml/2006/picture">
+                <pic:pic>
+                  <pic:nvPicPr>
+                    <pic:cNvPr descr="../../figures/gen5_packaging_section.png" id="70" name="Picture"/>
+                    <pic:cNvPicPr>
+                      <a:picLocks noChangeArrowheads="1" noChangeAspect="1"/>
+                    </pic:cNvPicPr>
+                  </pic:nvPicPr>
+                  <pic:blipFill>
+                    <a:blip r:embed="rId68"/>
+                    <a:stretch>
+                      <a:fillRect/>
+                    </a:stretch>
+                  </pic:blipFill>
+                  <pic:spPr bwMode="auto">
+                    <a:xfrm>
+                      <a:off x="0" y="0"/>
+                      <a:ext cx="4907280" cy="6642781"/>
+                    </a:xfrm>
+                    <a:prstGeom prst="rect">
+                      <a:avLst/>
+                    </a:prstGeom>
+                    <a:noFill/>
+                    <a:ln w="9525">
+                      <a:noFill/>
+                      <a:headEnd/>
+                      <a:tailEnd/>
+                    </a:ln>
+                  </pic:spPr>
+                </pic:pic>
+              </a:graphicData>
+            </a:graphic>
+          </wp:inline>
+        </w:drawing>
+      </w:r>
+    </w:p>
+    <w:p>
+      <w:pPr>
+        <w:pStyle w:val="ImageCaption"/>
+      </w:pPr>
+      <w:r>
+        <w:t xml:space="preserve">Dimensioned side-fed reference cross-section; this configuration fails the width check.</w:t>
+      </w:r>
+    </w:p>
+    <w:bookmarkEnd w:id="71"/>
+    <w:bookmarkStart w:id="72" w:name="decision-and-evidence-boundary"/>
+    <w:p>
+      <w:pPr>
+        <w:pStyle w:val="Heading2"/>
+      </w:pPr>
+      <w:r>
         <w:t xml:space="preserve">Decision and evidence boundary</w:t>
       </w:r>
     </w:p>
@@ -2811,12 +3087,12 @@
         <w:pStyle w:val="FirstParagraph"/>
       </w:pPr>
       <w:r>
-        <w:t xml:space="preserve">The completed analytical result has three parts. The model supports a commandable release and conditional orbital-energy benefit; the full-system 3U mass criterion fails; and the physical behavior remains unverified. The last category includes release-cycle reliability, shock and arrest loads transmitted to stowed satellites, field exposure near a customer payload, host attitude/control authority and provider approval. The known-problems register ranks several as potentially design-fatal. Their existence limits product claims but does not undo the completed analytical finding.</w:t>
-      </w:r>
-    </w:p>
-    <w:bookmarkEnd w:id="63"/>
-    <w:bookmarkEnd w:id="64"/>
-    <w:bookmarkStart w:id="65" w:name="conclusion"/>
+        <w:t xml:space="preserve">The analytical result has four parts. The model supports a commandable release and conditional orbital-energy benefit; the full-system 3U mass criterion fails; the stated side-fed layout fails its CAD width check; and physical behavior remains unverified. The latter includes release-cycle reliability, shock and arrest loads transmitted to stowed satellites, field exposure near a customer payload, host attitude/control authority and provider approval. The known-problems register ranks several as potentially design-fatal. These findings limit product claims and define the research conclusion.</w:t>
+      </w:r>
+    </w:p>
+    <w:bookmarkEnd w:id="72"/>
+    <w:bookmarkEnd w:id="73"/>
+    <w:bookmarkStart w:id="74" w:name="conclusion"/>
     <w:p>
       <w:pPr>
         <w:pStyle w:val="Heading1"/>
@@ -2830,7 +3106,7 @@
         <w:pStyle w:val="FirstParagraph"/>
       </w:pPr>
       <w:r>
-        <w:t xml:space="preserve">The Gen5 computational thesis reaches a complete engineering conclusion within its stated scope. Its system-level model predicts a commandable moderate-acceleration release and a conditional orbital-energy benefit. Complete installed-mass accounting then shows the configuration misses its preset 3U benchmark. The answer to the thesis trade question is therefore conditional benefit with an unfavourable 3U system cost. Hardware behavior and interfaces remain outside the tested evidence, so the result is a research conclusion rather than a flight-readiness claim.</w:t>
+        <w:t xml:space="preserve">The Gen5 computational thesis reaches a research conclusion within its stated scope. Its model predicts a commandable moderate-acceleration release and a conditional orbital-energy benefit, with a separate check of the immediate two-body orbital change. Installed-mass accounting misses its preset 3U benchmark, and the side-fed reference CAD assembly fails its width check. The current configuration is therefore not a selected flight baseline. Hardware behavior and interfaces remain outside the tested evidence.</w:t>
       </w:r>
     </w:p>
     <w:p>
@@ -2841,8 +3117,8 @@
         <w:t xml:space="preserve">The thesis’s strongest engineering contribution is the transparent decision record: the full machine was modelled, independent numerical checks corrected several claims, and an unfavourable mass result was retained. That closes the Gen5 study and provides a defensible input to a separate future architecture trade.</w:t>
       </w:r>
     </w:p>
-    <w:bookmarkEnd w:id="65"/>
-    <w:bookmarkStart w:id="66" w:name="future-work"/>
+    <w:bookmarkEnd w:id="74"/>
+    <w:bookmarkStart w:id="75" w:name="future-work"/>
     <w:p>
       <w:pPr>
         <w:pStyle w:val="Heading1"/>
@@ -2867,8 +3143,8 @@
         <w:t xml:space="preserve">The near-term milestone is one named test-article configuration that can be independently reviewed. Its package needs controlled geometry and drawings, a bill of materials, host and payload interfaces, full installed mass/energy/thermal accounting, assembly and inspection instructions, instrumented procedures, predetermined pass/fail and stop criteria, uncertainty and model-credibility evidence, retained failures, and an explicit build/test release decision. A rejected candidate is a valid research outcome; it must not be presented as a build-ready survivor.</w:t>
       </w:r>
     </w:p>
-    <w:bookmarkEnd w:id="66"/>
-    <w:bookmarkStart w:id="67" w:name="references-and-project-records"/>
+    <w:bookmarkEnd w:id="75"/>
+    <w:bookmarkStart w:id="76" w:name="references-and-project-records"/>
     <w:p>
       <w:pPr>
         <w:pStyle w:val="Heading1"/>
@@ -3263,7 +3539,7 @@
         <w:t xml:space="preserve">, controlled working baseline, 29 September 2026. Project plan, not achieved performance.</w:t>
       </w:r>
     </w:p>
-    <w:bookmarkEnd w:id="67"/>
+    <w:bookmarkEnd w:id="76"/>
     <w:sectPr/>
   </w:body>
 </w:document>

</xml_diff>

<commit_message>
Publish audited Gen5 thesis review pack and computational evidence
</commit_message>
<xml_diff>
--- a/university/final_review_2026_10_10/PANEL_HANDBOOK.docx
+++ b/university/final_review_2026_10_10/PANEL_HANDBOOK.docx
@@ -1979,7 +1979,7 @@
       </w:r>
     </w:p>
     <w:bookmarkEnd w:id="48"/>
-    <w:bookmarkStart w:id="73" w:name="results"/>
+    <w:bookmarkStart w:id="74" w:name="results"/>
     <w:p>
       <w:pPr>
         <w:pStyle w:val="Heading1"/>
@@ -2002,7 +2002,7 @@
         <w:pStyle w:val="FirstParagraph"/>
       </w:pPr>
       <w:r>
-        <w:t xml:space="preserve">The analysed system uses a double-sided Halbach-array linear synchronous motor to propel a reusable permanent-magnet sled along a 1.5 m track. Two transverse cassettes feed twelve 3U satellites. A capacitor-based bank supplies the pulse, and a brake arrests the sled after payload release. The sled mass, computed from detailed CAD solid volumes, is</w:t>
+        <w:t xml:space="preserve">The analysed system uses a double-sided Halbach-array linear synchronous motor to propel a reusable permanent-magnet sled to a release station 1.5 m from the breech on 1.8 m structural longerons. Two transverse cassettes are intended to feed twelve 3U satellites, but the present side-fed placement fails the fit check. A capacitor-based bank supplies the modeled pulse, and a brake is intended to arrest the sled after payload release. The</w:t>
       </w:r>
       <w:r>
         <w:t xml:space="preserve"> </w:t>
@@ -2015,11 +2015,14 @@
         <w:t xml:space="preserve">9.45 kg</w:t>
       </w:r>
       <w:r>
-        <w:t xml:space="preserve">; this value reduced the exit speed relative to an earlier optimistic parametric estimate. The CAD render conveys the arrangement; it is not evidence that parts have been manufactured or assembled.</w:t>
+        <w:t xml:space="preserve"> </w:t>
+      </w:r>
+      <w:r>
+        <w:t xml:space="preserve">sled input comes from historical Gen3 CAD solid volumes; this value reduced the exit speed relative to an earlier optimistic parametric estimate. The CAD render conveys a concept, not manufactured or assembled hardware.</w:t>
       </w:r>
     </w:p>
     <w:bookmarkEnd w:id="49"/>
-    <w:bookmarkStart w:id="50" w:name="rated-3u-shot"/>
+    <w:bookmarkStart w:id="51" w:name="rated-3u-shot"/>
     <w:p>
       <w:pPr>
         <w:pStyle w:val="Heading2"/>
@@ -2392,11 +2395,44 @@
         <w:pStyle w:val="BodyText"/>
       </w:pPr>
       <w:r>
-        <w:t xml:space="preserve">The energy flow matters more than the velocity headline. The sled and its arrest hardware are the price of keeping the customer satellite unmodified. Regeneration returns only a small fraction of sled energy within the available length, so the contactless brake remains necessary. A design comparison that credits full sled recovery would misstate the system efficiency and installed burden.</w:t>
-      </w:r>
-    </w:p>
-    <w:bookmarkEnd w:id="50"/>
-    <w:bookmarkStart w:id="54" w:name="command-precision"/>
+        <w:t xml:space="preserve">The energy flow matters more than the velocity headline. The sled and its arrest hardware are part of the modeled price of avoiding a payload-side drive armature. Regeneration returns only a small fraction of sled energy within the available length.</w:t>
+      </w:r>
+      <w:r>
+        <w:t xml:space="preserve"> </w:t>
+      </w:r>
+      <w:hyperlink r:id="rId50">
+        <w:r>
+          <w:rPr>
+            <w:rStyle w:val="Hyperlink"/>
+          </w:rPr>
+          <w:t xml:space="preserve">P117</w:t>
+        </w:r>
+      </w:hyperlink>
+      <w:r>
+        <w:t xml:space="preserve"> </w:t>
+      </w:r>
+      <w:r>
+        <w:t xml:space="preserve">separately checks the reported mass and energy identities and finds</w:t>
+      </w:r>
+      <w:r>
+        <w:t xml:space="preserve"> </w:t>
+      </w:r>
+      <w:r>
+        <w:rPr>
+          <w:b/>
+          <w:bCs/>
+        </w:rPr>
+        <w:t xml:space="preserve">124.488 J (4.47%) of gross draw unitemized</w:t>
+      </w:r>
+      <w:r>
+        <w:t xml:space="preserve"> </w:t>
+      </w:r>
+      <w:r>
+        <w:t xml:space="preserve">after the reported kinetic, copper and bank-ESR terms. That is an accounting gap, not proof of a specific additional loss. Full electrical closure and an installed bank are still open.</w:t>
+      </w:r>
+    </w:p>
+    <w:bookmarkEnd w:id="51"/>
+    <w:bookmarkStart w:id="55" w:name="command-precision"/>
     <w:p>
       <w:pPr>
         <w:pStyle w:val="Heading2"/>
@@ -2469,18 +2505,18 @@
           <wp:inline>
             <wp:extent cx="3886964" cy="2792131"/>
             <wp:effectExtent b="0" l="0" r="0" t="0"/>
-            <wp:docPr descr="Closed-loop simulation distribution at the fleet setpoint." title="" id="52" name="Picture"/>
+            <wp:docPr descr="Closed-loop simulation distribution at the fleet setpoint." title="" id="53" name="Picture"/>
             <a:graphic>
               <a:graphicData uri="http://schemas.openxmlformats.org/drawingml/2006/picture">
                 <pic:pic>
                   <pic:nvPicPr>
-                    <pic:cNvPr descr="../../source/figures/F03_mc.png" id="53" name="Picture"/>
+                    <pic:cNvPr descr="../../source/figures/F03_mc.png" id="54" name="Picture"/>
                     <pic:cNvPicPr>
                       <a:picLocks noChangeArrowheads="1" noChangeAspect="1"/>
                     </pic:cNvPicPr>
                   </pic:nvPicPr>
                   <pic:blipFill>
-                    <a:blip r:embed="rId51"/>
+                    <a:blip r:embed="rId52"/>
                     <a:stretch>
                       <a:fillRect/>
                     </a:stretch>
@@ -2515,8 +2551,8 @@
         <w:t xml:space="preserve">Closed-loop simulation distribution at the fleet setpoint.</w:t>
       </w:r>
     </w:p>
-    <w:bookmarkEnd w:id="54"/>
-    <w:bookmarkStart w:id="61" w:name="orbital-utility"/>
+    <w:bookmarkEnd w:id="55"/>
+    <w:bookmarkStart w:id="62" w:name="orbital-utility"/>
     <w:p>
       <w:pPr>
         <w:pStyle w:val="Heading2"/>
@@ -2587,18 +2623,18 @@
           <wp:inline>
             <wp:extent cx="4907280" cy="2473613"/>
             <wp:effectExtent b="0" l="0" r="0" t="0"/>
-            <wp:docPr descr="Independent rated-state two-body orbit check. The lifetime claim is outside its scope." title="" id="56" name="Picture"/>
+            <wp:docPr descr="Independent rated-state two-body orbit check. The lifetime claim is outside its scope." title="" id="57" name="Picture"/>
             <a:graphic>
               <a:graphicData uri="http://schemas.openxmlformats.org/drawingml/2006/picture">
                 <pic:pic>
                   <pic:nvPicPr>
-                    <pic:cNvPr descr="../../figures/rated_orbit_crosscheck.png" id="57" name="Picture"/>
+                    <pic:cNvPr descr="../../figures/rated_orbit_crosscheck.png" id="58" name="Picture"/>
                     <pic:cNvPicPr>
                       <a:picLocks noChangeArrowheads="1" noChangeAspect="1"/>
                     </pic:cNvPicPr>
                   </pic:nvPicPr>
                   <pic:blipFill>
-                    <a:blip r:embed="rId55"/>
+                    <a:blip r:embed="rId56"/>
                     <a:stretch>
                       <a:fillRect/>
                     </a:stretch>
@@ -2642,18 +2678,18 @@
           <wp:inline>
             <wp:extent cx="4382391" cy="2697327"/>
             <wp:effectExtent b="0" l="0" r="0" t="0"/>
-            <wp:docPr descr="Modelled orbital-lifetime response. Absolute values depend on atmosphere." title="" id="59" name="Picture"/>
+            <wp:docPr descr="Modelled orbital-lifetime response. Absolute values depend on atmosphere." title="" id="60" name="Picture"/>
             <a:graphic>
               <a:graphicData uri="http://schemas.openxmlformats.org/drawingml/2006/picture">
                 <pic:pic>
                   <pic:nvPicPr>
-                    <pic:cNvPr descr="../../source/figures/F04_life.png" id="60" name="Picture"/>
+                    <pic:cNvPr descr="../../source/figures/F04_life.png" id="61" name="Picture"/>
                     <pic:cNvPicPr>
                       <a:picLocks noChangeArrowheads="1" noChangeAspect="1"/>
                     </pic:cNvPicPr>
                   </pic:nvPicPr>
                   <pic:blipFill>
-                    <a:blip r:embed="rId58"/>
+                    <a:blip r:embed="rId59"/>
                     <a:stretch>
                       <a:fillRect/>
                     </a:stretch>
@@ -2688,8 +2724,8 @@
         <w:t xml:space="preserve">Modelled orbital-lifetime response. Absolute values depend on atmosphere.</w:t>
       </w:r>
     </w:p>
-    <w:bookmarkEnd w:id="61"/>
-    <w:bookmarkStart w:id="65" w:name="installed-mass-changes-the-decision"/>
+    <w:bookmarkEnd w:id="62"/>
+    <w:bookmarkStart w:id="66" w:name="installed-mass-changes-the-decision"/>
     <w:p>
       <w:pPr>
         <w:pStyle w:val="Heading2"/>
@@ -2818,18 +2854,18 @@
           <wp:inline>
             <wp:extent cx="5334000" cy="1915167"/>
             <wp:effectExtent b="0" l="0" r="0" t="0"/>
-            <wp:docPr descr="Constraint and mass-attribution analysis; mass is a model rollup." title="" id="63" name="Picture"/>
+            <wp:docPr descr="Constraint and mass-attribution analysis; mass is a model rollup." title="" id="64" name="Picture"/>
             <a:graphic>
               <a:graphicData uri="http://schemas.openxmlformats.org/drawingml/2006/picture">
                 <pic:pic>
                   <pic:nvPicPr>
-                    <pic:cNvPr descr="../../source/figures/A35_ledger.png" id="64" name="Picture"/>
+                    <pic:cNvPr descr="../../source/figures/A35_ledger.png" id="65" name="Picture"/>
                     <pic:cNvPicPr>
                       <a:picLocks noChangeArrowheads="1" noChangeAspect="1"/>
                     </pic:cNvPicPr>
                   </pic:nvPicPr>
                   <pic:blipFill>
-                    <a:blip r:embed="rId62"/>
+                    <a:blip r:embed="rId63"/>
                     <a:stretch>
                       <a:fillRect/>
                     </a:stretch>
@@ -2864,8 +2900,8 @@
         <w:t xml:space="preserve">Constraint and mass-attribution analysis; mass is a model rollup.</w:t>
       </w:r>
     </w:p>
-    <w:bookmarkEnd w:id="65"/>
-    <w:bookmarkStart w:id="71" w:name="native-cad-and-packaging-review"/>
+    <w:bookmarkEnd w:id="66"/>
+    <w:bookmarkStart w:id="72" w:name="native-cad-and-packaging-review"/>
     <w:p>
       <w:pPr>
         <w:pStyle w:val="Heading2"/>
@@ -2884,7 +2920,7 @@
       <w:r>
         <w:t xml:space="preserve"> </w:t>
       </w:r>
-      <w:hyperlink r:id="rId66">
+      <w:hyperlink r:id="rId67">
         <w:r>
           <w:rPr>
             <w:rStyle w:val="Hyperlink"/>
@@ -2901,7 +2937,7 @@
       <w:r>
         <w:t xml:space="preserve"> </w:t>
       </w:r>
-      <w:hyperlink r:id="rId67">
+      <w:hyperlink r:id="rId68">
         <w:r>
           <w:rPr>
             <w:rStyle w:val="Hyperlink"/>
@@ -3026,18 +3062,18 @@
           <wp:inline>
             <wp:extent cx="4907280" cy="6642781"/>
             <wp:effectExtent b="0" l="0" r="0" t="0"/>
-            <wp:docPr descr="Dimensioned side-fed reference cross-section; this configuration fails the width check." title="" id="69" name="Picture"/>
+            <wp:docPr descr="Dimensioned side-fed reference cross-section; this configuration fails the width check." title="" id="70" name="Picture"/>
             <a:graphic>
               <a:graphicData uri="http://schemas.openxmlformats.org/drawingml/2006/picture">
                 <pic:pic>
                   <pic:nvPicPr>
-                    <pic:cNvPr descr="../../figures/gen5_packaging_section.png" id="70" name="Picture"/>
+                    <pic:cNvPr descr="../../figures/gen5_packaging_section.png" id="71" name="Picture"/>
                     <pic:cNvPicPr>
                       <a:picLocks noChangeArrowheads="1" noChangeAspect="1"/>
                     </pic:cNvPicPr>
                   </pic:nvPicPr>
                   <pic:blipFill>
-                    <a:blip r:embed="rId68"/>
+                    <a:blip r:embed="rId69"/>
                     <a:stretch>
                       <a:fillRect/>
                     </a:stretch>
@@ -3072,8 +3108,8 @@
         <w:t xml:space="preserve">Dimensioned side-fed reference cross-section; this configuration fails the width check.</w:t>
       </w:r>
     </w:p>
-    <w:bookmarkEnd w:id="71"/>
-    <w:bookmarkStart w:id="72" w:name="decision-and-evidence-boundary"/>
+    <w:bookmarkEnd w:id="72"/>
+    <w:bookmarkStart w:id="73" w:name="decision-and-evidence-boundary"/>
     <w:p>
       <w:pPr>
         <w:pStyle w:val="Heading2"/>
@@ -3090,9 +3126,9 @@
         <w:t xml:space="preserve">The analytical result has four parts. The model supports a commandable release and conditional orbital-energy benefit; the full-system 3U mass criterion fails; the stated side-fed layout fails its CAD width check; and physical behavior remains unverified. The latter includes release-cycle reliability, shock and arrest loads transmitted to stowed satellites, field exposure near a customer payload, host attitude/control authority and provider approval. The known-problems register ranks several as potentially design-fatal. These findings limit product claims and define the research conclusion.</w:t>
       </w:r>
     </w:p>
-    <w:bookmarkEnd w:id="72"/>
     <w:bookmarkEnd w:id="73"/>
-    <w:bookmarkStart w:id="74" w:name="conclusion"/>
+    <w:bookmarkEnd w:id="74"/>
+    <w:bookmarkStart w:id="75" w:name="conclusion"/>
     <w:p>
       <w:pPr>
         <w:pStyle w:val="Heading1"/>
@@ -3117,8 +3153,8 @@
         <w:t xml:space="preserve">The thesis’s strongest engineering contribution is the transparent decision record: the full machine was modelled, independent numerical checks corrected several claims, and an unfavourable mass result was retained. That closes the Gen5 study and provides a defensible input to a separate future architecture trade.</w:t>
       </w:r>
     </w:p>
-    <w:bookmarkEnd w:id="74"/>
-    <w:bookmarkStart w:id="75" w:name="future-work"/>
+    <w:bookmarkEnd w:id="75"/>
+    <w:bookmarkStart w:id="76" w:name="future-work"/>
     <w:p>
       <w:pPr>
         <w:pStyle w:val="Heading1"/>
@@ -3143,8 +3179,8 @@
         <w:t xml:space="preserve">The near-term milestone is one named test-article configuration that can be independently reviewed. Its package needs controlled geometry and drawings, a bill of materials, host and payload interfaces, full installed mass/energy/thermal accounting, assembly and inspection instructions, instrumented procedures, predetermined pass/fail and stop criteria, uncertainty and model-credibility evidence, retained failures, and an explicit build/test release decision. A rejected candidate is a valid research outcome; it must not be presented as a build-ready survivor.</w:t>
       </w:r>
     </w:p>
-    <w:bookmarkEnd w:id="75"/>
-    <w:bookmarkStart w:id="76" w:name="references-and-project-records"/>
+    <w:bookmarkEnd w:id="76"/>
+    <w:bookmarkStart w:id="77" w:name="references-and-project-records"/>
     <w:p>
       <w:pPr>
         <w:pStyle w:val="Heading1"/>
@@ -3539,7 +3575,7 @@
         <w:t xml:space="preserve">, controlled working baseline, 29 September 2026. Project plan, not achieved performance.</w:t>
       </w:r>
     </w:p>
-    <w:bookmarkEnd w:id="76"/>
+    <w:bookmarkEnd w:id="77"/>
     <w:sectPr/>
   </w:body>
 </w:document>

</xml_diff>

<commit_message>
Publish revised Gen5 thesis, 26-slide review and independent evidence pack
</commit_message>
<xml_diff>
--- a/university/final_review_2026_10_10/PANEL_HANDBOOK.docx
+++ b/university/final_review_2026_10_10/PANEL_HANDBOOK.docx
@@ -251,7 +251,7 @@
         <w:t xml:space="preserve"> </w:t>
       </w:r>
       <w:r>
-        <w:t xml:space="preserve">VOLLEY is a system-level engineering design and computational research project. The Gen5 analysis, comparisons and decision record are complete for the stated models. The results are predictions, with numerical cross-checks where identified. Physical prototype testing, CubeSat qualification and provider accommodation belong to a later development phase. Gen6 is presented separately as future work.</w:t>
+        <w:t xml:space="preserve">VOLLEY is a system-level engineering design and computational research project. The Gen5 evaluated configuration and adverse numerical findings are documented; decisive force and mission closure remain open. The results are predictions, with numerical cross-checks where identified. Physical prototype testing, CubeSat qualification and provider accommodation belong to a later development phase. Gen6 is presented separately as future work.</w:t>
       </w:r>
     </w:p>
     <w:p>
@@ -331,7 +331,7 @@
         <w:pStyle w:val="BodyText"/>
       </w:pPr>
       <w:r>
-        <w:t xml:space="preserve">The authored thesis analyses one Gen5 solution: a magazine-fed, linear synchronous motor driving a reusable magnetic sled. The rated 3U model predicts</w:t>
+        <w:t xml:space="preserve">The authored thesis analyses one Gen5 solution: a magazine-fed, linear synchronous motor driving a reusable magnetic sled. The historical periodic-force 3U model predicts</w:t>
       </w:r>
       <w:r>
         <w:t xml:space="preserve"> </w:t>
@@ -502,7 +502,7 @@
         <w:t xml:space="preserve"> </w:t>
       </w:r>
       <w:r>
-        <w:t xml:space="preserve">as much hardware per 3U payload and fails the preset 15% mass-parity band. The study therefore reaches a decision: the modelled orbital benefit does not make this Gen5 configuration a defensible 3U selection. The result completes the analytical comparison; it does not require a prototype to know that the modelled mass criterion failed. Physical payload loads, magnetic cleanliness, cycle life, and provider interfaces remain questions for a different evidence phase.</w:t>
+        <w:t xml:space="preserve">as much hardware per 3U payload and fails the preset 15% mass-parity band. The study therefore reaches a decision: the conditional modelled orbital benefit does not make this Gen5 configuration a defensible 3U selection. The result completes the analytical comparison; it does not require a prototype to know that the modelled mass criterion failed. Physical payload loads, magnetic cleanliness, cycle life, and provider interfaces remain questions for a different evidence phase.</w:t>
       </w:r>
     </w:p>
     <w:p>
@@ -530,16 +530,341 @@
       </w:r>
     </w:p>
     <w:bookmarkEnd w:id="23"/>
-    <w:bookmarkStart w:id="34" w:name="introduction"/>
+    <w:bookmarkStart w:id="36" w:name="X6be4c09543f80416e16a1bdcc406a9e300f8f3f"/>
     <w:p>
       <w:pPr>
         <w:pStyle w:val="Heading1"/>
       </w:pPr>
       <w:r>
+        <w:t xml:space="preserve">New decisive findings: finite force, feeder route and matched mission</w:t>
+      </w:r>
+    </w:p>
+    <w:p>
+      <w:pPr>
+        <w:pStyle w:val="FirstParagraph"/>
+      </w:pPr>
+      <w:r>
+        <w:t xml:space="preserve">The 16.029 m/s shot result assumes periodic thrust throughout a 1.3 m powered stroke. A new 3-D analytic integration of the exact cuboid field over the CAD’s finite 162-belt stator finds</w:t>
+      </w:r>
+      <w:r>
+        <w:t xml:space="preserve"> </w:t>
+      </w:r>
+      <w:r>
+        <w:rPr>
+          <w:b/>
+          <w:bCs/>
+        </w:rPr>
+        <w:t xml:space="preserve">1.042 kJ ideal work</w:t>
+      </w:r>
+      <w:r>
+        <w:t xml:space="preserve">, corresponding to</w:t>
+      </w:r>
+      <w:r>
+        <w:t xml:space="preserve"> </w:t>
+      </w:r>
+      <w:r>
+        <w:rPr>
+          <w:b/>
+          <w:bCs/>
+        </w:rPr>
+        <w:t xml:space="preserve">12.448 m/s only under optimal phase with switching, voltage and friction losses omitted</w:t>
+      </w:r>
+      <w:r>
+        <w:t xml:space="preserve">. The modeled mover array and stator stop directly overlapping after 1.066 m travel. The 336 mm magnetic model and 340 mm CAD envelope also disagree. Cross-section quadrature refinement changes the three checked station forces by at most 0.369%; halving station spacing changes work by 0.096%. The magnetic field law is shared with the earlier model, so this is an adverse analytic screen,</w:t>
+      </w:r>
+      <w:r>
+        <w:t xml:space="preserve"> </w:t>
+      </w:r>
+      <w:r>
+        <w:rPr>
+          <w:b/>
+          <w:bCs/>
+        </w:rPr>
+        <w:t xml:space="preserve">not an independent 3-D FEM or a hardware test</w:t>
+      </w:r>
+      <w:r>
+        <w:t xml:space="preserve">. The historical 16.029 m/s remains in older tables for traceability and must not be called demonstrated performance. See</w:t>
+      </w:r>
+      <w:r>
+        <w:t xml:space="preserve"> </w:t>
+      </w:r>
+      <w:hyperlink r:id="rId24">
+        <w:r>
+          <w:rPr>
+            <w:rStyle w:val="Hyperlink"/>
+          </w:rPr>
+          <w:t xml:space="preserve">P118</w:t>
+        </w:r>
+      </w:hyperlink>
+      <w:r>
+        <w:t xml:space="preserve">.</w:t>
+      </w:r>
+    </w:p>
+    <w:p>
+      <w:pPr>
+        <w:pStyle w:val="CaptionedFigure"/>
+      </w:pPr>
+      <w:r>
+        <w:drawing>
+          <wp:inline>
+            <wp:extent cx="5120640" cy="2617216"/>
+            <wp:effectExtent b="0" l="0" r="0" t="0"/>
+            <wp:docPr descr="Finite-array/stator model force versus position; no physical measurement." title="" id="26" name="Picture"/>
+            <a:graphic>
+              <a:graphicData uri="http://schemas.openxmlformats.org/drawingml/2006/picture">
+                <pic:pic>
+                  <pic:nvPicPr>
+                    <pic:cNvPr descr="../../figures/gen5_finite_force_map.png" id="27" name="Picture"/>
+                    <pic:cNvPicPr>
+                      <a:picLocks noChangeArrowheads="1" noChangeAspect="1"/>
+                    </pic:cNvPicPr>
+                  </pic:nvPicPr>
+                  <pic:blipFill>
+                    <a:blip r:embed="rId25"/>
+                    <a:stretch>
+                      <a:fillRect/>
+                    </a:stretch>
+                  </pic:blipFill>
+                  <pic:spPr bwMode="auto">
+                    <a:xfrm>
+                      <a:off x="0" y="0"/>
+                      <a:ext cx="5120640" cy="2617216"/>
+                    </a:xfrm>
+                    <a:prstGeom prst="rect">
+                      <a:avLst/>
+                    </a:prstGeom>
+                    <a:noFill/>
+                    <a:ln w="9525">
+                      <a:noFill/>
+                      <a:headEnd/>
+                      <a:tailEnd/>
+                    </a:ln>
+                  </pic:spPr>
+                </pic:pic>
+              </a:graphicData>
+            </a:graphic>
+          </wp:inline>
+        </w:drawing>
+      </w:r>
+    </w:p>
+    <w:p>
+      <w:pPr>
+        <w:pStyle w:val="ImageCaption"/>
+      </w:pPr>
+      <w:r>
+        <w:t xml:space="preserve">Finite-array/stator model force versus position; no physical measurement.</w:t>
+      </w:r>
+    </w:p>
+    <w:p>
+      <w:pPr>
+        <w:pStyle w:val="BodyText"/>
+      </w:pPr>
+      <w:r>
+        <w:t xml:space="preserve">An</w:t>
+      </w:r>
+      <w:r>
+        <w:t xml:space="preserve"> </w:t>
+      </w:r>
+      <w:r>
+        <w:rPr>
+          <w:b/>
+          <w:bCs/>
+        </w:rPr>
+        <w:t xml:space="preserve">unselected R1 geometry candidate</w:t>
+      </w:r>
+      <w:r>
+        <w:t xml:space="preserve"> </w:t>
+      </w:r>
+      <w:r>
+        <w:t xml:space="preserve">uses a 570 mm wide enclosure. Its native FreeCAD document and STEP parts pass exact-solid static fit and twelve scripted 3U envelope transfer paths with conservative fixed-part swept boxes. It lacks the actual lift/carriage, launch restraint, actuation, tolerances, fault recovery and revised installed mass. Its increased envelope has no approved host. This candidate does not alter the evaluated Gen5 configuration or repair the performance discrepancy. See</w:t>
+      </w:r>
+      <w:r>
+        <w:t xml:space="preserve"> </w:t>
+      </w:r>
+      <w:hyperlink r:id="rId28">
+        <w:r>
+          <w:rPr>
+            <w:rStyle w:val="Hyperlink"/>
+          </w:rPr>
+          <w:t xml:space="preserve">R1 CAD record</w:t>
+        </w:r>
+      </w:hyperlink>
+      <w:r>
+        <w:t xml:space="preserve">.</w:t>
+      </w:r>
+    </w:p>
+    <w:p>
+      <w:pPr>
+        <w:pStyle w:val="CaptionedFigure"/>
+      </w:pPr>
+      <w:r>
+        <w:drawing>
+          <wp:inline>
+            <wp:extent cx="4800600" cy="3382240"/>
+            <wp:effectExtent b="0" l="0" r="0" t="0"/>
+            <wp:docPr descr="R1 candidate section; geometry drawing, not a qualified mechanism." title="" id="30" name="Picture"/>
+            <a:graphic>
+              <a:graphicData uri="http://schemas.openxmlformats.org/drawingml/2006/picture">
+                <pic:pic>
+                  <pic:nvPicPr>
+                    <pic:cNvPr descr="../../figures/gen5_feeder_candidate_r1.png" id="31" name="Picture"/>
+                    <pic:cNvPicPr>
+                      <a:picLocks noChangeArrowheads="1" noChangeAspect="1"/>
+                    </pic:cNvPicPr>
+                  </pic:nvPicPr>
+                  <pic:blipFill>
+                    <a:blip r:embed="rId29"/>
+                    <a:stretch>
+                      <a:fillRect/>
+                    </a:stretch>
+                  </pic:blipFill>
+                  <pic:spPr bwMode="auto">
+                    <a:xfrm>
+                      <a:off x="0" y="0"/>
+                      <a:ext cx="4800600" cy="3382240"/>
+                    </a:xfrm>
+                    <a:prstGeom prst="rect">
+                      <a:avLst/>
+                    </a:prstGeom>
+                    <a:noFill/>
+                    <a:ln w="9525">
+                      <a:noFill/>
+                      <a:headEnd/>
+                      <a:tailEnd/>
+                    </a:ln>
+                  </pic:spPr>
+                </pic:pic>
+              </a:graphicData>
+            </a:graphic>
+          </wp:inline>
+        </w:drawing>
+      </w:r>
+    </w:p>
+    <w:p>
+      <w:pPr>
+        <w:pStyle w:val="ImageCaption"/>
+      </w:pPr>
+      <w:r>
+        <w:t xml:space="preserve">R1 candidate section; geometry drawing, not a qualified mechanism.</w:t>
+      </w:r>
+    </w:p>
+    <w:p>
+      <w:pPr>
+        <w:pStyle w:val="BodyText"/>
+      </w:pPr>
+      <w:r>
+        <w:t xml:space="preserve">A</w:t>
+      </w:r>
+      <w:r>
+        <w:t xml:space="preserve"> </w:t>
+      </w:r>
+      <w:r>
+        <w:rPr>
+          <w:b/>
+          <w:bCs/>
+        </w:rPr>
+        <w:t xml:space="preserve">matched reference comparison</w:t>
+      </w:r>
+      <w:r>
+        <w:t xml:space="preserve"> </w:t>
+      </w:r>
+      <w:r>
+        <w:t xml:space="preserve">uses twelve identical 4 kg payloads at 450 km, the same 300 kg base host with 10 kg assumed fuel and 220 s specific impulse, and installed device masses of 72 kg for a spring class versus 126.562 kg modeled Gen5. To meet one common +16.029 m/s inertial payload target at the same epoch, ideal host preburn takes 2.693 kg of propellant with 2.5 m/s spring release and 0.827 kg with the 12.448 m/s finite Gen5 estimate. The subsequent common-input, assumed-100 N twelve-shot optimizer accepts prefixes of</w:t>
+      </w:r>
+      <w:r>
+        <w:t xml:space="preserve"> </w:t>
+      </w:r>
+      <w:r>
+        <w:rPr>
+          <w:b/>
+          <w:bCs/>
+        </w:rPr>
+        <w:t xml:space="preserve">4/12 spring, 1/12 finite Gen5, 1/12 historical Gen5</w:t>
+      </w:r>
+      <w:r>
+        <w:t xml:space="preserve">. None closes. These are bounded numerical cases, not a supplier quote, proof of infeasibility or product advantage. Onboard propulsion, transport services and long-horizon drag remain unmodeled. See</w:t>
+      </w:r>
+      <w:r>
+        <w:t xml:space="preserve"> </w:t>
+      </w:r>
+      <w:hyperlink r:id="rId32">
+        <w:r>
+          <w:rPr>
+            <w:rStyle w:val="Hyperlink"/>
+          </w:rPr>
+          <w:t xml:space="preserve">matched mission inputs</w:t>
+        </w:r>
+      </w:hyperlink>
+      <w:r>
+        <w:t xml:space="preserve">.</w:t>
+      </w:r>
+    </w:p>
+    <w:p>
+      <w:pPr>
+        <w:pStyle w:val="CaptionedFigure"/>
+      </w:pPr>
+      <w:r>
+        <w:drawing>
+          <wp:inline>
+            <wp:extent cx="5120640" cy="2150668"/>
+            <wp:effectExtent b="0" l="0" r="0" t="0"/>
+            <wp:docPr descr="Matched reference results; assumed host and device classes." title="" id="34" name="Picture"/>
+            <a:graphic>
+              <a:graphicData uri="http://schemas.openxmlformats.org/drawingml/2006/picture">
+                <pic:pic>
+                  <pic:nvPicPr>
+                    <pic:cNvPr descr="../../figures/matched_mission_reference.png" id="35" name="Picture"/>
+                    <pic:cNvPicPr>
+                      <a:picLocks noChangeArrowheads="1" noChangeAspect="1"/>
+                    </pic:cNvPicPr>
+                  </pic:nvPicPr>
+                  <pic:blipFill>
+                    <a:blip r:embed="rId33"/>
+                    <a:stretch>
+                      <a:fillRect/>
+                    </a:stretch>
+                  </pic:blipFill>
+                  <pic:spPr bwMode="auto">
+                    <a:xfrm>
+                      <a:off x="0" y="0"/>
+                      <a:ext cx="5120640" cy="2150668"/>
+                    </a:xfrm>
+                    <a:prstGeom prst="rect">
+                      <a:avLst/>
+                    </a:prstGeom>
+                    <a:noFill/>
+                    <a:ln w="9525">
+                      <a:noFill/>
+                      <a:headEnd/>
+                      <a:tailEnd/>
+                    </a:ln>
+                  </pic:spPr>
+                </pic:pic>
+              </a:graphicData>
+            </a:graphic>
+          </wp:inline>
+        </w:drawing>
+      </w:r>
+    </w:p>
+    <w:p>
+      <w:pPr>
+        <w:pStyle w:val="ImageCaption"/>
+      </w:pPr>
+      <w:r>
+        <w:t xml:space="preserve">Matched reference results; assumed host and device classes.</w:t>
+      </w:r>
+    </w:p>
+    <w:bookmarkEnd w:id="36"/>
+    <w:bookmarkStart w:id="47" w:name="introduction"/>
+    <w:p>
+      <w:pPr>
+        <w:pStyle w:val="Heading1"/>
+      </w:pPr>
+      <w:r>
         <w:t xml:space="preserve">1. Introduction</w:t>
       </w:r>
     </w:p>
-    <w:bookmarkStart w:id="24" w:name="the-deployment-problem"/>
+    <w:bookmarkStart w:id="37" w:name="the-deployment-problem"/>
     <w:p>
       <w:pPr>
         <w:pStyle w:val="Heading2"/>
@@ -604,8 +929,8 @@
         <w:t xml:space="preserve">The host is an active participant in the mission model. After its primary mission, a suitable hosted platform would need attitude control, available resources and permission to operate. It could perform coarse orbital repositioning; VOLLEY would assign each secondary payload a local release state. No specific upper stage has been selected or approved for that role.</w:t>
       </w:r>
     </w:p>
-    <w:bookmarkEnd w:id="24"/>
-    <w:bookmarkStart w:id="33" w:name="buyer-and-spacecraft-fit"/>
+    <w:bookmarkEnd w:id="37"/>
+    <w:bookmarkStart w:id="46" w:name="buyer-and-spacecraft-fit"/>
     <w:p>
       <w:pPr>
         <w:pStyle w:val="Heading2"/>
@@ -624,7 +949,7 @@
       <w:r>
         <w:t xml:space="preserve"> </w:t>
       </w:r>
-      <w:hyperlink r:id="rId25">
+      <w:hyperlink r:id="rId38">
         <w:r>
           <w:rPr>
             <w:rStyle w:val="Hyperlink"/>
@@ -641,7 +966,7 @@
       <w:r>
         <w:t xml:space="preserve"> </w:t>
       </w:r>
-      <w:hyperlink r:id="rId26">
+      <w:hyperlink r:id="rId39">
         <w:r>
           <w:rPr>
             <w:rStyle w:val="Hyperlink"/>
@@ -658,7 +983,7 @@
       <w:r>
         <w:t xml:space="preserve"> </w:t>
       </w:r>
-      <w:hyperlink r:id="rId27">
+      <w:hyperlink r:id="rId40">
         <w:r>
           <w:rPr>
             <w:rStyle w:val="Hyperlink"/>
@@ -675,7 +1000,7 @@
       <w:r>
         <w:t xml:space="preserve"> </w:t>
       </w:r>
-      <w:hyperlink r:id="rId28">
+      <w:hyperlink r:id="rId41">
         <w:r>
           <w:rPr>
             <w:rStyle w:val="Hyperlink"/>
@@ -734,7 +1059,7 @@
       <w:r>
         <w:t xml:space="preserve"> </w:t>
       </w:r>
-      <w:hyperlink r:id="rId29">
+      <w:hyperlink r:id="rId42">
         <w:r>
           <w:rPr>
             <w:rStyle w:val="Hyperlink"/>
@@ -758,18 +1083,18 @@
           <wp:inline>
             <wp:extent cx="5334000" cy="2669996"/>
             <wp:effectExtent b="0" l="0" r="0" t="0"/>
-            <wp:docPr descr="Gen5 layout and mission hardware elements. Diagram from the thesis analysis." title="" id="31" name="Picture"/>
+            <wp:docPr descr="Gen5 layout and mission hardware elements. Diagram from the thesis analysis." title="" id="44" name="Picture"/>
             <a:graphic>
               <a:graphicData uri="http://schemas.openxmlformats.org/drawingml/2006/picture">
                 <pic:pic>
                   <pic:nvPicPr>
-                    <pic:cNvPr descr="../../source/figures/D02_layout.png" id="32" name="Picture"/>
+                    <pic:cNvPr descr="../../source/figures/D02_layout.png" id="45" name="Picture"/>
                     <pic:cNvPicPr>
                       <a:picLocks noChangeArrowheads="1" noChangeAspect="1"/>
                     </pic:cNvPicPr>
                   </pic:nvPicPr>
                   <pic:blipFill>
-                    <a:blip r:embed="rId30"/>
+                    <a:blip r:embed="rId43"/>
                     <a:stretch>
                       <a:fillRect/>
                     </a:stretch>
@@ -804,9 +1129,9 @@
         <w:t xml:space="preserve">Gen5 layout and mission hardware elements. Diagram from the thesis analysis.</w:t>
       </w:r>
     </w:p>
-    <w:bookmarkEnd w:id="33"/>
-    <w:bookmarkEnd w:id="34"/>
-    <w:bookmarkStart w:id="35" w:name="literature-review"/>
+    <w:bookmarkEnd w:id="46"/>
+    <w:bookmarkEnd w:id="47"/>
+    <w:bookmarkStart w:id="48" w:name="literature-review"/>
     <w:p>
       <w:pPr>
         <w:pStyle w:val="Heading1"/>
@@ -1094,8 +1419,8 @@
         <w:t xml:space="preserve">satellite at a much lower acceleration while accounting for the whole installed system. No universal CubeSat quasi-static acceleration qualification is assumed; the launch provider and payload-specific limits must govern a real design [2,8].</w:t>
       </w:r>
     </w:p>
-    <w:bookmarkEnd w:id="35"/>
-    <w:bookmarkStart w:id="36" w:name="research-gap"/>
+    <w:bookmarkEnd w:id="48"/>
+    <w:bookmarkStart w:id="49" w:name="research-gap"/>
     <w:p>
       <w:pPr>
         <w:pStyle w:val="Heading1"/>
@@ -1138,8 +1463,8 @@
         <w:t xml:space="preserve">The thesis addresses that gap by constructing a complete Gen5 computational configuration and testing its own claims against explicit comparisons. It also records when those tests weaken the concept. Physical viability remains a separate research gap: numerical model agreement cannot establish manufactured tolerances, actual force, payload cleanliness, cycle reliability or provider compatibility.</w:t>
       </w:r>
     </w:p>
-    <w:bookmarkEnd w:id="36"/>
-    <w:bookmarkStart w:id="37" w:name="objectives-and-outcome"/>
+    <w:bookmarkEnd w:id="49"/>
+    <w:bookmarkStart w:id="50" w:name="objectives-and-outcome"/>
     <w:p>
       <w:pPr>
         <w:pStyle w:val="Heading1"/>
@@ -1401,8 +1726,8 @@
         <w:t xml:space="preserve">These objectives summarize the completed analytical research for this final-review presentation. They are a presentation synthesis, not a claim that the university approved this exact list in advance. The physical development tasks are shown later under future work.</w:t>
       </w:r>
     </w:p>
-    <w:bookmarkEnd w:id="37"/>
-    <w:bookmarkStart w:id="45" w:name="research-methodology"/>
+    <w:bookmarkEnd w:id="50"/>
+    <w:bookmarkStart w:id="58" w:name="research-methodology"/>
     <w:p>
       <w:pPr>
         <w:pStyle w:val="Heading1"/>
@@ -1560,18 +1885,18 @@
           <wp:inline>
             <wp:extent cx="5334000" cy="2028422"/>
             <wp:effectExtent b="0" l="0" r="0" t="0"/>
-            <wp:docPr descr="Modelled shot: velocity, bank voltage and current at the rated point." title="" id="39" name="Picture"/>
+            <wp:docPr descr="Modelled shot: velocity, bank voltage and current at the rated point." title="" id="52" name="Picture"/>
             <a:graphic>
               <a:graphicData uri="http://schemas.openxmlformats.org/drawingml/2006/picture">
                 <pic:pic>
                   <pic:nvPicPr>
-                    <pic:cNvPr descr="../../source/figures/F01_shot.png" id="40" name="Picture"/>
+                    <pic:cNvPr descr="../../source/figures/F01_shot.png" id="53" name="Picture"/>
                     <pic:cNvPicPr>
                       <a:picLocks noChangeArrowheads="1" noChangeAspect="1"/>
                     </pic:cNvPicPr>
                   </pic:nvPicPr>
                   <pic:blipFill>
-                    <a:blip r:embed="rId38"/>
+                    <a:blip r:embed="rId51"/>
                     <a:stretch>
                       <a:fillRect/>
                     </a:stretch>
@@ -1606,7 +1931,7 @@
         <w:t xml:space="preserve">Modelled shot: velocity, bank voltage and current at the rated point.</w:t>
       </w:r>
     </w:p>
-    <w:bookmarkStart w:id="44" w:name="numerical-checks-and-their-limits"/>
+    <w:bookmarkStart w:id="57" w:name="numerical-checks-and-their-limits"/>
     <w:p>
       <w:pPr>
         <w:pStyle w:val="Heading2"/>
@@ -1632,18 +1957,18 @@
           <wp:inline>
             <wp:extent cx="4427220" cy="1990820"/>
             <wp:effectExtent b="0" l="0" r="0" t="0"/>
-            <wp:docPr descr="Representative magnetic-field model output. Source: thesis figure A02." title="" id="42" name="Picture"/>
+            <wp:docPr descr="Representative magnetic-field model output. Source: thesis figure A02." title="" id="55" name="Picture"/>
             <a:graphic>
               <a:graphicData uri="http://schemas.openxmlformats.org/drawingml/2006/picture">
                 <pic:pic>
                   <pic:nvPicPr>
-                    <pic:cNvPr descr="../../source/figures/A02_field_map.png" id="43" name="Picture"/>
+                    <pic:cNvPr descr="../../source/figures/A02_field_map.png" id="56" name="Picture"/>
                     <pic:cNvPicPr>
                       <a:picLocks noChangeArrowheads="1" noChangeAspect="1"/>
                     </pic:cNvPicPr>
                   </pic:nvPicPr>
                   <pic:blipFill>
-                    <a:blip r:embed="rId41"/>
+                    <a:blip r:embed="rId54"/>
                     <a:stretch>
                       <a:fillRect/>
                     </a:stretch>
@@ -1678,9 +2003,9 @@
         <w:t xml:space="preserve">Representative magnetic-field model output. Source: thesis figure A02.</w:t>
       </w:r>
     </w:p>
-    <w:bookmarkEnd w:id="44"/>
-    <w:bookmarkEnd w:id="45"/>
-    <w:bookmarkStart w:id="47" w:name="timeline"/>
+    <w:bookmarkEnd w:id="57"/>
+    <w:bookmarkEnd w:id="58"/>
+    <w:bookmarkStart w:id="60" w:name="timeline"/>
     <w:p>
       <w:pPr>
         <w:pStyle w:val="Heading1"/>
@@ -1689,7 +2014,7 @@
         <w:t xml:space="preserve">6. Timeline</w:t>
       </w:r>
     </w:p>
-    <w:bookmarkStart w:id="46" w:name="documented-evolution"/>
+    <w:bookmarkStart w:id="59" w:name="documented-evolution"/>
     <w:p>
       <w:pPr>
         <w:pStyle w:val="Heading2"/>
@@ -1951,9 +2276,9 @@
         <w:t xml:space="preserve">The thesis repository’s reconstructed history expressly marks several early milestone dates as approximate. The analytical baseline was revised as evidence improved: a CAD-derived sled mass displaced a lighter parametric estimate; a depth-resolved thrust calculation lowered the rated speed; an enclosure buildup exposed the 3U mass penalty; and an independent orbit check rejected an overbroad solar-invariance claim. These revisions are part of the completed study, not signs that the final numbers are placeholders. Gen6 research gates are described only in §10, Future work.</w:t>
       </w:r>
     </w:p>
-    <w:bookmarkEnd w:id="46"/>
-    <w:bookmarkEnd w:id="47"/>
-    <w:bookmarkStart w:id="48" w:name="work-progress"/>
+    <w:bookmarkEnd w:id="59"/>
+    <w:bookmarkEnd w:id="60"/>
+    <w:bookmarkStart w:id="61" w:name="work-progress"/>
     <w:p>
       <w:pPr>
         <w:pStyle w:val="Heading1"/>
@@ -1978,8 +2303,8 @@
         <w:t xml:space="preserve">The deliverable here is a completed computational thesis, not a flight article. The later long gas-guide and independent spring-cell studies are historical comparators. Gen6 has a mission direction and investigation envelope but is not a result of the Gen5 thesis. Its mechanism and exact payload/provider cases remain future choices.</w:t>
       </w:r>
     </w:p>
-    <w:bookmarkEnd w:id="48"/>
-    <w:bookmarkStart w:id="74" w:name="results"/>
+    <w:bookmarkEnd w:id="61"/>
+    <w:bookmarkStart w:id="87" w:name="results"/>
     <w:p>
       <w:pPr>
         <w:pStyle w:val="Heading1"/>
@@ -1988,7 +2313,7 @@
         <w:t xml:space="preserve">8. Results</w:t>
       </w:r>
     </w:p>
-    <w:bookmarkStart w:id="49" w:name="gen5-configuration"/>
+    <w:bookmarkStart w:id="62" w:name="gen5-configuration"/>
     <w:p>
       <w:pPr>
         <w:pStyle w:val="Heading2"/>
@@ -2021,8 +2346,8 @@
         <w:t xml:space="preserve">sled input comes from historical Gen3 CAD solid volumes; this value reduced the exit speed relative to an earlier optimistic parametric estimate. The CAD render conveys a concept, not manufactured or assembled hardware.</w:t>
       </w:r>
     </w:p>
-    <w:bookmarkEnd w:id="49"/>
-    <w:bookmarkStart w:id="51" w:name="rated-3u-shot"/>
+    <w:bookmarkEnd w:id="62"/>
+    <w:bookmarkStart w:id="64" w:name="rated-3u-shot"/>
     <w:p>
       <w:pPr>
         <w:pStyle w:val="Heading2"/>
@@ -2400,7 +2725,7 @@
       <w:r>
         <w:t xml:space="preserve"> </w:t>
       </w:r>
-      <w:hyperlink r:id="rId50">
+      <w:hyperlink r:id="rId63">
         <w:r>
           <w:rPr>
             <w:rStyle w:val="Hyperlink"/>
@@ -2431,8 +2756,8 @@
         <w:t xml:space="preserve">after the reported kinetic, copper and bank-ESR terms. That is an accounting gap, not proof of a specific additional loss. Full electrical closure and an installed bank are still open.</w:t>
       </w:r>
     </w:p>
-    <w:bookmarkEnd w:id="51"/>
-    <w:bookmarkStart w:id="55" w:name="command-precision"/>
+    <w:bookmarkEnd w:id="64"/>
+    <w:bookmarkStart w:id="68" w:name="command-precision"/>
     <w:p>
       <w:pPr>
         <w:pStyle w:val="Heading2"/>
@@ -2505,18 +2830,18 @@
           <wp:inline>
             <wp:extent cx="3886964" cy="2792131"/>
             <wp:effectExtent b="0" l="0" r="0" t="0"/>
-            <wp:docPr descr="Closed-loop simulation distribution at the fleet setpoint." title="" id="53" name="Picture"/>
+            <wp:docPr descr="Closed-loop simulation distribution at the fleet setpoint." title="" id="66" name="Picture"/>
             <a:graphic>
               <a:graphicData uri="http://schemas.openxmlformats.org/drawingml/2006/picture">
                 <pic:pic>
                   <pic:nvPicPr>
-                    <pic:cNvPr descr="../../source/figures/F03_mc.png" id="54" name="Picture"/>
+                    <pic:cNvPr descr="../../source/figures/F03_mc.png" id="67" name="Picture"/>
                     <pic:cNvPicPr>
                       <a:picLocks noChangeArrowheads="1" noChangeAspect="1"/>
                     </pic:cNvPicPr>
                   </pic:nvPicPr>
                   <pic:blipFill>
-                    <a:blip r:embed="rId52"/>
+                    <a:blip r:embed="rId65"/>
                     <a:stretch>
                       <a:fillRect/>
                     </a:stretch>
@@ -2551,8 +2876,8 @@
         <w:t xml:space="preserve">Closed-loop simulation distribution at the fleet setpoint.</w:t>
       </w:r>
     </w:p>
-    <w:bookmarkEnd w:id="55"/>
-    <w:bookmarkStart w:id="62" w:name="orbital-utility"/>
+    <w:bookmarkEnd w:id="68"/>
+    <w:bookmarkStart w:id="75" w:name="orbital-utility"/>
     <w:p>
       <w:pPr>
         <w:pStyle w:val="Heading2"/>
@@ -2623,18 +2948,18 @@
           <wp:inline>
             <wp:extent cx="4907280" cy="2473613"/>
             <wp:effectExtent b="0" l="0" r="0" t="0"/>
-            <wp:docPr descr="Independent rated-state two-body orbit check. The lifetime claim is outside its scope." title="" id="57" name="Picture"/>
+            <wp:docPr descr="Independent rated-state two-body orbit check. The lifetime claim is outside its scope." title="" id="70" name="Picture"/>
             <a:graphic>
               <a:graphicData uri="http://schemas.openxmlformats.org/drawingml/2006/picture">
                 <pic:pic>
                   <pic:nvPicPr>
-                    <pic:cNvPr descr="../../figures/rated_orbit_crosscheck.png" id="58" name="Picture"/>
+                    <pic:cNvPr descr="../../figures/rated_orbit_crosscheck.png" id="71" name="Picture"/>
                     <pic:cNvPicPr>
                       <a:picLocks noChangeArrowheads="1" noChangeAspect="1"/>
                     </pic:cNvPicPr>
                   </pic:nvPicPr>
                   <pic:blipFill>
-                    <a:blip r:embed="rId56"/>
+                    <a:blip r:embed="rId69"/>
                     <a:stretch>
                       <a:fillRect/>
                     </a:stretch>
@@ -2678,18 +3003,18 @@
           <wp:inline>
             <wp:extent cx="4382391" cy="2697327"/>
             <wp:effectExtent b="0" l="0" r="0" t="0"/>
-            <wp:docPr descr="Modelled orbital-lifetime response. Absolute values depend on atmosphere." title="" id="60" name="Picture"/>
+            <wp:docPr descr="Modelled orbital-lifetime response. Absolute values depend on atmosphere." title="" id="73" name="Picture"/>
             <a:graphic>
               <a:graphicData uri="http://schemas.openxmlformats.org/drawingml/2006/picture">
                 <pic:pic>
                   <pic:nvPicPr>
-                    <pic:cNvPr descr="../../source/figures/F04_life.png" id="61" name="Picture"/>
+                    <pic:cNvPr descr="../../source/figures/F04_life.png" id="74" name="Picture"/>
                     <pic:cNvPicPr>
                       <a:picLocks noChangeArrowheads="1" noChangeAspect="1"/>
                     </pic:cNvPicPr>
                   </pic:nvPicPr>
                   <pic:blipFill>
-                    <a:blip r:embed="rId59"/>
+                    <a:blip r:embed="rId72"/>
                     <a:stretch>
                       <a:fillRect/>
                     </a:stretch>
@@ -2724,8 +3049,8 @@
         <w:t xml:space="preserve">Modelled orbital-lifetime response. Absolute values depend on atmosphere.</w:t>
       </w:r>
     </w:p>
-    <w:bookmarkEnd w:id="62"/>
-    <w:bookmarkStart w:id="66" w:name="installed-mass-changes-the-decision"/>
+    <w:bookmarkEnd w:id="75"/>
+    <w:bookmarkStart w:id="79" w:name="installed-mass-changes-the-decision"/>
     <w:p>
       <w:pPr>
         <w:pStyle w:val="Heading2"/>
@@ -2854,18 +3179,18 @@
           <wp:inline>
             <wp:extent cx="5334000" cy="1915167"/>
             <wp:effectExtent b="0" l="0" r="0" t="0"/>
-            <wp:docPr descr="Constraint and mass-attribution analysis; mass is a model rollup." title="" id="64" name="Picture"/>
+            <wp:docPr descr="Constraint and mass-attribution analysis; mass is a model rollup." title="" id="77" name="Picture"/>
             <a:graphic>
               <a:graphicData uri="http://schemas.openxmlformats.org/drawingml/2006/picture">
                 <pic:pic>
                   <pic:nvPicPr>
-                    <pic:cNvPr descr="../../source/figures/A35_ledger.png" id="65" name="Picture"/>
+                    <pic:cNvPr descr="../../source/figures/A35_ledger.png" id="78" name="Picture"/>
                     <pic:cNvPicPr>
                       <a:picLocks noChangeArrowheads="1" noChangeAspect="1"/>
                     </pic:cNvPicPr>
                   </pic:nvPicPr>
                   <pic:blipFill>
-                    <a:blip r:embed="rId63"/>
+                    <a:blip r:embed="rId76"/>
                     <a:stretch>
                       <a:fillRect/>
                     </a:stretch>
@@ -2900,8 +3225,8 @@
         <w:t xml:space="preserve">Constraint and mass-attribution analysis; mass is a model rollup.</w:t>
       </w:r>
     </w:p>
-    <w:bookmarkEnd w:id="66"/>
-    <w:bookmarkStart w:id="72" w:name="native-cad-and-packaging-review"/>
+    <w:bookmarkEnd w:id="79"/>
+    <w:bookmarkStart w:id="85" w:name="native-cad-and-packaging-review"/>
     <w:p>
       <w:pPr>
         <w:pStyle w:val="Heading2"/>
@@ -2920,7 +3245,7 @@
       <w:r>
         <w:t xml:space="preserve"> </w:t>
       </w:r>
-      <w:hyperlink r:id="rId67">
+      <w:hyperlink r:id="rId80">
         <w:r>
           <w:rPr>
             <w:rStyle w:val="Hyperlink"/>
@@ -2937,7 +3262,7 @@
       <w:r>
         <w:t xml:space="preserve"> </w:t>
       </w:r>
-      <w:hyperlink r:id="rId68">
+      <w:hyperlink r:id="rId81">
         <w:r>
           <w:rPr>
             <w:rStyle w:val="Hyperlink"/>
@@ -3062,18 +3387,18 @@
           <wp:inline>
             <wp:extent cx="4907280" cy="6642781"/>
             <wp:effectExtent b="0" l="0" r="0" t="0"/>
-            <wp:docPr descr="Dimensioned side-fed reference cross-section; this configuration fails the width check." title="" id="70" name="Picture"/>
+            <wp:docPr descr="Dimensioned side-fed reference cross-section; this configuration fails the width check." title="" id="83" name="Picture"/>
             <a:graphic>
               <a:graphicData uri="http://schemas.openxmlformats.org/drawingml/2006/picture">
                 <pic:pic>
                   <pic:nvPicPr>
-                    <pic:cNvPr descr="../../figures/gen5_packaging_section.png" id="71" name="Picture"/>
+                    <pic:cNvPr descr="../../figures/gen5_packaging_section.png" id="84" name="Picture"/>
                     <pic:cNvPicPr>
                       <a:picLocks noChangeArrowheads="1" noChangeAspect="1"/>
                     </pic:cNvPicPr>
                   </pic:nvPicPr>
                   <pic:blipFill>
-                    <a:blip r:embed="rId69"/>
+                    <a:blip r:embed="rId82"/>
                     <a:stretch>
                       <a:fillRect/>
                     </a:stretch>
@@ -3108,8 +3433,8 @@
         <w:t xml:space="preserve">Dimensioned side-fed reference cross-section; this configuration fails the width check.</w:t>
       </w:r>
     </w:p>
-    <w:bookmarkEnd w:id="72"/>
-    <w:bookmarkStart w:id="73" w:name="decision-and-evidence-boundary"/>
+    <w:bookmarkEnd w:id="85"/>
+    <w:bookmarkStart w:id="86" w:name="decision-and-evidence-boundary"/>
     <w:p>
       <w:pPr>
         <w:pStyle w:val="Heading2"/>
@@ -3126,9 +3451,9 @@
         <w:t xml:space="preserve">The analytical result has four parts. The model supports a commandable release and conditional orbital-energy benefit; the full-system 3U mass criterion fails; the stated side-fed layout fails its CAD width check; and physical behavior remains unverified. The latter includes release-cycle reliability, shock and arrest loads transmitted to stowed satellites, field exposure near a customer payload, host attitude/control authority and provider approval. The known-problems register ranks several as potentially design-fatal. These findings limit product claims and define the research conclusion.</w:t>
       </w:r>
     </w:p>
-    <w:bookmarkEnd w:id="73"/>
-    <w:bookmarkEnd w:id="74"/>
-    <w:bookmarkStart w:id="75" w:name="conclusion"/>
+    <w:bookmarkEnd w:id="86"/>
+    <w:bookmarkEnd w:id="87"/>
+    <w:bookmarkStart w:id="88" w:name="conclusion"/>
     <w:p>
       <w:pPr>
         <w:pStyle w:val="Heading1"/>
@@ -3153,8 +3478,8 @@
         <w:t xml:space="preserve">The thesis’s strongest engineering contribution is the transparent decision record: the full machine was modelled, independent numerical checks corrected several claims, and an unfavourable mass result was retained. That closes the Gen5 study and provides a defensible input to a separate future architecture trade.</w:t>
       </w:r>
     </w:p>
-    <w:bookmarkEnd w:id="75"/>
-    <w:bookmarkStart w:id="76" w:name="future-work"/>
+    <w:bookmarkEnd w:id="88"/>
+    <w:bookmarkStart w:id="89" w:name="future-work"/>
     <w:p>
       <w:pPr>
         <w:pStyle w:val="Heading1"/>
@@ -3179,8 +3504,8 @@
         <w:t xml:space="preserve">The near-term milestone is one named test-article configuration that can be independently reviewed. Its package needs controlled geometry and drawings, a bill of materials, host and payload interfaces, full installed mass/energy/thermal accounting, assembly and inspection instructions, instrumented procedures, predetermined pass/fail and stop criteria, uncertainty and model-credibility evidence, retained failures, and an explicit build/test release decision. A rejected candidate is a valid research outcome; it must not be presented as a build-ready survivor.</w:t>
       </w:r>
     </w:p>
-    <w:bookmarkEnd w:id="76"/>
-    <w:bookmarkStart w:id="77" w:name="references-and-project-records"/>
+    <w:bookmarkEnd w:id="89"/>
+    <w:bookmarkStart w:id="90" w:name="references-and-project-records"/>
     <w:p>
       <w:pPr>
         <w:pStyle w:val="Heading1"/>
@@ -3575,7 +3900,7 @@
         <w:t xml:space="preserve">, controlled working baseline, 29 September 2026. Project plan, not achieved performance.</w:t>
       </w:r>
     </w:p>
-    <w:bookmarkEnd w:id="77"/>
+    <w:bookmarkEnd w:id="90"/>
     <w:sectPr/>
   </w:body>
 </w:document>

</xml_diff>

<commit_message>
Correct thesis presentation evidence and rebuild review pack
</commit_message>
<xml_diff>
--- a/university/final_review_2026_10_10/PANEL_HANDBOOK.docx
+++ b/university/final_review_2026_10_10/PANEL_HANDBOOK.docx
@@ -420,7 +420,7 @@
         <w:t xml:space="preserve"> </w:t>
       </w:r>
       <w:r>
-        <w:t xml:space="preserve">exit-speed dispersion at a 15.8 m/s setpoint. In a stated orbital case, a maximum-speed release raises semi-major axis by</w:t>
+        <w:t xml:space="preserve">exit-speed dispersion at a 15.8 m/s setpoint. For an assumed historical 16.029 m/s input, the orbit model raises semi-major axis by</w:t>
       </w:r>
       <w:r>
         <w:t xml:space="preserve"> </w:t>
@@ -449,7 +449,7 @@
         <w:t xml:space="preserve"> </w:t>
       </w:r>
       <w:r>
-        <w:t xml:space="preserve">modelled lifetime multiplier at mean solar activity. The lifetime result is atmosphere-sensitive and has not been independently rerun at the exact current operating point.</w:t>
+        <w:t xml:space="preserve">modelled lifetime multiplier at mean solar activity. The lifetime result is atmosphere-sensitive and has not been independently rerun for that assumed historical input.</w:t>
       </w:r>
     </w:p>
     <w:p>
@@ -1460,7 +1460,7 @@
         <w:pStyle w:val="BodyText"/>
       </w:pPr>
       <w:r>
-        <w:t xml:space="preserve">The thesis addresses that gap by constructing a complete Gen5 computational configuration and testing its own claims against explicit comparisons. It also records when those tests weaken the concept. Physical viability remains a separate research gap: numerical model agreement cannot establish manufactured tolerances, actual force, payload cleanliness, cycle reliability or provider compatibility.</w:t>
+        <w:t xml:space="preserve">The thesis addresses that gap by constructing a documented Gen5 reference configuration and testing its own claims against explicit comparisons. It also records when those tests weaken the concept. Physical viability remains a separate research gap: numerical model agreement cannot establish manufactured tolerances, actual force, payload cleanliness, cycle reliability or provider compatibility.</w:t>
       </w:r>
     </w:p>
     <w:bookmarkEnd w:id="49"/>
@@ -1885,7 +1885,7 @@
           <wp:inline>
             <wp:extent cx="5334000" cy="2028422"/>
             <wp:effectExtent b="0" l="0" r="0" t="0"/>
-            <wp:docPr descr="Modelled shot: velocity, bank voltage and current at the rated point." title="" id="52" name="Picture"/>
+            <wp:docPr descr="Historical modeled shot: velocity, bank voltage and current." title="" id="52" name="Picture"/>
             <a:graphic>
               <a:graphicData uri="http://schemas.openxmlformats.org/drawingml/2006/picture">
                 <pic:pic>
@@ -1928,7 +1928,7 @@
         <w:pStyle w:val="ImageCaption"/>
       </w:pPr>
       <w:r>
-        <w:t xml:space="preserve">Modelled shot: velocity, bank voltage and current at the rated point.</w:t>
+        <w:t xml:space="preserve">Historical modeled shot: velocity, bank voltage and current.</w:t>
       </w:r>
     </w:p>
     <w:bookmarkStart w:id="57" w:name="numerical-checks-and-their-limits"/>
@@ -2891,7 +2891,7 @@
         <w:pStyle w:val="FirstParagraph"/>
       </w:pPr>
       <w:r>
-        <w:t xml:space="preserve">For the stated orbit and mean-solar-activity case, one maximum-speed release predicts a</w:t>
+        <w:t xml:space="preserve">For the stated orbit and mean-solar-activity case, an assumed historical 16.029 m/s release predicts a</w:t>
       </w:r>
       <w:r>
         <w:t xml:space="preserve"> </w:t>
@@ -2923,7 +2923,7 @@
         <w:t xml:space="preserve"> </w:t>
       </w:r>
       <w:r>
-        <w:t xml:space="preserve">lifetime multiplier for a propulsionless satellite. A separate Cartesian two-body integration of the current rated state returns</w:t>
+        <w:t xml:space="preserve">lifetime multiplier for a propulsionless satellite. A separate Cartesian two-body integration of that assumed historical state returns</w:t>
       </w:r>
       <w:r>
         <w:t xml:space="preserve"> </w:t>

</xml_diff>

<commit_message>
Refresh final-review pack with finite-force cross-checks
</commit_message>
<xml_diff>
--- a/university/final_review_2026_10_10/PANEL_HANDBOOK.docx
+++ b/university/final_review_2026_10_10/PANEL_HANDBOOK.docx
@@ -530,7 +530,7 @@
       </w:r>
     </w:p>
     <w:bookmarkEnd w:id="23"/>
-    <w:bookmarkStart w:id="36" w:name="X6be4c09543f80416e16a1bdcc406a9e300f8f3f"/>
+    <w:bookmarkStart w:id="44" w:name="X6be4c09543f80416e16a1bdcc406a9e300f8f3f"/>
     <w:p>
       <w:pPr>
         <w:pStyle w:val="Heading1"/>
@@ -660,6 +660,230 @@
         <w:pStyle w:val="BodyText"/>
       </w:pPr>
       <w:r>
+        <w:t xml:space="preserve">A separate</w:t>
+      </w:r>
+      <w:r>
+        <w:t xml:space="preserve"> </w:t>
+      </w:r>
+      <w:r>
+        <w:rPr>
+          <w:b/>
+          <w:bCs/>
+        </w:rPr>
+        <w:t xml:space="preserve">2-D finite-element magnetostatic solve</w:t>
+      </w:r>
+      <w:r>
+        <w:t xml:space="preserve"> </w:t>
+      </w:r>
+      <w:r>
+        <w:t xml:space="preserve">of the finite magnet array gives</w:t>
+      </w:r>
+      <w:r>
+        <w:t xml:space="preserve"> </w:t>
+      </w:r>
+      <w:r>
+        <w:rPr>
+          <w:b/>
+          <w:bCs/>
+        </w:rPr>
+        <w:t xml:space="preserve">1.082 kJ ideal work</w:t>
+      </w:r>
+      <w:r>
+        <w:t xml:space="preserve"> </w:t>
+      </w:r>
+      <w:r>
+        <w:t xml:space="preserve">on its finest 1 mm mesh, compared with the 3-D analytic screen’s 1.042 kJ. The 2-to-1 mm mesh change is 0.59%; a larger air boundary changes the 2 mm work by 0.0004%. The solver uses a different field formulation but omits magnet-depth end effects, so the two absolute results must not be combined into an achieved speed.</w:t>
+      </w:r>
+      <w:r>
+        <w:t xml:space="preserve"> </w:t>
+      </w:r>
+      <w:hyperlink r:id="rId28">
+        <w:r>
+          <w:rPr>
+            <w:rStyle w:val="Hyperlink"/>
+          </w:rPr>
+          <w:t xml:space="preserve">P119</w:t>
+        </w:r>
+      </w:hyperlink>
+      <w:r>
+        <w:t xml:space="preserve"> </w:t>
+      </w:r>
+      <w:r>
+        <w:t xml:space="preserve">records meshes, convergence and assumptions.</w:t>
+      </w:r>
+    </w:p>
+    <w:p>
+      <w:pPr>
+        <w:pStyle w:val="CaptionedFigure"/>
+      </w:pPr>
+      <w:r>
+        <w:drawing>
+          <wp:inline>
+            <wp:extent cx="5120640" cy="2617216"/>
+            <wp:effectExtent b="0" l="0" r="0" t="0"/>
+            <wp:docPr descr="Independent 2-D finite-element force screen, not a measurement." title="" id="30" name="Picture"/>
+            <a:graphic>
+              <a:graphicData uri="http://schemas.openxmlformats.org/drawingml/2006/picture">
+                <pic:pic>
+                  <pic:nvPicPr>
+                    <pic:cNvPr descr="../../figures/gen5_finite_force_fem2d.png" id="31" name="Picture"/>
+                    <pic:cNvPicPr>
+                      <a:picLocks noChangeArrowheads="1" noChangeAspect="1"/>
+                    </pic:cNvPicPr>
+                  </pic:nvPicPr>
+                  <pic:blipFill>
+                    <a:blip r:embed="rId29"/>
+                    <a:stretch>
+                      <a:fillRect/>
+                    </a:stretch>
+                  </pic:blipFill>
+                  <pic:spPr bwMode="auto">
+                    <a:xfrm>
+                      <a:off x="0" y="0"/>
+                      <a:ext cx="5120640" cy="2617216"/>
+                    </a:xfrm>
+                    <a:prstGeom prst="rect">
+                      <a:avLst/>
+                    </a:prstGeom>
+                    <a:noFill/>
+                    <a:ln w="9525">
+                      <a:noFill/>
+                      <a:headEnd/>
+                      <a:tailEnd/>
+                    </a:ln>
+                  </pic:spPr>
+                </pic:pic>
+              </a:graphicData>
+            </a:graphic>
+          </wp:inline>
+        </w:drawing>
+      </w:r>
+    </w:p>
+    <w:p>
+      <w:pPr>
+        <w:pStyle w:val="ImageCaption"/>
+      </w:pPr>
+      <w:r>
+        <w:t xml:space="preserve">Independent 2-D finite-element force screen, not a measurement.</w:t>
+      </w:r>
+    </w:p>
+    <w:p>
+      <w:pPr>
+        <w:pStyle w:val="BodyText"/>
+      </w:pPr>
+      <w:r>
+        <w:t xml:space="preserve">A</w:t>
+      </w:r>
+      <w:r>
+        <w:t xml:space="preserve"> </w:t>
+      </w:r>
+      <w:r>
+        <w:rPr>
+          <w:b/>
+          <w:bCs/>
+        </w:rPr>
+        <w:t xml:space="preserve">conditional finite-force bank/trajectory rerun</w:t>
+      </w:r>
+      <w:r>
+        <w:t xml:space="preserve"> </w:t>
+      </w:r>
+      <w:r>
+        <w:t xml:space="preserve">retains the historical 96 V, 6 F, 12 mΩ source and assumed converter. With the full 1.3 m winding energized it computes</w:t>
+      </w:r>
+      <w:r>
+        <w:t xml:space="preserve"> </w:t>
+      </w:r>
+      <w:r>
+        <w:rPr>
+          <w:b/>
+          <w:bCs/>
+        </w:rPr>
+        <w:t xml:space="preserve">2.099 kJ gross capacitor draw</w:t>
+      </w:r>
+      <w:r>
+        <w:t xml:space="preserve"> </w:t>
+      </w:r>
+      <w:r>
+        <w:t xml:space="preserve">and 927 J copper heat; an illustrative 0.34 m active-copper branch gives 1.394 kJ gross and 243 J copper heat. Both report 12.448 m/s because the force curve is imposed at ideal phase; no voltage-limited switching law or selected winding/inverter exists. The old 2.782 kJ, brake and control outputs are not revised ratings.</w:t>
+      </w:r>
+      <w:r>
+        <w:t xml:space="preserve"> </w:t>
+      </w:r>
+      <w:hyperlink r:id="rId32">
+        <w:r>
+          <w:rPr>
+            <w:rStyle w:val="Hyperlink"/>
+          </w:rPr>
+          <w:t xml:space="preserve">P120</w:t>
+        </w:r>
+      </w:hyperlink>
+      <w:r>
+        <w:t xml:space="preserve"> </w:t>
+      </w:r>
+      <w:r>
+        <w:t xml:space="preserve">gives the time history and energy ledger.</w:t>
+      </w:r>
+    </w:p>
+    <w:p>
+      <w:pPr>
+        <w:pStyle w:val="CaptionedFigure"/>
+      </w:pPr>
+      <w:r>
+        <w:drawing>
+          <wp:inline>
+            <wp:extent cx="5120640" cy="3607723"/>
+            <wp:effectExtent b="0" l="0" r="0" t="0"/>
+            <wp:docPr descr="Finite-force speed and assumed bank energy histories." title="" id="34" name="Picture"/>
+            <a:graphic>
+              <a:graphicData uri="http://schemas.openxmlformats.org/drawingml/2006/picture">
+                <pic:pic>
+                  <pic:nvPicPr>
+                    <pic:cNvPr descr="../../figures/gen5_finite_coupled_shot.png" id="35" name="Picture"/>
+                    <pic:cNvPicPr>
+                      <a:picLocks noChangeArrowheads="1" noChangeAspect="1"/>
+                    </pic:cNvPicPr>
+                  </pic:nvPicPr>
+                  <pic:blipFill>
+                    <a:blip r:embed="rId33"/>
+                    <a:stretch>
+                      <a:fillRect/>
+                    </a:stretch>
+                  </pic:blipFill>
+                  <pic:spPr bwMode="auto">
+                    <a:xfrm>
+                      <a:off x="0" y="0"/>
+                      <a:ext cx="5120640" cy="3607723"/>
+                    </a:xfrm>
+                    <a:prstGeom prst="rect">
+                      <a:avLst/>
+                    </a:prstGeom>
+                    <a:noFill/>
+                    <a:ln w="9525">
+                      <a:noFill/>
+                      <a:headEnd/>
+                      <a:tailEnd/>
+                    </a:ln>
+                  </pic:spPr>
+                </pic:pic>
+              </a:graphicData>
+            </a:graphic>
+          </wp:inline>
+        </w:drawing>
+      </w:r>
+    </w:p>
+    <w:p>
+      <w:pPr>
+        <w:pStyle w:val="ImageCaption"/>
+      </w:pPr>
+      <w:r>
+        <w:t xml:space="preserve">Finite-force speed and assumed bank energy histories.</w:t>
+      </w:r>
+    </w:p>
+    <w:p>
+      <w:pPr>
+        <w:pStyle w:val="BodyText"/>
+      </w:pPr>
+      <w:r>
         <w:t xml:space="preserve">An</w:t>
       </w:r>
       <w:r>
@@ -681,7 +905,7 @@
       <w:r>
         <w:t xml:space="preserve"> </w:t>
       </w:r>
-      <w:hyperlink r:id="rId28">
+      <w:hyperlink r:id="rId36">
         <w:r>
           <w:rPr>
             <w:rStyle w:val="Hyperlink"/>
@@ -702,18 +926,18 @@
           <wp:inline>
             <wp:extent cx="4800600" cy="3382240"/>
             <wp:effectExtent b="0" l="0" r="0" t="0"/>
-            <wp:docPr descr="R1 candidate section; geometry drawing, not a qualified mechanism." title="" id="30" name="Picture"/>
+            <wp:docPr descr="R1 candidate section; geometry drawing, not a qualified mechanism." title="" id="38" name="Picture"/>
             <a:graphic>
               <a:graphicData uri="http://schemas.openxmlformats.org/drawingml/2006/picture">
                 <pic:pic>
                   <pic:nvPicPr>
-                    <pic:cNvPr descr="../../figures/gen5_feeder_candidate_r1.png" id="31" name="Picture"/>
+                    <pic:cNvPr descr="../../figures/gen5_feeder_candidate_r1.png" id="39" name="Picture"/>
                     <pic:cNvPicPr>
                       <a:picLocks noChangeArrowheads="1" noChangeAspect="1"/>
                     </pic:cNvPicPr>
                   </pic:nvPicPr>
                   <pic:blipFill>
-                    <a:blip r:embed="rId29"/>
+                    <a:blip r:embed="rId37"/>
                     <a:stretch>
                       <a:fillRect/>
                     </a:stretch>
@@ -787,7 +1011,7 @@
       <w:r>
         <w:t xml:space="preserve"> </w:t>
       </w:r>
-      <w:hyperlink r:id="rId32">
+      <w:hyperlink r:id="rId40">
         <w:r>
           <w:rPr>
             <w:rStyle w:val="Hyperlink"/>
@@ -808,18 +1032,18 @@
           <wp:inline>
             <wp:extent cx="5120640" cy="2150668"/>
             <wp:effectExtent b="0" l="0" r="0" t="0"/>
-            <wp:docPr descr="Matched reference results; assumed host and device classes." title="" id="34" name="Picture"/>
+            <wp:docPr descr="Matched reference results; assumed host and device classes." title="" id="42" name="Picture"/>
             <a:graphic>
               <a:graphicData uri="http://schemas.openxmlformats.org/drawingml/2006/picture">
                 <pic:pic>
                   <pic:nvPicPr>
-                    <pic:cNvPr descr="../../figures/matched_mission_reference.png" id="35" name="Picture"/>
+                    <pic:cNvPr descr="../../figures/matched_mission_reference.png" id="43" name="Picture"/>
                     <pic:cNvPicPr>
                       <a:picLocks noChangeArrowheads="1" noChangeAspect="1"/>
                     </pic:cNvPicPr>
                   </pic:nvPicPr>
                   <pic:blipFill>
-                    <a:blip r:embed="rId33"/>
+                    <a:blip r:embed="rId41"/>
                     <a:stretch>
                       <a:fillRect/>
                     </a:stretch>
@@ -854,8 +1078,8 @@
         <w:t xml:space="preserve">Matched reference results; assumed host and device classes.</w:t>
       </w:r>
     </w:p>
-    <w:bookmarkEnd w:id="36"/>
-    <w:bookmarkStart w:id="47" w:name="introduction"/>
+    <w:bookmarkEnd w:id="44"/>
+    <w:bookmarkStart w:id="55" w:name="introduction"/>
     <w:p>
       <w:pPr>
         <w:pStyle w:val="Heading1"/>
@@ -864,7 +1088,7 @@
         <w:t xml:space="preserve">1. Introduction</w:t>
       </w:r>
     </w:p>
-    <w:bookmarkStart w:id="37" w:name="the-deployment-problem"/>
+    <w:bookmarkStart w:id="45" w:name="the-deployment-problem"/>
     <w:p>
       <w:pPr>
         <w:pStyle w:val="Heading2"/>
@@ -929,8 +1153,8 @@
         <w:t xml:space="preserve">The host is an active participant in the mission model. After its primary mission, a suitable hosted platform would need attitude control, available resources and permission to operate. It could perform coarse orbital repositioning; VOLLEY would assign each secondary payload a local release state. No specific upper stage has been selected or approved for that role.</w:t>
       </w:r>
     </w:p>
-    <w:bookmarkEnd w:id="37"/>
-    <w:bookmarkStart w:id="46" w:name="buyer-and-spacecraft-fit"/>
+    <w:bookmarkEnd w:id="45"/>
+    <w:bookmarkStart w:id="54" w:name="buyer-and-spacecraft-fit"/>
     <w:p>
       <w:pPr>
         <w:pStyle w:val="Heading2"/>
@@ -949,7 +1173,7 @@
       <w:r>
         <w:t xml:space="preserve"> </w:t>
       </w:r>
-      <w:hyperlink r:id="rId38">
+      <w:hyperlink r:id="rId46">
         <w:r>
           <w:rPr>
             <w:rStyle w:val="Hyperlink"/>
@@ -966,7 +1190,7 @@
       <w:r>
         <w:t xml:space="preserve"> </w:t>
       </w:r>
-      <w:hyperlink r:id="rId39">
+      <w:hyperlink r:id="rId47">
         <w:r>
           <w:rPr>
             <w:rStyle w:val="Hyperlink"/>
@@ -983,7 +1207,7 @@
       <w:r>
         <w:t xml:space="preserve"> </w:t>
       </w:r>
-      <w:hyperlink r:id="rId40">
+      <w:hyperlink r:id="rId48">
         <w:r>
           <w:rPr>
             <w:rStyle w:val="Hyperlink"/>
@@ -1000,7 +1224,7 @@
       <w:r>
         <w:t xml:space="preserve"> </w:t>
       </w:r>
-      <w:hyperlink r:id="rId41">
+      <w:hyperlink r:id="rId49">
         <w:r>
           <w:rPr>
             <w:rStyle w:val="Hyperlink"/>
@@ -1059,7 +1283,7 @@
       <w:r>
         <w:t xml:space="preserve"> </w:t>
       </w:r>
-      <w:hyperlink r:id="rId42">
+      <w:hyperlink r:id="rId50">
         <w:r>
           <w:rPr>
             <w:rStyle w:val="Hyperlink"/>
@@ -1083,18 +1307,18 @@
           <wp:inline>
             <wp:extent cx="5334000" cy="2669996"/>
             <wp:effectExtent b="0" l="0" r="0" t="0"/>
-            <wp:docPr descr="Gen5 layout and mission hardware elements. Diagram from the thesis analysis." title="" id="44" name="Picture"/>
+            <wp:docPr descr="Gen5 layout and mission hardware elements. Diagram from the thesis analysis." title="" id="52" name="Picture"/>
             <a:graphic>
               <a:graphicData uri="http://schemas.openxmlformats.org/drawingml/2006/picture">
                 <pic:pic>
                   <pic:nvPicPr>
-                    <pic:cNvPr descr="../../source/figures/D02_layout.png" id="45" name="Picture"/>
+                    <pic:cNvPr descr="../../source/figures/D02_layout.png" id="53" name="Picture"/>
                     <pic:cNvPicPr>
                       <a:picLocks noChangeArrowheads="1" noChangeAspect="1"/>
                     </pic:cNvPicPr>
                   </pic:nvPicPr>
                   <pic:blipFill>
-                    <a:blip r:embed="rId43"/>
+                    <a:blip r:embed="rId51"/>
                     <a:stretch>
                       <a:fillRect/>
                     </a:stretch>
@@ -1129,9 +1353,9 @@
         <w:t xml:space="preserve">Gen5 layout and mission hardware elements. Diagram from the thesis analysis.</w:t>
       </w:r>
     </w:p>
-    <w:bookmarkEnd w:id="46"/>
-    <w:bookmarkEnd w:id="47"/>
-    <w:bookmarkStart w:id="48" w:name="literature-review"/>
+    <w:bookmarkEnd w:id="54"/>
+    <w:bookmarkEnd w:id="55"/>
+    <w:bookmarkStart w:id="56" w:name="literature-review"/>
     <w:p>
       <w:pPr>
         <w:pStyle w:val="Heading1"/>
@@ -1419,8 +1643,8 @@
         <w:t xml:space="preserve">satellite at a much lower acceleration while accounting for the whole installed system. No universal CubeSat quasi-static acceleration qualification is assumed; the launch provider and payload-specific limits must govern a real design [2,8].</w:t>
       </w:r>
     </w:p>
-    <w:bookmarkEnd w:id="48"/>
-    <w:bookmarkStart w:id="49" w:name="research-gap"/>
+    <w:bookmarkEnd w:id="56"/>
+    <w:bookmarkStart w:id="57" w:name="research-gap"/>
     <w:p>
       <w:pPr>
         <w:pStyle w:val="Heading1"/>
@@ -1463,8 +1687,8 @@
         <w:t xml:space="preserve">The thesis addresses that gap by constructing a documented Gen5 reference configuration and testing its own claims against explicit comparisons. It also records when those tests weaken the concept. Physical viability remains a separate research gap: numerical model agreement cannot establish manufactured tolerances, actual force, payload cleanliness, cycle reliability or provider compatibility.</w:t>
       </w:r>
     </w:p>
-    <w:bookmarkEnd w:id="49"/>
-    <w:bookmarkStart w:id="50" w:name="objectives-and-outcome"/>
+    <w:bookmarkEnd w:id="57"/>
+    <w:bookmarkStart w:id="58" w:name="objectives-and-outcome"/>
     <w:p>
       <w:pPr>
         <w:pStyle w:val="Heading1"/>
@@ -1726,8 +1950,8 @@
         <w:t xml:space="preserve">These objectives summarize the completed analytical research for this final-review presentation. They are a presentation synthesis, not a claim that the university approved this exact list in advance. The physical development tasks are shown later under future work.</w:t>
       </w:r>
     </w:p>
-    <w:bookmarkEnd w:id="50"/>
-    <w:bookmarkStart w:id="58" w:name="research-methodology"/>
+    <w:bookmarkEnd w:id="58"/>
+    <w:bookmarkStart w:id="66" w:name="research-methodology"/>
     <w:p>
       <w:pPr>
         <w:pStyle w:val="Heading1"/>
@@ -1885,18 +2109,18 @@
           <wp:inline>
             <wp:extent cx="5334000" cy="2028422"/>
             <wp:effectExtent b="0" l="0" r="0" t="0"/>
-            <wp:docPr descr="Historical modeled shot: velocity, bank voltage and current." title="" id="52" name="Picture"/>
+            <wp:docPr descr="Historical modeled shot: velocity, bank voltage and current." title="" id="60" name="Picture"/>
             <a:graphic>
               <a:graphicData uri="http://schemas.openxmlformats.org/drawingml/2006/picture">
                 <pic:pic>
                   <pic:nvPicPr>
-                    <pic:cNvPr descr="../../source/figures/F01_shot.png" id="53" name="Picture"/>
+                    <pic:cNvPr descr="../../source/figures/F01_shot.png" id="61" name="Picture"/>
                     <pic:cNvPicPr>
                       <a:picLocks noChangeArrowheads="1" noChangeAspect="1"/>
                     </pic:cNvPicPr>
                   </pic:nvPicPr>
                   <pic:blipFill>
-                    <a:blip r:embed="rId51"/>
+                    <a:blip r:embed="rId59"/>
                     <a:stretch>
                       <a:fillRect/>
                     </a:stretch>
@@ -1931,7 +2155,7 @@
         <w:t xml:space="preserve">Historical modeled shot: velocity, bank voltage and current.</w:t>
       </w:r>
     </w:p>
-    <w:bookmarkStart w:id="57" w:name="numerical-checks-and-their-limits"/>
+    <w:bookmarkStart w:id="65" w:name="numerical-checks-and-their-limits"/>
     <w:p>
       <w:pPr>
         <w:pStyle w:val="Heading2"/>
@@ -1957,18 +2181,18 @@
           <wp:inline>
             <wp:extent cx="4427220" cy="1990820"/>
             <wp:effectExtent b="0" l="0" r="0" t="0"/>
-            <wp:docPr descr="Representative magnetic-field model output. Source: thesis figure A02." title="" id="55" name="Picture"/>
+            <wp:docPr descr="Representative magnetic-field model output. Source: thesis figure A02." title="" id="63" name="Picture"/>
             <a:graphic>
               <a:graphicData uri="http://schemas.openxmlformats.org/drawingml/2006/picture">
                 <pic:pic>
                   <pic:nvPicPr>
-                    <pic:cNvPr descr="../../source/figures/A02_field_map.png" id="56" name="Picture"/>
+                    <pic:cNvPr descr="../../source/figures/A02_field_map.png" id="64" name="Picture"/>
                     <pic:cNvPicPr>
                       <a:picLocks noChangeArrowheads="1" noChangeAspect="1"/>
                     </pic:cNvPicPr>
                   </pic:nvPicPr>
                   <pic:blipFill>
-                    <a:blip r:embed="rId54"/>
+                    <a:blip r:embed="rId62"/>
                     <a:stretch>
                       <a:fillRect/>
                     </a:stretch>
@@ -2003,9 +2227,9 @@
         <w:t xml:space="preserve">Representative magnetic-field model output. Source: thesis figure A02.</w:t>
       </w:r>
     </w:p>
-    <w:bookmarkEnd w:id="57"/>
-    <w:bookmarkEnd w:id="58"/>
-    <w:bookmarkStart w:id="60" w:name="timeline"/>
+    <w:bookmarkEnd w:id="65"/>
+    <w:bookmarkEnd w:id="66"/>
+    <w:bookmarkStart w:id="68" w:name="timeline"/>
     <w:p>
       <w:pPr>
         <w:pStyle w:val="Heading1"/>
@@ -2014,7 +2238,7 @@
         <w:t xml:space="preserve">6. Timeline</w:t>
       </w:r>
     </w:p>
-    <w:bookmarkStart w:id="59" w:name="documented-evolution"/>
+    <w:bookmarkStart w:id="67" w:name="documented-evolution"/>
     <w:p>
       <w:pPr>
         <w:pStyle w:val="Heading2"/>
@@ -2276,9 +2500,9 @@
         <w:t xml:space="preserve">The thesis repository’s reconstructed history expressly marks several early milestone dates as approximate. The analytical baseline was revised as evidence improved: a CAD-derived sled mass displaced a lighter parametric estimate; a depth-resolved thrust calculation lowered the rated speed; an enclosure buildup exposed the 3U mass penalty; and an independent orbit check rejected an overbroad solar-invariance claim. These revisions are part of the completed study, not signs that the final numbers are placeholders. Gen6 research gates are described only in §10, Future work.</w:t>
       </w:r>
     </w:p>
-    <w:bookmarkEnd w:id="59"/>
-    <w:bookmarkEnd w:id="60"/>
-    <w:bookmarkStart w:id="61" w:name="work-progress"/>
+    <w:bookmarkEnd w:id="67"/>
+    <w:bookmarkEnd w:id="68"/>
+    <w:bookmarkStart w:id="69" w:name="work-progress"/>
     <w:p>
       <w:pPr>
         <w:pStyle w:val="Heading1"/>
@@ -2303,8 +2527,8 @@
         <w:t xml:space="preserve">The deliverable here is a completed computational thesis, not a flight article. The later long gas-guide and independent spring-cell studies are historical comparators. Gen6 has a mission direction and investigation envelope but is not a result of the Gen5 thesis. Its mechanism and exact payload/provider cases remain future choices.</w:t>
       </w:r>
     </w:p>
-    <w:bookmarkEnd w:id="61"/>
-    <w:bookmarkStart w:id="87" w:name="results"/>
+    <w:bookmarkEnd w:id="69"/>
+    <w:bookmarkStart w:id="95" w:name="results"/>
     <w:p>
       <w:pPr>
         <w:pStyle w:val="Heading1"/>
@@ -2313,7 +2537,7 @@
         <w:t xml:space="preserve">8. Results</w:t>
       </w:r>
     </w:p>
-    <w:bookmarkStart w:id="62" w:name="gen5-configuration"/>
+    <w:bookmarkStart w:id="70" w:name="gen5-configuration"/>
     <w:p>
       <w:pPr>
         <w:pStyle w:val="Heading2"/>
@@ -2346,8 +2570,8 @@
         <w:t xml:space="preserve">sled input comes from historical Gen3 CAD solid volumes; this value reduced the exit speed relative to an earlier optimistic parametric estimate. The CAD render conveys a concept, not manufactured or assembled hardware.</w:t>
       </w:r>
     </w:p>
-    <w:bookmarkEnd w:id="62"/>
-    <w:bookmarkStart w:id="64" w:name="rated-3u-shot"/>
+    <w:bookmarkEnd w:id="70"/>
+    <w:bookmarkStart w:id="72" w:name="rated-3u-shot"/>
     <w:p>
       <w:pPr>
         <w:pStyle w:val="Heading2"/>
@@ -2725,7 +2949,7 @@
       <w:r>
         <w:t xml:space="preserve"> </w:t>
       </w:r>
-      <w:hyperlink r:id="rId63">
+      <w:hyperlink r:id="rId71">
         <w:r>
           <w:rPr>
             <w:rStyle w:val="Hyperlink"/>
@@ -2737,27 +2961,27 @@
         <w:t xml:space="preserve"> </w:t>
       </w:r>
       <w:r>
-        <w:t xml:space="preserve">separately checks the reported mass and energy identities and finds</w:t>
-      </w:r>
-      <w:r>
-        <w:t xml:space="preserve"> </w:t>
-      </w:r>
-      <w:r>
-        <w:rPr>
-          <w:b/>
-          <w:bCs/>
-        </w:rPr>
-        <w:t xml:space="preserve">124.488 J (4.47%) of gross draw unitemized</w:t>
-      </w:r>
-      <w:r>
-        <w:t xml:space="preserve"> </w:t>
-      </w:r>
-      <w:r>
-        <w:t xml:space="preserve">after the reported kinetic, copper and bank-ESR terms. That is an accounting gap, not proof of a specific additional loss. Full electrical closure and an installed bank are still open.</w:t>
-      </w:r>
-    </w:p>
-    <w:bookmarkEnd w:id="64"/>
-    <w:bookmarkStart w:id="68" w:name="command-precision"/>
+        <w:t xml:space="preserve">separately checks the reported mass and energy identities and reconciles the historical</w:t>
+      </w:r>
+      <w:r>
+        <w:t xml:space="preserve"> </w:t>
+      </w:r>
+      <w:r>
+        <w:rPr>
+          <w:b/>
+          <w:bCs/>
+        </w:rPr>
+        <w:t xml:space="preserve">124.488 J (4.47%) compact-output remainder</w:t>
+      </w:r>
+      <w:r>
+        <w:t xml:space="preserve"> </w:t>
+      </w:r>
+      <w:r>
+        <w:t xml:space="preserve">to 90.964 J assumed converter loss, 32.460 J auxiliary draw and 1.064 J of forward-Euler step excess, with a rounded residual below 0.001 J. This closes historical model arithmetic only. Selected hardware, switching and installed power verification remain open.</w:t>
+      </w:r>
+    </w:p>
+    <w:bookmarkEnd w:id="72"/>
+    <w:bookmarkStart w:id="76" w:name="command-precision"/>
     <w:p>
       <w:pPr>
         <w:pStyle w:val="Heading2"/>
@@ -2830,18 +3054,18 @@
           <wp:inline>
             <wp:extent cx="3886964" cy="2792131"/>
             <wp:effectExtent b="0" l="0" r="0" t="0"/>
-            <wp:docPr descr="Closed-loop simulation distribution at the fleet setpoint." title="" id="66" name="Picture"/>
+            <wp:docPr descr="Closed-loop simulation distribution at the fleet setpoint." title="" id="74" name="Picture"/>
             <a:graphic>
               <a:graphicData uri="http://schemas.openxmlformats.org/drawingml/2006/picture">
                 <pic:pic>
                   <pic:nvPicPr>
-                    <pic:cNvPr descr="../../source/figures/F03_mc.png" id="67" name="Picture"/>
+                    <pic:cNvPr descr="../../source/figures/F03_mc.png" id="75" name="Picture"/>
                     <pic:cNvPicPr>
                       <a:picLocks noChangeArrowheads="1" noChangeAspect="1"/>
                     </pic:cNvPicPr>
                   </pic:nvPicPr>
                   <pic:blipFill>
-                    <a:blip r:embed="rId65"/>
+                    <a:blip r:embed="rId73"/>
                     <a:stretch>
                       <a:fillRect/>
                     </a:stretch>
@@ -2876,8 +3100,8 @@
         <w:t xml:space="preserve">Closed-loop simulation distribution at the fleet setpoint.</w:t>
       </w:r>
     </w:p>
-    <w:bookmarkEnd w:id="68"/>
-    <w:bookmarkStart w:id="75" w:name="orbital-utility"/>
+    <w:bookmarkEnd w:id="76"/>
+    <w:bookmarkStart w:id="83" w:name="orbital-utility"/>
     <w:p>
       <w:pPr>
         <w:pStyle w:val="Heading2"/>
@@ -2948,18 +3172,18 @@
           <wp:inline>
             <wp:extent cx="4907280" cy="2473613"/>
             <wp:effectExtent b="0" l="0" r="0" t="0"/>
-            <wp:docPr descr="Independent rated-state two-body orbit check. The lifetime claim is outside its scope." title="" id="70" name="Picture"/>
+            <wp:docPr descr="Independent rated-state two-body orbit check. The lifetime claim is outside its scope." title="" id="78" name="Picture"/>
             <a:graphic>
               <a:graphicData uri="http://schemas.openxmlformats.org/drawingml/2006/picture">
                 <pic:pic>
                   <pic:nvPicPr>
-                    <pic:cNvPr descr="../../figures/rated_orbit_crosscheck.png" id="71" name="Picture"/>
+                    <pic:cNvPr descr="../../figures/rated_orbit_crosscheck.png" id="79" name="Picture"/>
                     <pic:cNvPicPr>
                       <a:picLocks noChangeArrowheads="1" noChangeAspect="1"/>
                     </pic:cNvPicPr>
                   </pic:nvPicPr>
                   <pic:blipFill>
-                    <a:blip r:embed="rId69"/>
+                    <a:blip r:embed="rId77"/>
                     <a:stretch>
                       <a:fillRect/>
                     </a:stretch>
@@ -3003,18 +3227,18 @@
           <wp:inline>
             <wp:extent cx="4382391" cy="2697327"/>
             <wp:effectExtent b="0" l="0" r="0" t="0"/>
-            <wp:docPr descr="Modelled orbital-lifetime response. Absolute values depend on atmosphere." title="" id="73" name="Picture"/>
+            <wp:docPr descr="Modelled orbital-lifetime response. Absolute values depend on atmosphere." title="" id="81" name="Picture"/>
             <a:graphic>
               <a:graphicData uri="http://schemas.openxmlformats.org/drawingml/2006/picture">
                 <pic:pic>
                   <pic:nvPicPr>
-                    <pic:cNvPr descr="../../source/figures/F04_life.png" id="74" name="Picture"/>
+                    <pic:cNvPr descr="../../source/figures/F04_life.png" id="82" name="Picture"/>
                     <pic:cNvPicPr>
                       <a:picLocks noChangeArrowheads="1" noChangeAspect="1"/>
                     </pic:cNvPicPr>
                   </pic:nvPicPr>
                   <pic:blipFill>
-                    <a:blip r:embed="rId72"/>
+                    <a:blip r:embed="rId80"/>
                     <a:stretch>
                       <a:fillRect/>
                     </a:stretch>
@@ -3049,8 +3273,8 @@
         <w:t xml:space="preserve">Modelled orbital-lifetime response. Absolute values depend on atmosphere.</w:t>
       </w:r>
     </w:p>
-    <w:bookmarkEnd w:id="75"/>
-    <w:bookmarkStart w:id="79" w:name="installed-mass-changes-the-decision"/>
+    <w:bookmarkEnd w:id="83"/>
+    <w:bookmarkStart w:id="87" w:name="installed-mass-changes-the-decision"/>
     <w:p>
       <w:pPr>
         <w:pStyle w:val="Heading2"/>
@@ -3179,18 +3403,18 @@
           <wp:inline>
             <wp:extent cx="5334000" cy="1915167"/>
             <wp:effectExtent b="0" l="0" r="0" t="0"/>
-            <wp:docPr descr="Constraint and mass-attribution analysis; mass is a model rollup." title="" id="77" name="Picture"/>
+            <wp:docPr descr="Constraint and mass-attribution analysis; mass is a model rollup." title="" id="85" name="Picture"/>
             <a:graphic>
               <a:graphicData uri="http://schemas.openxmlformats.org/drawingml/2006/picture">
                 <pic:pic>
                   <pic:nvPicPr>
-                    <pic:cNvPr descr="../../source/figures/A35_ledger.png" id="78" name="Picture"/>
+                    <pic:cNvPr descr="../../source/figures/A35_ledger.png" id="86" name="Picture"/>
                     <pic:cNvPicPr>
                       <a:picLocks noChangeArrowheads="1" noChangeAspect="1"/>
                     </pic:cNvPicPr>
                   </pic:nvPicPr>
                   <pic:blipFill>
-                    <a:blip r:embed="rId76"/>
+                    <a:blip r:embed="rId84"/>
                     <a:stretch>
                       <a:fillRect/>
                     </a:stretch>
@@ -3225,8 +3449,8 @@
         <w:t xml:space="preserve">Constraint and mass-attribution analysis; mass is a model rollup.</w:t>
       </w:r>
     </w:p>
-    <w:bookmarkEnd w:id="79"/>
-    <w:bookmarkStart w:id="85" w:name="native-cad-and-packaging-review"/>
+    <w:bookmarkEnd w:id="87"/>
+    <w:bookmarkStart w:id="93" w:name="native-cad-and-packaging-review"/>
     <w:p>
       <w:pPr>
         <w:pStyle w:val="Heading2"/>
@@ -3245,7 +3469,7 @@
       <w:r>
         <w:t xml:space="preserve"> </w:t>
       </w:r>
-      <w:hyperlink r:id="rId80">
+      <w:hyperlink r:id="rId88">
         <w:r>
           <w:rPr>
             <w:rStyle w:val="Hyperlink"/>
@@ -3262,7 +3486,7 @@
       <w:r>
         <w:t xml:space="preserve"> </w:t>
       </w:r>
-      <w:hyperlink r:id="rId81">
+      <w:hyperlink r:id="rId89">
         <w:r>
           <w:rPr>
             <w:rStyle w:val="Hyperlink"/>
@@ -3387,18 +3611,18 @@
           <wp:inline>
             <wp:extent cx="4907280" cy="6642781"/>
             <wp:effectExtent b="0" l="0" r="0" t="0"/>
-            <wp:docPr descr="Dimensioned side-fed reference cross-section; this configuration fails the width check." title="" id="83" name="Picture"/>
+            <wp:docPr descr="Dimensioned side-fed reference cross-section; this configuration fails the width check." title="" id="91" name="Picture"/>
             <a:graphic>
               <a:graphicData uri="http://schemas.openxmlformats.org/drawingml/2006/picture">
                 <pic:pic>
                   <pic:nvPicPr>
-                    <pic:cNvPr descr="../../figures/gen5_packaging_section.png" id="84" name="Picture"/>
+                    <pic:cNvPr descr="../../figures/gen5_packaging_section.png" id="92" name="Picture"/>
                     <pic:cNvPicPr>
                       <a:picLocks noChangeArrowheads="1" noChangeAspect="1"/>
                     </pic:cNvPicPr>
                   </pic:nvPicPr>
                   <pic:blipFill>
-                    <a:blip r:embed="rId82"/>
+                    <a:blip r:embed="rId90"/>
                     <a:stretch>
                       <a:fillRect/>
                     </a:stretch>
@@ -3433,8 +3657,8 @@
         <w:t xml:space="preserve">Dimensioned side-fed reference cross-section; this configuration fails the width check.</w:t>
       </w:r>
     </w:p>
-    <w:bookmarkEnd w:id="85"/>
-    <w:bookmarkStart w:id="86" w:name="decision-and-evidence-boundary"/>
+    <w:bookmarkEnd w:id="93"/>
+    <w:bookmarkStart w:id="94" w:name="decision-and-evidence-boundary"/>
     <w:p>
       <w:pPr>
         <w:pStyle w:val="Heading2"/>
@@ -3451,9 +3675,9 @@
         <w:t xml:space="preserve">The analytical result has four parts. The model supports a commandable release and conditional orbital-energy benefit; the full-system 3U mass criterion fails; the stated side-fed layout fails its CAD width check; and physical behavior remains unverified. The latter includes release-cycle reliability, shock and arrest loads transmitted to stowed satellites, field exposure near a customer payload, host attitude/control authority and provider approval. The known-problems register ranks several as potentially design-fatal. These findings limit product claims and define the research conclusion.</w:t>
       </w:r>
     </w:p>
-    <w:bookmarkEnd w:id="86"/>
-    <w:bookmarkEnd w:id="87"/>
-    <w:bookmarkStart w:id="88" w:name="conclusion"/>
+    <w:bookmarkEnd w:id="94"/>
+    <w:bookmarkEnd w:id="95"/>
+    <w:bookmarkStart w:id="96" w:name="conclusion"/>
     <w:p>
       <w:pPr>
         <w:pStyle w:val="Heading1"/>
@@ -3478,8 +3702,8 @@
         <w:t xml:space="preserve">The thesis’s strongest engineering contribution is the transparent decision record: the full machine was modelled, independent numerical checks corrected several claims, and an unfavourable mass result was retained. That closes the Gen5 study and provides a defensible input to a separate future architecture trade.</w:t>
       </w:r>
     </w:p>
-    <w:bookmarkEnd w:id="88"/>
-    <w:bookmarkStart w:id="89" w:name="future-work"/>
+    <w:bookmarkEnd w:id="96"/>
+    <w:bookmarkStart w:id="97" w:name="future-work"/>
     <w:p>
       <w:pPr>
         <w:pStyle w:val="Heading1"/>
@@ -3504,8 +3728,8 @@
         <w:t xml:space="preserve">The near-term milestone is one named test-article configuration that can be independently reviewed. Its package needs controlled geometry and drawings, a bill of materials, host and payload interfaces, full installed mass/energy/thermal accounting, assembly and inspection instructions, instrumented procedures, predetermined pass/fail and stop criteria, uncertainty and model-credibility evidence, retained failures, and an explicit build/test release decision. A rejected candidate is a valid research outcome; it must not be presented as a build-ready survivor.</w:t>
       </w:r>
     </w:p>
-    <w:bookmarkEnd w:id="89"/>
-    <w:bookmarkStart w:id="90" w:name="references-and-project-records"/>
+    <w:bookmarkEnd w:id="97"/>
+    <w:bookmarkStart w:id="98" w:name="references-and-project-records"/>
     <w:p>
       <w:pPr>
         <w:pStyle w:val="Heading1"/>
@@ -3900,7 +4124,7 @@
         <w:t xml:space="preserve">, controlled working baseline, 29 September 2026. Project plan, not achieved performance.</w:t>
       </w:r>
     </w:p>
-    <w:bookmarkEnd w:id="90"/>
+    <w:bookmarkEnd w:id="98"/>
     <w:sectPr/>
   </w:body>
 </w:document>

</xml_diff>

<commit_message>
Update college review pack with 3-D force cross-check
</commit_message>
<xml_diff>
--- a/university/final_review_2026_10_10/PANEL_HANDBOOK.docx
+++ b/university/final_review_2026_10_10/PANEL_HANDBOOK.docx
@@ -530,7 +530,7 @@
       </w:r>
     </w:p>
     <w:bookmarkEnd w:id="23"/>
-    <w:bookmarkStart w:id="44" w:name="X6be4c09543f80416e16a1bdcc406a9e300f8f3f"/>
+    <w:bookmarkStart w:id="49" w:name="X6be4c09543f80416e16a1bdcc406a9e300f8f3f"/>
     <w:p>
       <w:pPr>
         <w:pStyle w:val="Heading1"/>
@@ -772,6 +772,145 @@
         <w:pStyle w:val="BodyText"/>
       </w:pPr>
       <w:r>
+        <w:t xml:space="preserve">A separate</w:t>
+      </w:r>
+      <w:r>
+        <w:t xml:space="preserve"> </w:t>
+      </w:r>
+      <w:r>
+        <w:rPr>
+          <w:b/>
+          <w:bCs/>
+        </w:rPr>
+        <w:t xml:space="preserve">depth-resolved 3-D numerical surface-charge implementation</w:t>
+      </w:r>
+      <w:r>
+        <w:t xml:space="preserve"> </w:t>
+      </w:r>
+      <w:r>
+        <w:t xml:space="preserve">integrates the full 90 mm magnet depth and all 162 stator belts. It independently returns</w:t>
+      </w:r>
+      <w:r>
+        <w:t xml:space="preserve"> </w:t>
+      </w:r>
+      <w:r>
+        <w:rPr>
+          <w:b/>
+          <w:bCs/>
+        </w:rPr>
+        <w:t xml:space="preserve">1.042 kJ ideal work</w:t>
+      </w:r>
+      <w:r>
+        <w:t xml:space="preserve">, matching P118 under shared geometry, remanence and ideal-phase assumptions. Face quadrature refinement from 16 to 24 nodes changes work by 0.00002%; halving the station spacing changes work by 0.096%. This checks the numerical formulation, not a selected motor or physical thrust. An illustrative 14 mm face gap gives</w:t>
+      </w:r>
+      <w:r>
+        <w:t xml:space="preserve"> </w:t>
+      </w:r>
+      <w:r>
+        <w:rPr>
+          <w:b/>
+          <w:bCs/>
+        </w:rPr>
+        <w:t xml:space="preserve">0.907 kJ</w:t>
+      </w:r>
+      <w:r>
+        <w:t xml:space="preserve"> </w:t>
+      </w:r>
+      <w:r>
+        <w:t xml:space="preserve">rather than 1.042 kJ at 12 mm, a 13.0% ideal-work reduction. A 10 mm copper-depth offset gives 0.961 kJ. These are deterministic sensitivity cases, not tolerance specifications. See</w:t>
+      </w:r>
+      <w:r>
+        <w:t xml:space="preserve"> </w:t>
+      </w:r>
+      <w:hyperlink r:id="rId32">
+        <w:r>
+          <w:rPr>
+            <w:rStyle w:val="Hyperlink"/>
+          </w:rPr>
+          <w:t xml:space="preserve">P121</w:t>
+        </w:r>
+      </w:hyperlink>
+      <w:r>
+        <w:t xml:space="preserve"> </w:t>
+      </w:r>
+      <w:r>
+        <w:t xml:space="preserve">and</w:t>
+      </w:r>
+      <w:r>
+        <w:t xml:space="preserve"> </w:t>
+      </w:r>
+      <w:hyperlink r:id="rId33">
+        <w:r>
+          <w:rPr>
+            <w:rStyle w:val="Hyperlink"/>
+          </w:rPr>
+          <w:t xml:space="preserve">P122</w:t>
+        </w:r>
+      </w:hyperlink>
+      <w:r>
+        <w:t xml:space="preserve">.</w:t>
+      </w:r>
+    </w:p>
+    <w:p>
+      <w:pPr>
+        <w:pStyle w:val="CaptionedFigure"/>
+      </w:pPr>
+      <w:r>
+        <w:drawing>
+          <wp:inline>
+            <wp:extent cx="5120640" cy="2048256"/>
+            <wp:effectExtent b="0" l="0" r="0" t="0"/>
+            <wp:docPr descr="Ideal gap/depth sensitivity; scenarios rather than measured tolerances." title="" id="35" name="Picture"/>
+            <a:graphic>
+              <a:graphicData uri="http://schemas.openxmlformats.org/drawingml/2006/picture">
+                <pic:pic>
+                  <pic:nvPicPr>
+                    <pic:cNvPr descr="../../figures/gen5_finite_force_sensitivity.png" id="36" name="Picture"/>
+                    <pic:cNvPicPr>
+                      <a:picLocks noChangeArrowheads="1" noChangeAspect="1"/>
+                    </pic:cNvPicPr>
+                  </pic:nvPicPr>
+                  <pic:blipFill>
+                    <a:blip r:embed="rId34"/>
+                    <a:stretch>
+                      <a:fillRect/>
+                    </a:stretch>
+                  </pic:blipFill>
+                  <pic:spPr bwMode="auto">
+                    <a:xfrm>
+                      <a:off x="0" y="0"/>
+                      <a:ext cx="5120640" cy="2048256"/>
+                    </a:xfrm>
+                    <a:prstGeom prst="rect">
+                      <a:avLst/>
+                    </a:prstGeom>
+                    <a:noFill/>
+                    <a:ln w="9525">
+                      <a:noFill/>
+                      <a:headEnd/>
+                      <a:tailEnd/>
+                    </a:ln>
+                  </pic:spPr>
+                </pic:pic>
+              </a:graphicData>
+            </a:graphic>
+          </wp:inline>
+        </w:drawing>
+      </w:r>
+    </w:p>
+    <w:p>
+      <w:pPr>
+        <w:pStyle w:val="ImageCaption"/>
+      </w:pPr>
+      <w:r>
+        <w:t xml:space="preserve">Ideal gap/depth sensitivity; scenarios rather than measured tolerances.</w:t>
+      </w:r>
+    </w:p>
+    <w:p>
+      <w:pPr>
+        <w:pStyle w:val="BodyText"/>
+      </w:pPr>
+      <w:r>
         <w:t xml:space="preserve">A</w:t>
       </w:r>
       <w:r>
@@ -809,7 +948,7 @@
       <w:r>
         <w:t xml:space="preserve"> </w:t>
       </w:r>
-      <w:hyperlink r:id="rId32">
+      <w:hyperlink r:id="rId37">
         <w:r>
           <w:rPr>
             <w:rStyle w:val="Hyperlink"/>
@@ -833,18 +972,18 @@
           <wp:inline>
             <wp:extent cx="5120640" cy="3607723"/>
             <wp:effectExtent b="0" l="0" r="0" t="0"/>
-            <wp:docPr descr="Finite-force speed and assumed bank energy histories." title="" id="34" name="Picture"/>
+            <wp:docPr descr="Finite-force speed and assumed bank energy histories." title="" id="39" name="Picture"/>
             <a:graphic>
               <a:graphicData uri="http://schemas.openxmlformats.org/drawingml/2006/picture">
                 <pic:pic>
                   <pic:nvPicPr>
-                    <pic:cNvPr descr="../../figures/gen5_finite_coupled_shot.png" id="35" name="Picture"/>
+                    <pic:cNvPr descr="../../figures/gen5_finite_coupled_shot.png" id="40" name="Picture"/>
                     <pic:cNvPicPr>
                       <a:picLocks noChangeArrowheads="1" noChangeAspect="1"/>
                     </pic:cNvPicPr>
                   </pic:nvPicPr>
                   <pic:blipFill>
-                    <a:blip r:embed="rId33"/>
+                    <a:blip r:embed="rId38"/>
                     <a:stretch>
                       <a:fillRect/>
                     </a:stretch>
@@ -905,7 +1044,7 @@
       <w:r>
         <w:t xml:space="preserve"> </w:t>
       </w:r>
-      <w:hyperlink r:id="rId36">
+      <w:hyperlink r:id="rId41">
         <w:r>
           <w:rPr>
             <w:rStyle w:val="Hyperlink"/>
@@ -926,18 +1065,18 @@
           <wp:inline>
             <wp:extent cx="4800600" cy="3382240"/>
             <wp:effectExtent b="0" l="0" r="0" t="0"/>
-            <wp:docPr descr="R1 candidate section; geometry drawing, not a qualified mechanism." title="" id="38" name="Picture"/>
+            <wp:docPr descr="R1 candidate section; geometry drawing, not a qualified mechanism." title="" id="43" name="Picture"/>
             <a:graphic>
               <a:graphicData uri="http://schemas.openxmlformats.org/drawingml/2006/picture">
                 <pic:pic>
                   <pic:nvPicPr>
-                    <pic:cNvPr descr="../../figures/gen5_feeder_candidate_r1.png" id="39" name="Picture"/>
+                    <pic:cNvPr descr="../../figures/gen5_feeder_candidate_r1.png" id="44" name="Picture"/>
                     <pic:cNvPicPr>
                       <a:picLocks noChangeArrowheads="1" noChangeAspect="1"/>
                     </pic:cNvPicPr>
                   </pic:nvPicPr>
                   <pic:blipFill>
-                    <a:blip r:embed="rId37"/>
+                    <a:blip r:embed="rId42"/>
                     <a:stretch>
                       <a:fillRect/>
                     </a:stretch>
@@ -1011,7 +1150,7 @@
       <w:r>
         <w:t xml:space="preserve"> </w:t>
       </w:r>
-      <w:hyperlink r:id="rId40">
+      <w:hyperlink r:id="rId45">
         <w:r>
           <w:rPr>
             <w:rStyle w:val="Hyperlink"/>
@@ -1032,18 +1171,18 @@
           <wp:inline>
             <wp:extent cx="5120640" cy="2150668"/>
             <wp:effectExtent b="0" l="0" r="0" t="0"/>
-            <wp:docPr descr="Matched reference results; assumed host and device classes." title="" id="42" name="Picture"/>
+            <wp:docPr descr="Matched reference results; assumed host and device classes." title="" id="47" name="Picture"/>
             <a:graphic>
               <a:graphicData uri="http://schemas.openxmlformats.org/drawingml/2006/picture">
                 <pic:pic>
                   <pic:nvPicPr>
-                    <pic:cNvPr descr="../../figures/matched_mission_reference.png" id="43" name="Picture"/>
+                    <pic:cNvPr descr="../../figures/matched_mission_reference.png" id="48" name="Picture"/>
                     <pic:cNvPicPr>
                       <a:picLocks noChangeArrowheads="1" noChangeAspect="1"/>
                     </pic:cNvPicPr>
                   </pic:nvPicPr>
                   <pic:blipFill>
-                    <a:blip r:embed="rId41"/>
+                    <a:blip r:embed="rId46"/>
                     <a:stretch>
                       <a:fillRect/>
                     </a:stretch>
@@ -1078,8 +1217,8 @@
         <w:t xml:space="preserve">Matched reference results; assumed host and device classes.</w:t>
       </w:r>
     </w:p>
-    <w:bookmarkEnd w:id="44"/>
-    <w:bookmarkStart w:id="55" w:name="introduction"/>
+    <w:bookmarkEnd w:id="49"/>
+    <w:bookmarkStart w:id="60" w:name="introduction"/>
     <w:p>
       <w:pPr>
         <w:pStyle w:val="Heading1"/>
@@ -1088,7 +1227,7 @@
         <w:t xml:space="preserve">1. Introduction</w:t>
       </w:r>
     </w:p>
-    <w:bookmarkStart w:id="45" w:name="the-deployment-problem"/>
+    <w:bookmarkStart w:id="50" w:name="the-deployment-problem"/>
     <w:p>
       <w:pPr>
         <w:pStyle w:val="Heading2"/>
@@ -1153,8 +1292,8 @@
         <w:t xml:space="preserve">The host is an active participant in the mission model. After its primary mission, a suitable hosted platform would need attitude control, available resources and permission to operate. It could perform coarse orbital repositioning; VOLLEY would assign each secondary payload a local release state. No specific upper stage has been selected or approved for that role.</w:t>
       </w:r>
     </w:p>
-    <w:bookmarkEnd w:id="45"/>
-    <w:bookmarkStart w:id="54" w:name="buyer-and-spacecraft-fit"/>
+    <w:bookmarkEnd w:id="50"/>
+    <w:bookmarkStart w:id="59" w:name="buyer-and-spacecraft-fit"/>
     <w:p>
       <w:pPr>
         <w:pStyle w:val="Heading2"/>
@@ -1173,7 +1312,7 @@
       <w:r>
         <w:t xml:space="preserve"> </w:t>
       </w:r>
-      <w:hyperlink r:id="rId46">
+      <w:hyperlink r:id="rId51">
         <w:r>
           <w:rPr>
             <w:rStyle w:val="Hyperlink"/>
@@ -1190,7 +1329,7 @@
       <w:r>
         <w:t xml:space="preserve"> </w:t>
       </w:r>
-      <w:hyperlink r:id="rId47">
+      <w:hyperlink r:id="rId52">
         <w:r>
           <w:rPr>
             <w:rStyle w:val="Hyperlink"/>
@@ -1207,7 +1346,7 @@
       <w:r>
         <w:t xml:space="preserve"> </w:t>
       </w:r>
-      <w:hyperlink r:id="rId48">
+      <w:hyperlink r:id="rId53">
         <w:r>
           <w:rPr>
             <w:rStyle w:val="Hyperlink"/>
@@ -1224,7 +1363,7 @@
       <w:r>
         <w:t xml:space="preserve"> </w:t>
       </w:r>
-      <w:hyperlink r:id="rId49">
+      <w:hyperlink r:id="rId54">
         <w:r>
           <w:rPr>
             <w:rStyle w:val="Hyperlink"/>
@@ -1283,7 +1422,7 @@
       <w:r>
         <w:t xml:space="preserve"> </w:t>
       </w:r>
-      <w:hyperlink r:id="rId50">
+      <w:hyperlink r:id="rId55">
         <w:r>
           <w:rPr>
             <w:rStyle w:val="Hyperlink"/>
@@ -1307,18 +1446,18 @@
           <wp:inline>
             <wp:extent cx="5334000" cy="2669996"/>
             <wp:effectExtent b="0" l="0" r="0" t="0"/>
-            <wp:docPr descr="Gen5 layout and mission hardware elements. Diagram from the thesis analysis." title="" id="52" name="Picture"/>
+            <wp:docPr descr="Gen5 layout and mission hardware elements. Diagram from the thesis analysis." title="" id="57" name="Picture"/>
             <a:graphic>
               <a:graphicData uri="http://schemas.openxmlformats.org/drawingml/2006/picture">
                 <pic:pic>
                   <pic:nvPicPr>
-                    <pic:cNvPr descr="../../source/figures/D02_layout.png" id="53" name="Picture"/>
+                    <pic:cNvPr descr="../../source/figures/D02_layout.png" id="58" name="Picture"/>
                     <pic:cNvPicPr>
                       <a:picLocks noChangeArrowheads="1" noChangeAspect="1"/>
                     </pic:cNvPicPr>
                   </pic:nvPicPr>
                   <pic:blipFill>
-                    <a:blip r:embed="rId51"/>
+                    <a:blip r:embed="rId56"/>
                     <a:stretch>
                       <a:fillRect/>
                     </a:stretch>
@@ -1353,9 +1492,9 @@
         <w:t xml:space="preserve">Gen5 layout and mission hardware elements. Diagram from the thesis analysis.</w:t>
       </w:r>
     </w:p>
-    <w:bookmarkEnd w:id="54"/>
-    <w:bookmarkEnd w:id="55"/>
-    <w:bookmarkStart w:id="56" w:name="literature-review"/>
+    <w:bookmarkEnd w:id="59"/>
+    <w:bookmarkEnd w:id="60"/>
+    <w:bookmarkStart w:id="61" w:name="literature-review"/>
     <w:p>
       <w:pPr>
         <w:pStyle w:val="Heading1"/>
@@ -1643,8 +1782,8 @@
         <w:t xml:space="preserve">satellite at a much lower acceleration while accounting for the whole installed system. No universal CubeSat quasi-static acceleration qualification is assumed; the launch provider and payload-specific limits must govern a real design [2,8].</w:t>
       </w:r>
     </w:p>
-    <w:bookmarkEnd w:id="56"/>
-    <w:bookmarkStart w:id="57" w:name="research-gap"/>
+    <w:bookmarkEnd w:id="61"/>
+    <w:bookmarkStart w:id="62" w:name="research-gap"/>
     <w:p>
       <w:pPr>
         <w:pStyle w:val="Heading1"/>
@@ -1687,8 +1826,8 @@
         <w:t xml:space="preserve">The thesis addresses that gap by constructing a documented Gen5 reference configuration and testing its own claims against explicit comparisons. It also records when those tests weaken the concept. Physical viability remains a separate research gap: numerical model agreement cannot establish manufactured tolerances, actual force, payload cleanliness, cycle reliability or provider compatibility.</w:t>
       </w:r>
     </w:p>
-    <w:bookmarkEnd w:id="57"/>
-    <w:bookmarkStart w:id="58" w:name="objectives-and-outcome"/>
+    <w:bookmarkEnd w:id="62"/>
+    <w:bookmarkStart w:id="63" w:name="objectives-and-outcome"/>
     <w:p>
       <w:pPr>
         <w:pStyle w:val="Heading1"/>
@@ -1950,8 +2089,8 @@
         <w:t xml:space="preserve">These objectives summarize the completed analytical research for this final-review presentation. They are a presentation synthesis, not a claim that the university approved this exact list in advance. The physical development tasks are shown later under future work.</w:t>
       </w:r>
     </w:p>
-    <w:bookmarkEnd w:id="58"/>
-    <w:bookmarkStart w:id="66" w:name="research-methodology"/>
+    <w:bookmarkEnd w:id="63"/>
+    <w:bookmarkStart w:id="71" w:name="research-methodology"/>
     <w:p>
       <w:pPr>
         <w:pStyle w:val="Heading1"/>
@@ -2109,18 +2248,18 @@
           <wp:inline>
             <wp:extent cx="5334000" cy="2028422"/>
             <wp:effectExtent b="0" l="0" r="0" t="0"/>
-            <wp:docPr descr="Historical modeled shot: velocity, bank voltage and current." title="" id="60" name="Picture"/>
+            <wp:docPr descr="Historical modeled shot: velocity, bank voltage and current." title="" id="65" name="Picture"/>
             <a:graphic>
               <a:graphicData uri="http://schemas.openxmlformats.org/drawingml/2006/picture">
                 <pic:pic>
                   <pic:nvPicPr>
-                    <pic:cNvPr descr="../../source/figures/F01_shot.png" id="61" name="Picture"/>
+                    <pic:cNvPr descr="../../source/figures/F01_shot.png" id="66" name="Picture"/>
                     <pic:cNvPicPr>
                       <a:picLocks noChangeArrowheads="1" noChangeAspect="1"/>
                     </pic:cNvPicPr>
                   </pic:nvPicPr>
                   <pic:blipFill>
-                    <a:blip r:embed="rId59"/>
+                    <a:blip r:embed="rId64"/>
                     <a:stretch>
                       <a:fillRect/>
                     </a:stretch>
@@ -2155,7 +2294,7 @@
         <w:t xml:space="preserve">Historical modeled shot: velocity, bank voltage and current.</w:t>
       </w:r>
     </w:p>
-    <w:bookmarkStart w:id="65" w:name="numerical-checks-and-their-limits"/>
+    <w:bookmarkStart w:id="70" w:name="numerical-checks-and-their-limits"/>
     <w:p>
       <w:pPr>
         <w:pStyle w:val="Heading2"/>
@@ -2169,7 +2308,7 @@
         <w:pStyle w:val="FirstParagraph"/>
       </w:pPr>
       <w:r>
-        <w:t xml:space="preserve">The magnetic field was compared across an analytical representation, magpylib, and 2-D/3-D finite-element calculations. A 3-D midgap solve supports the field model at its tested location but does not independently measure the depth-integrated thrust constant. Shot and circuit predictions were compared with ngspice at stated assumptions. Structural calculations use CalculiX; airflow calculations use OpenFOAM. Orbital calculations include Cowell and GMAT cases. The independent orbit work rejected an earlier assertion that lifetime benefit was invariant across solar activity. Each check applies to its declared case and boundary conditions; none is a hardware test.</w:t>
+        <w:t xml:space="preserve">The magnetic field was compared across an analytical representation, magpylib, and 2-D/3-D finite-element calculations. A 3-D midgap FEM solve supports the field model at its tested location; P121 separately checks the ideal depth-integrated thrust by numerical surface-charge integration. Neither is a motor measurement. Shot and circuit predictions were compared with ngspice at stated assumptions. Structural calculations use CalculiX; airflow calculations use OpenFOAM. Orbital calculations include Cowell and GMAT cases. The independent orbit work rejected an earlier assertion that lifetime benefit was invariant across solar activity. Each check applies to its declared case and boundary conditions; none is a hardware test.</w:t>
       </w:r>
     </w:p>
     <w:p>
@@ -2181,18 +2320,18 @@
           <wp:inline>
             <wp:extent cx="4427220" cy="1990820"/>
             <wp:effectExtent b="0" l="0" r="0" t="0"/>
-            <wp:docPr descr="Representative magnetic-field model output. Source: thesis figure A02." title="" id="63" name="Picture"/>
+            <wp:docPr descr="Representative magnetic-field model output. Source: thesis figure A02." title="" id="68" name="Picture"/>
             <a:graphic>
               <a:graphicData uri="http://schemas.openxmlformats.org/drawingml/2006/picture">
                 <pic:pic>
                   <pic:nvPicPr>
-                    <pic:cNvPr descr="../../source/figures/A02_field_map.png" id="64" name="Picture"/>
+                    <pic:cNvPr descr="../../source/figures/A02_field_map.png" id="69" name="Picture"/>
                     <pic:cNvPicPr>
                       <a:picLocks noChangeArrowheads="1" noChangeAspect="1"/>
                     </pic:cNvPicPr>
                   </pic:nvPicPr>
                   <pic:blipFill>
-                    <a:blip r:embed="rId62"/>
+                    <a:blip r:embed="rId67"/>
                     <a:stretch>
                       <a:fillRect/>
                     </a:stretch>
@@ -2227,9 +2366,9 @@
         <w:t xml:space="preserve">Representative magnetic-field model output. Source: thesis figure A02.</w:t>
       </w:r>
     </w:p>
-    <w:bookmarkEnd w:id="65"/>
-    <w:bookmarkEnd w:id="66"/>
-    <w:bookmarkStart w:id="68" w:name="timeline"/>
+    <w:bookmarkEnd w:id="70"/>
+    <w:bookmarkEnd w:id="71"/>
+    <w:bookmarkStart w:id="73" w:name="timeline"/>
     <w:p>
       <w:pPr>
         <w:pStyle w:val="Heading1"/>
@@ -2238,7 +2377,7 @@
         <w:t xml:space="preserve">6. Timeline</w:t>
       </w:r>
     </w:p>
-    <w:bookmarkStart w:id="67" w:name="documented-evolution"/>
+    <w:bookmarkStart w:id="72" w:name="documented-evolution"/>
     <w:p>
       <w:pPr>
         <w:pStyle w:val="Heading2"/>
@@ -2500,9 +2639,9 @@
         <w:t xml:space="preserve">The thesis repository’s reconstructed history expressly marks several early milestone dates as approximate. The analytical baseline was revised as evidence improved: a CAD-derived sled mass displaced a lighter parametric estimate; a depth-resolved thrust calculation lowered the rated speed; an enclosure buildup exposed the 3U mass penalty; and an independent orbit check rejected an overbroad solar-invariance claim. These revisions are part of the completed study, not signs that the final numbers are placeholders. Gen6 research gates are described only in §10, Future work.</w:t>
       </w:r>
     </w:p>
-    <w:bookmarkEnd w:id="67"/>
-    <w:bookmarkEnd w:id="68"/>
-    <w:bookmarkStart w:id="69" w:name="work-progress"/>
+    <w:bookmarkEnd w:id="72"/>
+    <w:bookmarkEnd w:id="73"/>
+    <w:bookmarkStart w:id="74" w:name="work-progress"/>
     <w:p>
       <w:pPr>
         <w:pStyle w:val="Heading1"/>
@@ -2527,8 +2666,8 @@
         <w:t xml:space="preserve">The deliverable here is a completed computational thesis, not a flight article. The later long gas-guide and independent spring-cell studies are historical comparators. Gen6 has a mission direction and investigation envelope but is not a result of the Gen5 thesis. Its mechanism and exact payload/provider cases remain future choices.</w:t>
       </w:r>
     </w:p>
-    <w:bookmarkEnd w:id="69"/>
-    <w:bookmarkStart w:id="95" w:name="results"/>
+    <w:bookmarkEnd w:id="74"/>
+    <w:bookmarkStart w:id="100" w:name="results"/>
     <w:p>
       <w:pPr>
         <w:pStyle w:val="Heading1"/>
@@ -2537,7 +2676,7 @@
         <w:t xml:space="preserve">8. Results</w:t>
       </w:r>
     </w:p>
-    <w:bookmarkStart w:id="70" w:name="gen5-configuration"/>
+    <w:bookmarkStart w:id="75" w:name="gen5-configuration"/>
     <w:p>
       <w:pPr>
         <w:pStyle w:val="Heading2"/>
@@ -2570,8 +2709,8 @@
         <w:t xml:space="preserve">sled input comes from historical Gen3 CAD solid volumes; this value reduced the exit speed relative to an earlier optimistic parametric estimate. The CAD render conveys a concept, not manufactured or assembled hardware.</w:t>
       </w:r>
     </w:p>
-    <w:bookmarkEnd w:id="70"/>
-    <w:bookmarkStart w:id="72" w:name="rated-3u-shot"/>
+    <w:bookmarkEnd w:id="75"/>
+    <w:bookmarkStart w:id="77" w:name="rated-3u-shot"/>
     <w:p>
       <w:pPr>
         <w:pStyle w:val="Heading2"/>
@@ -2949,7 +3088,7 @@
       <w:r>
         <w:t xml:space="preserve"> </w:t>
       </w:r>
-      <w:hyperlink r:id="rId71">
+      <w:hyperlink r:id="rId76">
         <w:r>
           <w:rPr>
             <w:rStyle w:val="Hyperlink"/>
@@ -2980,8 +3119,8 @@
         <w:t xml:space="preserve">to 90.964 J assumed converter loss, 32.460 J auxiliary draw and 1.064 J of forward-Euler step excess, with a rounded residual below 0.001 J. This closes historical model arithmetic only. Selected hardware, switching and installed power verification remain open.</w:t>
       </w:r>
     </w:p>
-    <w:bookmarkEnd w:id="72"/>
-    <w:bookmarkStart w:id="76" w:name="command-precision"/>
+    <w:bookmarkEnd w:id="77"/>
+    <w:bookmarkStart w:id="81" w:name="command-precision"/>
     <w:p>
       <w:pPr>
         <w:pStyle w:val="Heading2"/>
@@ -3054,18 +3193,18 @@
           <wp:inline>
             <wp:extent cx="3886964" cy="2792131"/>
             <wp:effectExtent b="0" l="0" r="0" t="0"/>
-            <wp:docPr descr="Closed-loop simulation distribution at the fleet setpoint." title="" id="74" name="Picture"/>
+            <wp:docPr descr="Closed-loop simulation distribution at the fleet setpoint." title="" id="79" name="Picture"/>
             <a:graphic>
               <a:graphicData uri="http://schemas.openxmlformats.org/drawingml/2006/picture">
                 <pic:pic>
                   <pic:nvPicPr>
-                    <pic:cNvPr descr="../../source/figures/F03_mc.png" id="75" name="Picture"/>
+                    <pic:cNvPr descr="../../source/figures/F03_mc.png" id="80" name="Picture"/>
                     <pic:cNvPicPr>
                       <a:picLocks noChangeArrowheads="1" noChangeAspect="1"/>
                     </pic:cNvPicPr>
                   </pic:nvPicPr>
                   <pic:blipFill>
-                    <a:blip r:embed="rId73"/>
+                    <a:blip r:embed="rId78"/>
                     <a:stretch>
                       <a:fillRect/>
                     </a:stretch>
@@ -3100,8 +3239,8 @@
         <w:t xml:space="preserve">Closed-loop simulation distribution at the fleet setpoint.</w:t>
       </w:r>
     </w:p>
-    <w:bookmarkEnd w:id="76"/>
-    <w:bookmarkStart w:id="83" w:name="orbital-utility"/>
+    <w:bookmarkEnd w:id="81"/>
+    <w:bookmarkStart w:id="88" w:name="orbital-utility"/>
     <w:p>
       <w:pPr>
         <w:pStyle w:val="Heading2"/>
@@ -3172,18 +3311,18 @@
           <wp:inline>
             <wp:extent cx="4907280" cy="2473613"/>
             <wp:effectExtent b="0" l="0" r="0" t="0"/>
-            <wp:docPr descr="Independent rated-state two-body orbit check. The lifetime claim is outside its scope." title="" id="78" name="Picture"/>
+            <wp:docPr descr="Independent rated-state two-body orbit check. The lifetime claim is outside its scope." title="" id="83" name="Picture"/>
             <a:graphic>
               <a:graphicData uri="http://schemas.openxmlformats.org/drawingml/2006/picture">
                 <pic:pic>
                   <pic:nvPicPr>
-                    <pic:cNvPr descr="../../figures/rated_orbit_crosscheck.png" id="79" name="Picture"/>
+                    <pic:cNvPr descr="../../figures/rated_orbit_crosscheck.png" id="84" name="Picture"/>
                     <pic:cNvPicPr>
                       <a:picLocks noChangeArrowheads="1" noChangeAspect="1"/>
                     </pic:cNvPicPr>
                   </pic:nvPicPr>
                   <pic:blipFill>
-                    <a:blip r:embed="rId77"/>
+                    <a:blip r:embed="rId82"/>
                     <a:stretch>
                       <a:fillRect/>
                     </a:stretch>
@@ -3227,18 +3366,18 @@
           <wp:inline>
             <wp:extent cx="4382391" cy="2697327"/>
             <wp:effectExtent b="0" l="0" r="0" t="0"/>
-            <wp:docPr descr="Modelled orbital-lifetime response. Absolute values depend on atmosphere." title="" id="81" name="Picture"/>
+            <wp:docPr descr="Modelled orbital-lifetime response. Absolute values depend on atmosphere." title="" id="86" name="Picture"/>
             <a:graphic>
               <a:graphicData uri="http://schemas.openxmlformats.org/drawingml/2006/picture">
                 <pic:pic>
                   <pic:nvPicPr>
-                    <pic:cNvPr descr="../../source/figures/F04_life.png" id="82" name="Picture"/>
+                    <pic:cNvPr descr="../../source/figures/F04_life.png" id="87" name="Picture"/>
                     <pic:cNvPicPr>
                       <a:picLocks noChangeArrowheads="1" noChangeAspect="1"/>
                     </pic:cNvPicPr>
                   </pic:nvPicPr>
                   <pic:blipFill>
-                    <a:blip r:embed="rId80"/>
+                    <a:blip r:embed="rId85"/>
                     <a:stretch>
                       <a:fillRect/>
                     </a:stretch>
@@ -3273,8 +3412,8 @@
         <w:t xml:space="preserve">Modelled orbital-lifetime response. Absolute values depend on atmosphere.</w:t>
       </w:r>
     </w:p>
-    <w:bookmarkEnd w:id="83"/>
-    <w:bookmarkStart w:id="87" w:name="installed-mass-changes-the-decision"/>
+    <w:bookmarkEnd w:id="88"/>
+    <w:bookmarkStart w:id="92" w:name="installed-mass-changes-the-decision"/>
     <w:p>
       <w:pPr>
         <w:pStyle w:val="Heading2"/>
@@ -3403,18 +3542,18 @@
           <wp:inline>
             <wp:extent cx="5334000" cy="1915167"/>
             <wp:effectExtent b="0" l="0" r="0" t="0"/>
-            <wp:docPr descr="Constraint and mass-attribution analysis; mass is a model rollup." title="" id="85" name="Picture"/>
+            <wp:docPr descr="Constraint and mass-attribution analysis; mass is a model rollup." title="" id="90" name="Picture"/>
             <a:graphic>
               <a:graphicData uri="http://schemas.openxmlformats.org/drawingml/2006/picture">
                 <pic:pic>
                   <pic:nvPicPr>
-                    <pic:cNvPr descr="../../source/figures/A35_ledger.png" id="86" name="Picture"/>
+                    <pic:cNvPr descr="../../source/figures/A35_ledger.png" id="91" name="Picture"/>
                     <pic:cNvPicPr>
                       <a:picLocks noChangeArrowheads="1" noChangeAspect="1"/>
                     </pic:cNvPicPr>
                   </pic:nvPicPr>
                   <pic:blipFill>
-                    <a:blip r:embed="rId84"/>
+                    <a:blip r:embed="rId89"/>
                     <a:stretch>
                       <a:fillRect/>
                     </a:stretch>
@@ -3449,8 +3588,8 @@
         <w:t xml:space="preserve">Constraint and mass-attribution analysis; mass is a model rollup.</w:t>
       </w:r>
     </w:p>
-    <w:bookmarkEnd w:id="87"/>
-    <w:bookmarkStart w:id="93" w:name="native-cad-and-packaging-review"/>
+    <w:bookmarkEnd w:id="92"/>
+    <w:bookmarkStart w:id="98" w:name="native-cad-and-packaging-review"/>
     <w:p>
       <w:pPr>
         <w:pStyle w:val="Heading2"/>
@@ -3469,7 +3608,7 @@
       <w:r>
         <w:t xml:space="preserve"> </w:t>
       </w:r>
-      <w:hyperlink r:id="rId88">
+      <w:hyperlink r:id="rId93">
         <w:r>
           <w:rPr>
             <w:rStyle w:val="Hyperlink"/>
@@ -3486,7 +3625,7 @@
       <w:r>
         <w:t xml:space="preserve"> </w:t>
       </w:r>
-      <w:hyperlink r:id="rId89">
+      <w:hyperlink r:id="rId94">
         <w:r>
           <w:rPr>
             <w:rStyle w:val="Hyperlink"/>
@@ -3611,18 +3750,18 @@
           <wp:inline>
             <wp:extent cx="4907280" cy="6642781"/>
             <wp:effectExtent b="0" l="0" r="0" t="0"/>
-            <wp:docPr descr="Dimensioned side-fed reference cross-section; this configuration fails the width check." title="" id="91" name="Picture"/>
+            <wp:docPr descr="Dimensioned side-fed reference cross-section; this configuration fails the width check." title="" id="96" name="Picture"/>
             <a:graphic>
               <a:graphicData uri="http://schemas.openxmlformats.org/drawingml/2006/picture">
                 <pic:pic>
                   <pic:nvPicPr>
-                    <pic:cNvPr descr="../../figures/gen5_packaging_section.png" id="92" name="Picture"/>
+                    <pic:cNvPr descr="../../figures/gen5_packaging_section.png" id="97" name="Picture"/>
                     <pic:cNvPicPr>
                       <a:picLocks noChangeArrowheads="1" noChangeAspect="1"/>
                     </pic:cNvPicPr>
                   </pic:nvPicPr>
                   <pic:blipFill>
-                    <a:blip r:embed="rId90"/>
+                    <a:blip r:embed="rId95"/>
                     <a:stretch>
                       <a:fillRect/>
                     </a:stretch>
@@ -3657,8 +3796,8 @@
         <w:t xml:space="preserve">Dimensioned side-fed reference cross-section; this configuration fails the width check.</w:t>
       </w:r>
     </w:p>
-    <w:bookmarkEnd w:id="93"/>
-    <w:bookmarkStart w:id="94" w:name="decision-and-evidence-boundary"/>
+    <w:bookmarkEnd w:id="98"/>
+    <w:bookmarkStart w:id="99" w:name="decision-and-evidence-boundary"/>
     <w:p>
       <w:pPr>
         <w:pStyle w:val="Heading2"/>
@@ -3675,9 +3814,9 @@
         <w:t xml:space="preserve">The analytical result has four parts. The model supports a commandable release and conditional orbital-energy benefit; the full-system 3U mass criterion fails; the stated side-fed layout fails its CAD width check; and physical behavior remains unverified. The latter includes release-cycle reliability, shock and arrest loads transmitted to stowed satellites, field exposure near a customer payload, host attitude/control authority and provider approval. The known-problems register ranks several as potentially design-fatal. These findings limit product claims and define the research conclusion.</w:t>
       </w:r>
     </w:p>
-    <w:bookmarkEnd w:id="94"/>
-    <w:bookmarkEnd w:id="95"/>
-    <w:bookmarkStart w:id="96" w:name="conclusion"/>
+    <w:bookmarkEnd w:id="99"/>
+    <w:bookmarkEnd w:id="100"/>
+    <w:bookmarkStart w:id="101" w:name="conclusion"/>
     <w:p>
       <w:pPr>
         <w:pStyle w:val="Heading1"/>
@@ -3702,8 +3841,8 @@
         <w:t xml:space="preserve">The thesis’s strongest engineering contribution is the transparent decision record: the full machine was modelled, independent numerical checks corrected several claims, and an unfavourable mass result was retained. That closes the Gen5 study and provides a defensible input to a separate future architecture trade.</w:t>
       </w:r>
     </w:p>
-    <w:bookmarkEnd w:id="96"/>
-    <w:bookmarkStart w:id="97" w:name="future-work"/>
+    <w:bookmarkEnd w:id="101"/>
+    <w:bookmarkStart w:id="102" w:name="future-work"/>
     <w:p>
       <w:pPr>
         <w:pStyle w:val="Heading1"/>
@@ -3728,8 +3867,8 @@
         <w:t xml:space="preserve">The near-term milestone is one named test-article configuration that can be independently reviewed. Its package needs controlled geometry and drawings, a bill of materials, host and payload interfaces, full installed mass/energy/thermal accounting, assembly and inspection instructions, instrumented procedures, predetermined pass/fail and stop criteria, uncertainty and model-credibility evidence, retained failures, and an explicit build/test release decision. A rejected candidate is a valid research outcome; it must not be presented as a build-ready survivor.</w:t>
       </w:r>
     </w:p>
-    <w:bookmarkEnd w:id="97"/>
-    <w:bookmarkStart w:id="98" w:name="references-and-project-records"/>
+    <w:bookmarkEnd w:id="102"/>
+    <w:bookmarkStart w:id="103" w:name="references-and-project-records"/>
     <w:p>
       <w:pPr>
         <w:pStyle w:val="Heading1"/>
@@ -4124,7 +4263,7 @@
         <w:t xml:space="preserve">, controlled working baseline, 29 September 2026. Project plan, not achieved performance.</w:t>
       </w:r>
     </w:p>
-    <w:bookmarkEnd w:id="98"/>
+    <w:bookmarkEnd w:id="103"/>
     <w:sectPr/>
   </w:body>
 </w:document>

</xml_diff>

<commit_message>
Integrate STEP renders into thesis and final review deck
</commit_message>
<xml_diff>
--- a/university/final_review_2026_10_10/PANEL_HANDBOOK.docx
+++ b/university/final_review_2026_10_10/PANEL_HANDBOOK.docx
@@ -261,14 +261,14 @@
       <w:r>
         <w:drawing>
           <wp:inline>
-            <wp:extent cx="4693920" cy="2933700"/>
+            <wp:extent cx="4693920" cy="2639026"/>
             <wp:effectExtent b="0" l="0" r="0" t="0"/>
-            <wp:docPr descr="Analysed Gen5 electromagnetic deployer configuration. CAD render; no physical article exists." title="" id="21" name="Picture"/>
+            <wp:docPr descr="Gen5 reference FreeCAD/STEP assembly visualized in Blender with enclosure hidden. Known side-fed clash remains; no physical article exists." title="" id="21" name="Picture"/>
             <a:graphic>
               <a:graphicData uri="http://schemas.openxmlformats.org/drawingml/2006/picture">
                 <pic:pic>
                   <pic:nvPicPr>
-                    <pic:cNvPr descr="../../cad/renders/gen5/exploded.png" id="22" name="Picture"/>
+                    <pic:cNvPr descr="../../cad/renders/step_review/gen5_reference_open.jpg" id="22" name="Picture"/>
                     <pic:cNvPicPr>
                       <a:picLocks noChangeArrowheads="1" noChangeAspect="1"/>
                     </pic:cNvPicPr>
@@ -282,7 +282,7 @@
                   <pic:spPr bwMode="auto">
                     <a:xfrm>
                       <a:off x="0" y="0"/>
-                      <a:ext cx="4693920" cy="2933700"/>
+                      <a:ext cx="4693920" cy="2639026"/>
                     </a:xfrm>
                     <a:prstGeom prst="rect">
                       <a:avLst/>
@@ -306,7 +306,7 @@
         <w:pStyle w:val="ImageCaption"/>
       </w:pPr>
       <w:r>
-        <w:t xml:space="preserve">Analysed Gen5 electromagnetic deployer configuration. CAD render; no physical article exists.</w:t>
+        <w:t xml:space="preserve">Gen5 reference FreeCAD/STEP assembly visualized in Blender with enclosure hidden. Known side-fed clash remains; no physical article exists.</w:t>
       </w:r>
     </w:p>
     <w:bookmarkStart w:id="23" w:name="executive-summary"/>

</xml_diff>

<commit_message>
Synchronize thesis review with mass and prototype requirements
</commit_message>
<xml_diff>
--- a/university/final_review_2026_10_10/PANEL_HANDBOOK.docx
+++ b/university/final_review_2026_10_10/PANEL_HANDBOOK.docx
@@ -530,7 +530,7 @@
       </w:r>
     </w:p>
     <w:bookmarkEnd w:id="23"/>
-    <w:bookmarkStart w:id="49" w:name="X6be4c09543f80416e16a1bdcc406a9e300f8f3f"/>
+    <w:bookmarkStart w:id="55" w:name="X6be4c09543f80416e16a1bdcc406a9e300f8f3f"/>
     <w:p>
       <w:pPr>
         <w:pStyle w:val="Heading1"/>
@@ -1217,8 +1217,143 @@
         <w:t xml:space="preserve">Matched reference results; assumed host and device classes.</w:t>
       </w:r>
     </w:p>
-    <w:bookmarkEnd w:id="49"/>
-    <w:bookmarkStart w:id="60" w:name="introduction"/>
+    <w:bookmarkStart w:id="54" w:name="X28e973c78545135c2e1eda9072c4a24fabe8585"/>
+    <w:p>
+      <w:pPr>
+        <w:pStyle w:val="Heading2"/>
+      </w:pPr>
+      <w:r>
+        <w:t xml:space="preserve">New installed-burden and precision-delivery screens</w:t>
+      </w:r>
+    </w:p>
+    <w:p>
+      <w:pPr>
+        <w:pStyle w:val="FirstParagraph"/>
+      </w:pPr>
+      <w:hyperlink r:id="rId49">
+        <w:r>
+          <w:rPr>
+            <w:rStyle w:val="Hyperlink"/>
+          </w:rPr>
+          <w:t xml:space="preserve">P123</w:t>
+        </w:r>
+      </w:hyperlink>
+      <w:r>
+        <w:t xml:space="preserve"> </w:t>
+      </w:r>
+      <w:r>
+        <w:t xml:space="preserve">resizes initial fuel to one ideal release plus an equal 2 kg reserve: despite saving 1.866 kg of host propellant in the fixed-fuel event, Gen5’s device plus resized fuel is</w:t>
+      </w:r>
+      <w:r>
+        <w:t xml:space="preserve"> </w:t>
+      </w:r>
+      <w:r>
+        <w:rPr>
+          <w:b/>
+          <w:bCs/>
+        </w:rPr>
+        <w:t xml:space="preserve">52.717 kg heavier</w:t>
+      </w:r>
+      <w:r>
+        <w:t xml:space="preserve"> </w:t>
+      </w:r>
+      <w:r>
+        <w:t xml:space="preserve">than the spring reference. The mass penalty does not by itself price a tailored delivery service, but it sets a serious burden for a buyer-backed mission to justify.</w:t>
+      </w:r>
+    </w:p>
+    <w:p>
+      <w:pPr>
+        <w:pStyle w:val="BodyText"/>
+      </w:pPr>
+      <w:hyperlink r:id="rId50">
+        <w:r>
+          <w:rPr>
+            <w:rStyle w:val="Hyperlink"/>
+          </w:rPr>
+          <w:t xml:space="preserve">P124</w:t>
+        </w:r>
+      </w:hyperlink>
+      <w:r>
+        <w:t xml:space="preserve"> </w:t>
+      </w:r>
+      <w:r>
+        <w:t xml:space="preserve">converts an explicitly assumed 450 km orbit target into ideal tangential increment and load requirements. A 20 km immediate axis rise takes about 11.149 m/s; a ±0.1 km axis tolerance leaves about 0.0555 m/s for the entire tangential-error allocation on its smaller side. A real delivery accuracy budget must include host state, vector, timing, propagation and tracking. At 1 km/s over Gen5’s 1.3 m stroke, an ordinary 4 kg 3U would face about</w:t>
+      </w:r>
+      <w:r>
+        <w:t xml:space="preserve"> </w:t>
+      </w:r>
+      <w:r>
+        <w:rPr>
+          <w:b/>
+          <w:bCs/>
+        </w:rPr>
+        <w:t xml:space="preserve">39,220 g</w:t>
+      </w:r>
+      <w:r>
+        <w:t xml:space="preserve"> </w:t>
+      </w:r>
+      <w:r>
+        <w:t xml:space="preserve">ideal mean acceleration and 2 MJ payload kinetic energy. The first Gen6 prototype should be scoped from a named payload and mission, with the 1 km/s objective held as separate research. None of these calculations measures VOLLEY precision.</w:t>
+      </w:r>
+    </w:p>
+    <w:p>
+      <w:pPr>
+        <w:pStyle w:val="CaptionedFigure"/>
+      </w:pPr>
+      <w:r>
+        <w:drawing>
+          <wp:inline>
+            <wp:extent cx="4800600" cy="2880360"/>
+            <wp:effectExtent b="0" l="0" r="0" t="0"/>
+            <wp:docPr descr="Ideal stroke/load requirements, not a measured VOLLEY command envelope." title="" id="52" name="Picture"/>
+            <a:graphic>
+              <a:graphicData uri="http://schemas.openxmlformats.org/drawingml/2006/picture">
+                <pic:pic>
+                  <pic:nvPicPr>
+                    <pic:cNvPr descr="../../figures/precision_delivery_design_space.png" id="53" name="Picture"/>
+                    <pic:cNvPicPr>
+                      <a:picLocks noChangeArrowheads="1" noChangeAspect="1"/>
+                    </pic:cNvPicPr>
+                  </pic:nvPicPr>
+                  <pic:blipFill>
+                    <a:blip r:embed="rId51"/>
+                    <a:stretch>
+                      <a:fillRect/>
+                    </a:stretch>
+                  </pic:blipFill>
+                  <pic:spPr bwMode="auto">
+                    <a:xfrm>
+                      <a:off x="0" y="0"/>
+                      <a:ext cx="4800600" cy="2880360"/>
+                    </a:xfrm>
+                    <a:prstGeom prst="rect">
+                      <a:avLst/>
+                    </a:prstGeom>
+                    <a:noFill/>
+                    <a:ln w="9525">
+                      <a:noFill/>
+                      <a:headEnd/>
+                      <a:tailEnd/>
+                    </a:ln>
+                  </pic:spPr>
+                </pic:pic>
+              </a:graphicData>
+            </a:graphic>
+          </wp:inline>
+        </w:drawing>
+      </w:r>
+    </w:p>
+    <w:p>
+      <w:pPr>
+        <w:pStyle w:val="ImageCaption"/>
+      </w:pPr>
+      <w:r>
+        <w:t xml:space="preserve">Ideal stroke/load requirements, not a measured VOLLEY command envelope.</w:t>
+      </w:r>
+    </w:p>
+    <w:bookmarkEnd w:id="54"/>
+    <w:bookmarkEnd w:id="55"/>
+    <w:bookmarkStart w:id="66" w:name="introduction"/>
     <w:p>
       <w:pPr>
         <w:pStyle w:val="Heading1"/>
@@ -1227,7 +1362,7 @@
         <w:t xml:space="preserve">1. Introduction</w:t>
       </w:r>
     </w:p>
-    <w:bookmarkStart w:id="50" w:name="the-deployment-problem"/>
+    <w:bookmarkStart w:id="56" w:name="the-deployment-problem"/>
     <w:p>
       <w:pPr>
         <w:pStyle w:val="Heading2"/>
@@ -1292,8 +1427,8 @@
         <w:t xml:space="preserve">The host is an active participant in the mission model. After its primary mission, a suitable hosted platform would need attitude control, available resources and permission to operate. It could perform coarse orbital repositioning; VOLLEY would assign each secondary payload a local release state. No specific upper stage has been selected or approved for that role.</w:t>
       </w:r>
     </w:p>
-    <w:bookmarkEnd w:id="50"/>
-    <w:bookmarkStart w:id="59" w:name="buyer-and-spacecraft-fit"/>
+    <w:bookmarkEnd w:id="56"/>
+    <w:bookmarkStart w:id="65" w:name="buyer-and-spacecraft-fit"/>
     <w:p>
       <w:pPr>
         <w:pStyle w:val="Heading2"/>
@@ -1312,7 +1447,7 @@
       <w:r>
         <w:t xml:space="preserve"> </w:t>
       </w:r>
-      <w:hyperlink r:id="rId51">
+      <w:hyperlink r:id="rId57">
         <w:r>
           <w:rPr>
             <w:rStyle w:val="Hyperlink"/>
@@ -1329,7 +1464,7 @@
       <w:r>
         <w:t xml:space="preserve"> </w:t>
       </w:r>
-      <w:hyperlink r:id="rId52">
+      <w:hyperlink r:id="rId58">
         <w:r>
           <w:rPr>
             <w:rStyle w:val="Hyperlink"/>
@@ -1346,7 +1481,7 @@
       <w:r>
         <w:t xml:space="preserve"> </w:t>
       </w:r>
-      <w:hyperlink r:id="rId53">
+      <w:hyperlink r:id="rId59">
         <w:r>
           <w:rPr>
             <w:rStyle w:val="Hyperlink"/>
@@ -1363,7 +1498,7 @@
       <w:r>
         <w:t xml:space="preserve"> </w:t>
       </w:r>
-      <w:hyperlink r:id="rId54">
+      <w:hyperlink r:id="rId60">
         <w:r>
           <w:rPr>
             <w:rStyle w:val="Hyperlink"/>
@@ -1422,7 +1557,7 @@
       <w:r>
         <w:t xml:space="preserve"> </w:t>
       </w:r>
-      <w:hyperlink r:id="rId55">
+      <w:hyperlink r:id="rId61">
         <w:r>
           <w:rPr>
             <w:rStyle w:val="Hyperlink"/>
@@ -1446,18 +1581,18 @@
           <wp:inline>
             <wp:extent cx="5334000" cy="2669996"/>
             <wp:effectExtent b="0" l="0" r="0" t="0"/>
-            <wp:docPr descr="Gen5 layout and mission hardware elements. Diagram from the thesis analysis." title="" id="57" name="Picture"/>
+            <wp:docPr descr="Gen5 layout and mission hardware elements. Diagram from the thesis analysis." title="" id="63" name="Picture"/>
             <a:graphic>
               <a:graphicData uri="http://schemas.openxmlformats.org/drawingml/2006/picture">
                 <pic:pic>
                   <pic:nvPicPr>
-                    <pic:cNvPr descr="../../source/figures/D02_layout.png" id="58" name="Picture"/>
+                    <pic:cNvPr descr="../../source/figures/D02_layout.png" id="64" name="Picture"/>
                     <pic:cNvPicPr>
                       <a:picLocks noChangeArrowheads="1" noChangeAspect="1"/>
                     </pic:cNvPicPr>
                   </pic:nvPicPr>
                   <pic:blipFill>
-                    <a:blip r:embed="rId56"/>
+                    <a:blip r:embed="rId62"/>
                     <a:stretch>
                       <a:fillRect/>
                     </a:stretch>
@@ -1492,9 +1627,9 @@
         <w:t xml:space="preserve">Gen5 layout and mission hardware elements. Diagram from the thesis analysis.</w:t>
       </w:r>
     </w:p>
-    <w:bookmarkEnd w:id="59"/>
-    <w:bookmarkEnd w:id="60"/>
-    <w:bookmarkStart w:id="61" w:name="literature-review"/>
+    <w:bookmarkEnd w:id="65"/>
+    <w:bookmarkEnd w:id="66"/>
+    <w:bookmarkStart w:id="67" w:name="literature-review"/>
     <w:p>
       <w:pPr>
         <w:pStyle w:val="Heading1"/>
@@ -1782,8 +1917,8 @@
         <w:t xml:space="preserve">satellite at a much lower acceleration while accounting for the whole installed system. No universal CubeSat quasi-static acceleration qualification is assumed; the launch provider and payload-specific limits must govern a real design [2,8].</w:t>
       </w:r>
     </w:p>
-    <w:bookmarkEnd w:id="61"/>
-    <w:bookmarkStart w:id="62" w:name="research-gap"/>
+    <w:bookmarkEnd w:id="67"/>
+    <w:bookmarkStart w:id="68" w:name="research-gap"/>
     <w:p>
       <w:pPr>
         <w:pStyle w:val="Heading1"/>
@@ -1826,8 +1961,8 @@
         <w:t xml:space="preserve">The thesis addresses that gap by constructing a documented Gen5 reference configuration and testing its own claims against explicit comparisons. It also records when those tests weaken the concept. Physical viability remains a separate research gap: numerical model agreement cannot establish manufactured tolerances, actual force, payload cleanliness, cycle reliability or provider compatibility.</w:t>
       </w:r>
     </w:p>
-    <w:bookmarkEnd w:id="62"/>
-    <w:bookmarkStart w:id="63" w:name="objectives-and-outcome"/>
+    <w:bookmarkEnd w:id="68"/>
+    <w:bookmarkStart w:id="69" w:name="objectives-and-outcome"/>
     <w:p>
       <w:pPr>
         <w:pStyle w:val="Heading1"/>
@@ -2089,8 +2224,8 @@
         <w:t xml:space="preserve">These objectives summarize the completed analytical research for this final-review presentation. They are a presentation synthesis, not a claim that the university approved this exact list in advance. The physical development tasks are shown later under future work.</w:t>
       </w:r>
     </w:p>
-    <w:bookmarkEnd w:id="63"/>
-    <w:bookmarkStart w:id="71" w:name="research-methodology"/>
+    <w:bookmarkEnd w:id="69"/>
+    <w:bookmarkStart w:id="77" w:name="research-methodology"/>
     <w:p>
       <w:pPr>
         <w:pStyle w:val="Heading1"/>
@@ -2248,18 +2383,18 @@
           <wp:inline>
             <wp:extent cx="5334000" cy="2028422"/>
             <wp:effectExtent b="0" l="0" r="0" t="0"/>
-            <wp:docPr descr="Historical modeled shot: velocity, bank voltage and current." title="" id="65" name="Picture"/>
+            <wp:docPr descr="Historical modeled shot: velocity, bank voltage and current." title="" id="71" name="Picture"/>
             <a:graphic>
               <a:graphicData uri="http://schemas.openxmlformats.org/drawingml/2006/picture">
                 <pic:pic>
                   <pic:nvPicPr>
-                    <pic:cNvPr descr="../../source/figures/F01_shot.png" id="66" name="Picture"/>
+                    <pic:cNvPr descr="../../source/figures/F01_shot.png" id="72" name="Picture"/>
                     <pic:cNvPicPr>
                       <a:picLocks noChangeArrowheads="1" noChangeAspect="1"/>
                     </pic:cNvPicPr>
                   </pic:nvPicPr>
                   <pic:blipFill>
-                    <a:blip r:embed="rId64"/>
+                    <a:blip r:embed="rId70"/>
                     <a:stretch>
                       <a:fillRect/>
                     </a:stretch>
@@ -2294,7 +2429,7 @@
         <w:t xml:space="preserve">Historical modeled shot: velocity, bank voltage and current.</w:t>
       </w:r>
     </w:p>
-    <w:bookmarkStart w:id="70" w:name="numerical-checks-and-their-limits"/>
+    <w:bookmarkStart w:id="76" w:name="numerical-checks-and-their-limits"/>
     <w:p>
       <w:pPr>
         <w:pStyle w:val="Heading2"/>
@@ -2320,18 +2455,18 @@
           <wp:inline>
             <wp:extent cx="4427220" cy="1990820"/>
             <wp:effectExtent b="0" l="0" r="0" t="0"/>
-            <wp:docPr descr="Representative magnetic-field model output. Source: thesis figure A02." title="" id="68" name="Picture"/>
+            <wp:docPr descr="Representative magnetic-field model output. Source: thesis figure A02." title="" id="74" name="Picture"/>
             <a:graphic>
               <a:graphicData uri="http://schemas.openxmlformats.org/drawingml/2006/picture">
                 <pic:pic>
                   <pic:nvPicPr>
-                    <pic:cNvPr descr="../../source/figures/A02_field_map.png" id="69" name="Picture"/>
+                    <pic:cNvPr descr="../../source/figures/A02_field_map.png" id="75" name="Picture"/>
                     <pic:cNvPicPr>
                       <a:picLocks noChangeArrowheads="1" noChangeAspect="1"/>
                     </pic:cNvPicPr>
                   </pic:nvPicPr>
                   <pic:blipFill>
-                    <a:blip r:embed="rId67"/>
+                    <a:blip r:embed="rId73"/>
                     <a:stretch>
                       <a:fillRect/>
                     </a:stretch>
@@ -2366,9 +2501,9 @@
         <w:t xml:space="preserve">Representative magnetic-field model output. Source: thesis figure A02.</w:t>
       </w:r>
     </w:p>
-    <w:bookmarkEnd w:id="70"/>
-    <w:bookmarkEnd w:id="71"/>
-    <w:bookmarkStart w:id="73" w:name="timeline"/>
+    <w:bookmarkEnd w:id="76"/>
+    <w:bookmarkEnd w:id="77"/>
+    <w:bookmarkStart w:id="79" w:name="timeline"/>
     <w:p>
       <w:pPr>
         <w:pStyle w:val="Heading1"/>
@@ -2377,7 +2512,7 @@
         <w:t xml:space="preserve">6. Timeline</w:t>
       </w:r>
     </w:p>
-    <w:bookmarkStart w:id="72" w:name="documented-evolution"/>
+    <w:bookmarkStart w:id="78" w:name="documented-evolution"/>
     <w:p>
       <w:pPr>
         <w:pStyle w:val="Heading2"/>
@@ -2639,9 +2774,9 @@
         <w:t xml:space="preserve">The thesis repository’s reconstructed history expressly marks several early milestone dates as approximate. The analytical baseline was revised as evidence improved: a CAD-derived sled mass displaced a lighter parametric estimate; a depth-resolved thrust calculation lowered the rated speed; an enclosure buildup exposed the 3U mass penalty; and an independent orbit check rejected an overbroad solar-invariance claim. These revisions are part of the completed study, not signs that the final numbers are placeholders. Gen6 research gates are described only in §10, Future work.</w:t>
       </w:r>
     </w:p>
-    <w:bookmarkEnd w:id="72"/>
-    <w:bookmarkEnd w:id="73"/>
-    <w:bookmarkStart w:id="74" w:name="work-progress"/>
+    <w:bookmarkEnd w:id="78"/>
+    <w:bookmarkEnd w:id="79"/>
+    <w:bookmarkStart w:id="80" w:name="work-progress"/>
     <w:p>
       <w:pPr>
         <w:pStyle w:val="Heading1"/>
@@ -2666,8 +2801,8 @@
         <w:t xml:space="preserve">The deliverable here is a completed computational thesis, not a flight article. The later long gas-guide and independent spring-cell studies are historical comparators. Gen6 has a mission direction and investigation envelope but is not a result of the Gen5 thesis. Its mechanism and exact payload/provider cases remain future choices.</w:t>
       </w:r>
     </w:p>
-    <w:bookmarkEnd w:id="74"/>
-    <w:bookmarkStart w:id="100" w:name="results"/>
+    <w:bookmarkEnd w:id="80"/>
+    <w:bookmarkStart w:id="106" w:name="results"/>
     <w:p>
       <w:pPr>
         <w:pStyle w:val="Heading1"/>
@@ -2676,7 +2811,7 @@
         <w:t xml:space="preserve">8. Results</w:t>
       </w:r>
     </w:p>
-    <w:bookmarkStart w:id="75" w:name="gen5-configuration"/>
+    <w:bookmarkStart w:id="81" w:name="gen5-configuration"/>
     <w:p>
       <w:pPr>
         <w:pStyle w:val="Heading2"/>
@@ -2709,8 +2844,8 @@
         <w:t xml:space="preserve">sled input comes from historical Gen3 CAD solid volumes; this value reduced the exit speed relative to an earlier optimistic parametric estimate. The CAD render conveys a concept, not manufactured or assembled hardware.</w:t>
       </w:r>
     </w:p>
-    <w:bookmarkEnd w:id="75"/>
-    <w:bookmarkStart w:id="77" w:name="rated-3u-shot"/>
+    <w:bookmarkEnd w:id="81"/>
+    <w:bookmarkStart w:id="83" w:name="rated-3u-shot"/>
     <w:p>
       <w:pPr>
         <w:pStyle w:val="Heading2"/>
@@ -3088,7 +3223,7 @@
       <w:r>
         <w:t xml:space="preserve"> </w:t>
       </w:r>
-      <w:hyperlink r:id="rId76">
+      <w:hyperlink r:id="rId82">
         <w:r>
           <w:rPr>
             <w:rStyle w:val="Hyperlink"/>
@@ -3119,8 +3254,8 @@
         <w:t xml:space="preserve">to 90.964 J assumed converter loss, 32.460 J auxiliary draw and 1.064 J of forward-Euler step excess, with a rounded residual below 0.001 J. This closes historical model arithmetic only. Selected hardware, switching and installed power verification remain open.</w:t>
       </w:r>
     </w:p>
-    <w:bookmarkEnd w:id="77"/>
-    <w:bookmarkStart w:id="81" w:name="command-precision"/>
+    <w:bookmarkEnd w:id="83"/>
+    <w:bookmarkStart w:id="87" w:name="command-precision"/>
     <w:p>
       <w:pPr>
         <w:pStyle w:val="Heading2"/>
@@ -3193,18 +3328,18 @@
           <wp:inline>
             <wp:extent cx="3886964" cy="2792131"/>
             <wp:effectExtent b="0" l="0" r="0" t="0"/>
-            <wp:docPr descr="Closed-loop simulation distribution at the fleet setpoint." title="" id="79" name="Picture"/>
+            <wp:docPr descr="Closed-loop simulation distribution at the fleet setpoint." title="" id="85" name="Picture"/>
             <a:graphic>
               <a:graphicData uri="http://schemas.openxmlformats.org/drawingml/2006/picture">
                 <pic:pic>
                   <pic:nvPicPr>
-                    <pic:cNvPr descr="../../source/figures/F03_mc.png" id="80" name="Picture"/>
+                    <pic:cNvPr descr="../../source/figures/F03_mc.png" id="86" name="Picture"/>
                     <pic:cNvPicPr>
                       <a:picLocks noChangeArrowheads="1" noChangeAspect="1"/>
                     </pic:cNvPicPr>
                   </pic:nvPicPr>
                   <pic:blipFill>
-                    <a:blip r:embed="rId78"/>
+                    <a:blip r:embed="rId84"/>
                     <a:stretch>
                       <a:fillRect/>
                     </a:stretch>
@@ -3239,8 +3374,8 @@
         <w:t xml:space="preserve">Closed-loop simulation distribution at the fleet setpoint.</w:t>
       </w:r>
     </w:p>
-    <w:bookmarkEnd w:id="81"/>
-    <w:bookmarkStart w:id="88" w:name="orbital-utility"/>
+    <w:bookmarkEnd w:id="87"/>
+    <w:bookmarkStart w:id="94" w:name="orbital-utility"/>
     <w:p>
       <w:pPr>
         <w:pStyle w:val="Heading2"/>
@@ -3311,18 +3446,18 @@
           <wp:inline>
             <wp:extent cx="4907280" cy="2473613"/>
             <wp:effectExtent b="0" l="0" r="0" t="0"/>
-            <wp:docPr descr="Independent rated-state two-body orbit check. The lifetime claim is outside its scope." title="" id="83" name="Picture"/>
+            <wp:docPr descr="Independent rated-state two-body orbit check. The lifetime claim is outside its scope." title="" id="89" name="Picture"/>
             <a:graphic>
               <a:graphicData uri="http://schemas.openxmlformats.org/drawingml/2006/picture">
                 <pic:pic>
                   <pic:nvPicPr>
-                    <pic:cNvPr descr="../../figures/rated_orbit_crosscheck.png" id="84" name="Picture"/>
+                    <pic:cNvPr descr="../../figures/rated_orbit_crosscheck.png" id="90" name="Picture"/>
                     <pic:cNvPicPr>
                       <a:picLocks noChangeArrowheads="1" noChangeAspect="1"/>
                     </pic:cNvPicPr>
                   </pic:nvPicPr>
                   <pic:blipFill>
-                    <a:blip r:embed="rId82"/>
+                    <a:blip r:embed="rId88"/>
                     <a:stretch>
                       <a:fillRect/>
                     </a:stretch>
@@ -3366,18 +3501,18 @@
           <wp:inline>
             <wp:extent cx="4382391" cy="2697327"/>
             <wp:effectExtent b="0" l="0" r="0" t="0"/>
-            <wp:docPr descr="Modelled orbital-lifetime response. Absolute values depend on atmosphere." title="" id="86" name="Picture"/>
+            <wp:docPr descr="Modelled orbital-lifetime response. Absolute values depend on atmosphere." title="" id="92" name="Picture"/>
             <a:graphic>
               <a:graphicData uri="http://schemas.openxmlformats.org/drawingml/2006/picture">
                 <pic:pic>
                   <pic:nvPicPr>
-                    <pic:cNvPr descr="../../source/figures/F04_life.png" id="87" name="Picture"/>
+                    <pic:cNvPr descr="../../source/figures/F04_life.png" id="93" name="Picture"/>
                     <pic:cNvPicPr>
                       <a:picLocks noChangeArrowheads="1" noChangeAspect="1"/>
                     </pic:cNvPicPr>
                   </pic:nvPicPr>
                   <pic:blipFill>
-                    <a:blip r:embed="rId85"/>
+                    <a:blip r:embed="rId91"/>
                     <a:stretch>
                       <a:fillRect/>
                     </a:stretch>
@@ -3412,8 +3547,8 @@
         <w:t xml:space="preserve">Modelled orbital-lifetime response. Absolute values depend on atmosphere.</w:t>
       </w:r>
     </w:p>
-    <w:bookmarkEnd w:id="88"/>
-    <w:bookmarkStart w:id="92" w:name="installed-mass-changes-the-decision"/>
+    <w:bookmarkEnd w:id="94"/>
+    <w:bookmarkStart w:id="98" w:name="installed-mass-changes-the-decision"/>
     <w:p>
       <w:pPr>
         <w:pStyle w:val="Heading2"/>
@@ -3542,18 +3677,18 @@
           <wp:inline>
             <wp:extent cx="5334000" cy="1915167"/>
             <wp:effectExtent b="0" l="0" r="0" t="0"/>
-            <wp:docPr descr="Constraint and mass-attribution analysis; mass is a model rollup." title="" id="90" name="Picture"/>
+            <wp:docPr descr="Constraint and mass-attribution analysis; mass is a model rollup." title="" id="96" name="Picture"/>
             <a:graphic>
               <a:graphicData uri="http://schemas.openxmlformats.org/drawingml/2006/picture">
                 <pic:pic>
                   <pic:nvPicPr>
-                    <pic:cNvPr descr="../../source/figures/A35_ledger.png" id="91" name="Picture"/>
+                    <pic:cNvPr descr="../../source/figures/A35_ledger.png" id="97" name="Picture"/>
                     <pic:cNvPicPr>
                       <a:picLocks noChangeArrowheads="1" noChangeAspect="1"/>
                     </pic:cNvPicPr>
                   </pic:nvPicPr>
                   <pic:blipFill>
-                    <a:blip r:embed="rId89"/>
+                    <a:blip r:embed="rId95"/>
                     <a:stretch>
                       <a:fillRect/>
                     </a:stretch>
@@ -3588,8 +3723,8 @@
         <w:t xml:space="preserve">Constraint and mass-attribution analysis; mass is a model rollup.</w:t>
       </w:r>
     </w:p>
-    <w:bookmarkEnd w:id="92"/>
-    <w:bookmarkStart w:id="98" w:name="native-cad-and-packaging-review"/>
+    <w:bookmarkEnd w:id="98"/>
+    <w:bookmarkStart w:id="104" w:name="native-cad-and-packaging-review"/>
     <w:p>
       <w:pPr>
         <w:pStyle w:val="Heading2"/>
@@ -3608,7 +3743,7 @@
       <w:r>
         <w:t xml:space="preserve"> </w:t>
       </w:r>
-      <w:hyperlink r:id="rId93">
+      <w:hyperlink r:id="rId99">
         <w:r>
           <w:rPr>
             <w:rStyle w:val="Hyperlink"/>
@@ -3625,7 +3760,7 @@
       <w:r>
         <w:t xml:space="preserve"> </w:t>
       </w:r>
-      <w:hyperlink r:id="rId94">
+      <w:hyperlink r:id="rId100">
         <w:r>
           <w:rPr>
             <w:rStyle w:val="Hyperlink"/>
@@ -3750,18 +3885,18 @@
           <wp:inline>
             <wp:extent cx="4907280" cy="6642781"/>
             <wp:effectExtent b="0" l="0" r="0" t="0"/>
-            <wp:docPr descr="Dimensioned side-fed reference cross-section; this configuration fails the width check." title="" id="96" name="Picture"/>
+            <wp:docPr descr="Dimensioned side-fed reference cross-section; this configuration fails the width check." title="" id="102" name="Picture"/>
             <a:graphic>
               <a:graphicData uri="http://schemas.openxmlformats.org/drawingml/2006/picture">
                 <pic:pic>
                   <pic:nvPicPr>
-                    <pic:cNvPr descr="../../figures/gen5_packaging_section.png" id="97" name="Picture"/>
+                    <pic:cNvPr descr="../../figures/gen5_packaging_section.png" id="103" name="Picture"/>
                     <pic:cNvPicPr>
                       <a:picLocks noChangeArrowheads="1" noChangeAspect="1"/>
                     </pic:cNvPicPr>
                   </pic:nvPicPr>
                   <pic:blipFill>
-                    <a:blip r:embed="rId95"/>
+                    <a:blip r:embed="rId101"/>
                     <a:stretch>
                       <a:fillRect/>
                     </a:stretch>
@@ -3796,8 +3931,8 @@
         <w:t xml:space="preserve">Dimensioned side-fed reference cross-section; this configuration fails the width check.</w:t>
       </w:r>
     </w:p>
-    <w:bookmarkEnd w:id="98"/>
-    <w:bookmarkStart w:id="99" w:name="decision-and-evidence-boundary"/>
+    <w:bookmarkEnd w:id="104"/>
+    <w:bookmarkStart w:id="105" w:name="decision-and-evidence-boundary"/>
     <w:p>
       <w:pPr>
         <w:pStyle w:val="Heading2"/>
@@ -3811,12 +3946,12 @@
         <w:pStyle w:val="FirstParagraph"/>
       </w:pPr>
       <w:r>
-        <w:t xml:space="preserve">The analytical result has four parts. The model supports a commandable release and conditional orbital-energy benefit; the full-system 3U mass criterion fails; the stated side-fed layout fails its CAD width check; and physical behavior remains unverified. The latter includes release-cycle reliability, shock and arrest loads transmitted to stowed satellites, field exposure near a customer payload, host attitude/control authority and provider approval. The known-problems register ranks several as potentially design-fatal. These findings limit product claims and define the research conclusion.</w:t>
-      </w:r>
-    </w:p>
-    <w:bookmarkEnd w:id="99"/>
-    <w:bookmarkEnd w:id="100"/>
-    <w:bookmarkStart w:id="101" w:name="conclusion"/>
+        <w:t xml:space="preserve">The analytical result has four parts. The historical model represents a proposed commandable release and a conditional orbital-energy benefit, but its speed is challenged by finite geometry; the full-system 3U mass criterion fails; the stated side-fed layout fails its CAD width check; and physical behavior remains unverified. The latter includes release-cycle reliability, shock and arrest loads transmitted to stowed satellites, field exposure near a customer payload, host attitude/control authority and provider approval. The known-problems register ranks several as potentially design-fatal. These findings limit product claims and define the research conclusion.</w:t>
+      </w:r>
+    </w:p>
+    <w:bookmarkEnd w:id="105"/>
+    <w:bookmarkEnd w:id="106"/>
+    <w:bookmarkStart w:id="107" w:name="conclusion"/>
     <w:p>
       <w:pPr>
         <w:pStyle w:val="Heading1"/>
@@ -3841,8 +3976,8 @@
         <w:t xml:space="preserve">The thesis’s strongest engineering contribution is the transparent decision record: the full machine was modelled, independent numerical checks corrected several claims, and an unfavourable mass result was retained. That closes the Gen5 study and provides a defensible input to a separate future architecture trade.</w:t>
       </w:r>
     </w:p>
-    <w:bookmarkEnd w:id="101"/>
-    <w:bookmarkStart w:id="102" w:name="future-work"/>
+    <w:bookmarkEnd w:id="107"/>
+    <w:bookmarkStart w:id="108" w:name="future-work"/>
     <w:p>
       <w:pPr>
         <w:pStyle w:val="Heading1"/>
@@ -3867,8 +4002,8 @@
         <w:t xml:space="preserve">The near-term milestone is one named test-article configuration that can be independently reviewed. Its package needs controlled geometry and drawings, a bill of materials, host and payload interfaces, full installed mass/energy/thermal accounting, assembly and inspection instructions, instrumented procedures, predetermined pass/fail and stop criteria, uncertainty and model-credibility evidence, retained failures, and an explicit build/test release decision. A rejected candidate is a valid research outcome; it must not be presented as a build-ready survivor.</w:t>
       </w:r>
     </w:p>
-    <w:bookmarkEnd w:id="102"/>
-    <w:bookmarkStart w:id="103" w:name="references-and-project-records"/>
+    <w:bookmarkEnd w:id="108"/>
+    <w:bookmarkStart w:id="109" w:name="references-and-project-records"/>
     <w:p>
       <w:pPr>
         <w:pStyle w:val="Heading1"/>
@@ -4263,7 +4398,7 @@
         <w:t xml:space="preserve">, controlled working baseline, 29 September 2026. Project plan, not achieved performance.</w:t>
       </w:r>
     </w:p>
-    <w:bookmarkEnd w:id="103"/>
+    <w:bookmarkEnd w:id="109"/>
     <w:sectPr/>
   </w:body>
 </w:document>

</xml_diff>

<commit_message>
Synchronize review PDFs and deck with source-power finding
</commit_message>
<xml_diff>
--- a/university/final_review_2026_10_10/PANEL_HANDBOOK.docx
+++ b/university/final_review_2026_10_10/PANEL_HANDBOOK.docx
@@ -530,7 +530,7 @@
       </w:r>
     </w:p>
     <w:bookmarkEnd w:id="23"/>
-    <w:bookmarkStart w:id="55" w:name="X6be4c09543f80416e16a1bdcc406a9e300f8f3f"/>
+    <w:bookmarkStart w:id="58" w:name="X6be4c09543f80416e16a1bdcc406a9e300f8f3f"/>
     <w:p>
       <w:pPr>
         <w:pStyle w:val="Heading1"/>
@@ -965,6 +965,75 @@
     </w:p>
     <w:p>
       <w:pPr>
+        <w:pStyle w:val="BodyText"/>
+      </w:pPr>
+      <w:hyperlink r:id="rId38">
+        <w:r>
+          <w:rPr>
+            <w:rStyle w:val="Hyperlink"/>
+          </w:rPr>
+          <w:t xml:space="preserve">P125</w:t>
+        </w:r>
+      </w:hyperlink>
+      <w:r>
+        <w:t xml:space="preserve"> </w:t>
+      </w:r>
+      <w:r>
+        <w:t xml:space="preserve">now tests that finite force under an ideal quasi-steady phase-voltage/current bound. The old assumed 12 mΩ source reaches 12.448 m/s conditionally; a</w:t>
+      </w:r>
+      <w:r>
+        <w:t xml:space="preserve"> </w:t>
+      </w:r>
+      <w:r>
+        <w:rPr>
+          <w:b/>
+          <w:bCs/>
+        </w:rPr>
+        <w:t xml:space="preserve">single</w:t>
+      </w:r>
+      <w:r>
+        <w:t xml:space="preserve"> </w:t>
+      </w:r>
+      <w:r>
+        <w:t xml:space="preserve">source string in the older distributor-data 116–185 mΩ ESR range fails source power before release. Ideal parallel strings complete numerically only by increasing cells and mass. No selected motor rating exists.</w:t>
+      </w:r>
+      <w:r>
+        <w:t xml:space="preserve"> </w:t>
+      </w:r>
+      <w:hyperlink r:id="rId39">
+        <w:r>
+          <w:rPr>
+            <w:rStyle w:val="Hyperlink"/>
+          </w:rPr>
+          <w:t xml:space="preserve">P126</w:t>
+        </w:r>
+      </w:hyperlink>
+      <w:r>
+        <w:t xml:space="preserve"> </w:t>
+      </w:r>
+      <w:r>
+        <w:t xml:space="preserve">also finds that an assumed 0.5° R1 alignment band consumes its 5 mm nominal side gap.</w:t>
+      </w:r>
+      <w:r>
+        <w:t xml:space="preserve"> </w:t>
+      </w:r>
+      <w:hyperlink r:id="rId40">
+        <w:r>
+          <w:rPr>
+            <w:rStyle w:val="Hyperlink"/>
+          </w:rPr>
+          <w:t xml:space="preserve">P127</w:t>
+        </w:r>
+      </w:hyperlink>
+      <w:r>
+        <w:t xml:space="preserve"> </w:t>
+      </w:r>
+      <w:r>
+        <w:t xml:space="preserve">requires at least 37.6 g mean sled arrest over the provisional 210 mm brake; peak force and heat remain open.</w:t>
+      </w:r>
+    </w:p>
+    <w:p>
+      <w:pPr>
         <w:pStyle w:val="CaptionedFigure"/>
       </w:pPr>
       <w:r>
@@ -972,18 +1041,18 @@
           <wp:inline>
             <wp:extent cx="5120640" cy="3607723"/>
             <wp:effectExtent b="0" l="0" r="0" t="0"/>
-            <wp:docPr descr="Finite-force speed and assumed bank energy histories." title="" id="39" name="Picture"/>
+            <wp:docPr descr="Finite-force speed and assumed bank energy histories." title="" id="42" name="Picture"/>
             <a:graphic>
               <a:graphicData uri="http://schemas.openxmlformats.org/drawingml/2006/picture">
                 <pic:pic>
                   <pic:nvPicPr>
-                    <pic:cNvPr descr="../../figures/gen5_finite_coupled_shot.png" id="40" name="Picture"/>
+                    <pic:cNvPr descr="../../figures/gen5_finite_coupled_shot.png" id="43" name="Picture"/>
                     <pic:cNvPicPr>
                       <a:picLocks noChangeArrowheads="1" noChangeAspect="1"/>
                     </pic:cNvPicPr>
                   </pic:nvPicPr>
                   <pic:blipFill>
-                    <a:blip r:embed="rId38"/>
+                    <a:blip r:embed="rId41"/>
                     <a:stretch>
                       <a:fillRect/>
                     </a:stretch>
@@ -1044,7 +1113,7 @@
       <w:r>
         <w:t xml:space="preserve"> </w:t>
       </w:r>
-      <w:hyperlink r:id="rId41">
+      <w:hyperlink r:id="rId44">
         <w:r>
           <w:rPr>
             <w:rStyle w:val="Hyperlink"/>
@@ -1065,18 +1134,18 @@
           <wp:inline>
             <wp:extent cx="4800600" cy="3382240"/>
             <wp:effectExtent b="0" l="0" r="0" t="0"/>
-            <wp:docPr descr="R1 candidate section; geometry drawing, not a qualified mechanism." title="" id="43" name="Picture"/>
+            <wp:docPr descr="R1 candidate section; geometry drawing, not a qualified mechanism." title="" id="46" name="Picture"/>
             <a:graphic>
               <a:graphicData uri="http://schemas.openxmlformats.org/drawingml/2006/picture">
                 <pic:pic>
                   <pic:nvPicPr>
-                    <pic:cNvPr descr="../../figures/gen5_feeder_candidate_r1.png" id="44" name="Picture"/>
+                    <pic:cNvPr descr="../../figures/gen5_feeder_candidate_r1.png" id="47" name="Picture"/>
                     <pic:cNvPicPr>
                       <a:picLocks noChangeArrowheads="1" noChangeAspect="1"/>
                     </pic:cNvPicPr>
                   </pic:nvPicPr>
                   <pic:blipFill>
-                    <a:blip r:embed="rId42"/>
+                    <a:blip r:embed="rId45"/>
                     <a:stretch>
                       <a:fillRect/>
                     </a:stretch>
@@ -1150,7 +1219,7 @@
       <w:r>
         <w:t xml:space="preserve"> </w:t>
       </w:r>
-      <w:hyperlink r:id="rId45">
+      <w:hyperlink r:id="rId48">
         <w:r>
           <w:rPr>
             <w:rStyle w:val="Hyperlink"/>
@@ -1171,18 +1240,18 @@
           <wp:inline>
             <wp:extent cx="5120640" cy="2150668"/>
             <wp:effectExtent b="0" l="0" r="0" t="0"/>
-            <wp:docPr descr="Matched reference results; assumed host and device classes." title="" id="47" name="Picture"/>
+            <wp:docPr descr="Matched reference results; assumed host and device classes." title="" id="50" name="Picture"/>
             <a:graphic>
               <a:graphicData uri="http://schemas.openxmlformats.org/drawingml/2006/picture">
                 <pic:pic>
                   <pic:nvPicPr>
-                    <pic:cNvPr descr="../../figures/matched_mission_reference.png" id="48" name="Picture"/>
+                    <pic:cNvPr descr="../../figures/matched_mission_reference.png" id="51" name="Picture"/>
                     <pic:cNvPicPr>
                       <a:picLocks noChangeArrowheads="1" noChangeAspect="1"/>
                     </pic:cNvPicPr>
                   </pic:nvPicPr>
                   <pic:blipFill>
-                    <a:blip r:embed="rId46"/>
+                    <a:blip r:embed="rId49"/>
                     <a:stretch>
                       <a:fillRect/>
                     </a:stretch>
@@ -1217,7 +1286,7 @@
         <w:t xml:space="preserve">Matched reference results; assumed host and device classes.</w:t>
       </w:r>
     </w:p>
-    <w:bookmarkStart w:id="54" w:name="X28e973c78545135c2e1eda9072c4a24fabe8585"/>
+    <w:bookmarkStart w:id="57" w:name="X28e973c78545135c2e1eda9072c4a24fabe8585"/>
     <w:p>
       <w:pPr>
         <w:pStyle w:val="Heading2"/>
@@ -1230,7 +1299,7 @@
       <w:pPr>
         <w:pStyle w:val="FirstParagraph"/>
       </w:pPr>
-      <w:hyperlink r:id="rId49">
+      <w:hyperlink r:id="rId52">
         <w:r>
           <w:rPr>
             <w:rStyle w:val="Hyperlink"/>
@@ -1265,7 +1334,7 @@
       <w:pPr>
         <w:pStyle w:val="BodyText"/>
       </w:pPr>
-      <w:hyperlink r:id="rId50">
+      <w:hyperlink r:id="rId53">
         <w:r>
           <w:rPr>
             <w:rStyle w:val="Hyperlink"/>
@@ -1305,18 +1374,18 @@
           <wp:inline>
             <wp:extent cx="4800600" cy="2880360"/>
             <wp:effectExtent b="0" l="0" r="0" t="0"/>
-            <wp:docPr descr="Ideal stroke/load requirements, not a measured VOLLEY command envelope." title="" id="52" name="Picture"/>
+            <wp:docPr descr="Ideal stroke/load requirements, not a measured VOLLEY command envelope." title="" id="55" name="Picture"/>
             <a:graphic>
               <a:graphicData uri="http://schemas.openxmlformats.org/drawingml/2006/picture">
                 <pic:pic>
                   <pic:nvPicPr>
-                    <pic:cNvPr descr="../../figures/precision_delivery_design_space.png" id="53" name="Picture"/>
+                    <pic:cNvPr descr="../../figures/precision_delivery_design_space.png" id="56" name="Picture"/>
                     <pic:cNvPicPr>
                       <a:picLocks noChangeArrowheads="1" noChangeAspect="1"/>
                     </pic:cNvPicPr>
                   </pic:nvPicPr>
                   <pic:blipFill>
-                    <a:blip r:embed="rId51"/>
+                    <a:blip r:embed="rId54"/>
                     <a:stretch>
                       <a:fillRect/>
                     </a:stretch>
@@ -1351,9 +1420,9 @@
         <w:t xml:space="preserve">Ideal stroke/load requirements, not a measured VOLLEY command envelope.</w:t>
       </w:r>
     </w:p>
-    <w:bookmarkEnd w:id="54"/>
-    <w:bookmarkEnd w:id="55"/>
-    <w:bookmarkStart w:id="66" w:name="introduction"/>
+    <w:bookmarkEnd w:id="57"/>
+    <w:bookmarkEnd w:id="58"/>
+    <w:bookmarkStart w:id="69" w:name="introduction"/>
     <w:p>
       <w:pPr>
         <w:pStyle w:val="Heading1"/>
@@ -1362,7 +1431,7 @@
         <w:t xml:space="preserve">1. Introduction</w:t>
       </w:r>
     </w:p>
-    <w:bookmarkStart w:id="56" w:name="the-deployment-problem"/>
+    <w:bookmarkStart w:id="59" w:name="the-deployment-problem"/>
     <w:p>
       <w:pPr>
         <w:pStyle w:val="Heading2"/>
@@ -1427,8 +1496,8 @@
         <w:t xml:space="preserve">The host is an active participant in the mission model. After its primary mission, a suitable hosted platform would need attitude control, available resources and permission to operate. It could perform coarse orbital repositioning; VOLLEY would assign each secondary payload a local release state. No specific upper stage has been selected or approved for that role.</w:t>
       </w:r>
     </w:p>
-    <w:bookmarkEnd w:id="56"/>
-    <w:bookmarkStart w:id="65" w:name="buyer-and-spacecraft-fit"/>
+    <w:bookmarkEnd w:id="59"/>
+    <w:bookmarkStart w:id="68" w:name="buyer-and-spacecraft-fit"/>
     <w:p>
       <w:pPr>
         <w:pStyle w:val="Heading2"/>
@@ -1447,7 +1516,7 @@
       <w:r>
         <w:t xml:space="preserve"> </w:t>
       </w:r>
-      <w:hyperlink r:id="rId57">
+      <w:hyperlink r:id="rId60">
         <w:r>
           <w:rPr>
             <w:rStyle w:val="Hyperlink"/>
@@ -1464,7 +1533,7 @@
       <w:r>
         <w:t xml:space="preserve"> </w:t>
       </w:r>
-      <w:hyperlink r:id="rId58">
+      <w:hyperlink r:id="rId61">
         <w:r>
           <w:rPr>
             <w:rStyle w:val="Hyperlink"/>
@@ -1481,7 +1550,7 @@
       <w:r>
         <w:t xml:space="preserve"> </w:t>
       </w:r>
-      <w:hyperlink r:id="rId59">
+      <w:hyperlink r:id="rId62">
         <w:r>
           <w:rPr>
             <w:rStyle w:val="Hyperlink"/>
@@ -1498,7 +1567,7 @@
       <w:r>
         <w:t xml:space="preserve"> </w:t>
       </w:r>
-      <w:hyperlink r:id="rId60">
+      <w:hyperlink r:id="rId63">
         <w:r>
           <w:rPr>
             <w:rStyle w:val="Hyperlink"/>
@@ -1557,7 +1626,7 @@
       <w:r>
         <w:t xml:space="preserve"> </w:t>
       </w:r>
-      <w:hyperlink r:id="rId61">
+      <w:hyperlink r:id="rId64">
         <w:r>
           <w:rPr>
             <w:rStyle w:val="Hyperlink"/>
@@ -1581,18 +1650,18 @@
           <wp:inline>
             <wp:extent cx="5334000" cy="2669996"/>
             <wp:effectExtent b="0" l="0" r="0" t="0"/>
-            <wp:docPr descr="Gen5 layout and mission hardware elements. Diagram from the thesis analysis." title="" id="63" name="Picture"/>
+            <wp:docPr descr="Gen5 layout and mission hardware elements. Diagram from the thesis analysis." title="" id="66" name="Picture"/>
             <a:graphic>
               <a:graphicData uri="http://schemas.openxmlformats.org/drawingml/2006/picture">
                 <pic:pic>
                   <pic:nvPicPr>
-                    <pic:cNvPr descr="../../source/figures/D02_layout.png" id="64" name="Picture"/>
+                    <pic:cNvPr descr="../../source/figures/D02_layout.png" id="67" name="Picture"/>
                     <pic:cNvPicPr>
                       <a:picLocks noChangeArrowheads="1" noChangeAspect="1"/>
                     </pic:cNvPicPr>
                   </pic:nvPicPr>
                   <pic:blipFill>
-                    <a:blip r:embed="rId62"/>
+                    <a:blip r:embed="rId65"/>
                     <a:stretch>
                       <a:fillRect/>
                     </a:stretch>
@@ -1627,9 +1696,9 @@
         <w:t xml:space="preserve">Gen5 layout and mission hardware elements. Diagram from the thesis analysis.</w:t>
       </w:r>
     </w:p>
-    <w:bookmarkEnd w:id="65"/>
-    <w:bookmarkEnd w:id="66"/>
-    <w:bookmarkStart w:id="67" w:name="literature-review"/>
+    <w:bookmarkEnd w:id="68"/>
+    <w:bookmarkEnd w:id="69"/>
+    <w:bookmarkStart w:id="70" w:name="literature-review"/>
     <w:p>
       <w:pPr>
         <w:pStyle w:val="Heading1"/>
@@ -1917,8 +1986,8 @@
         <w:t xml:space="preserve">satellite at a much lower acceleration while accounting for the whole installed system. No universal CubeSat quasi-static acceleration qualification is assumed; the launch provider and payload-specific limits must govern a real design [2,8].</w:t>
       </w:r>
     </w:p>
-    <w:bookmarkEnd w:id="67"/>
-    <w:bookmarkStart w:id="68" w:name="research-gap"/>
+    <w:bookmarkEnd w:id="70"/>
+    <w:bookmarkStart w:id="71" w:name="research-gap"/>
     <w:p>
       <w:pPr>
         <w:pStyle w:val="Heading1"/>
@@ -1961,8 +2030,8 @@
         <w:t xml:space="preserve">The thesis addresses that gap by constructing a documented Gen5 reference configuration and testing its own claims against explicit comparisons. It also records when those tests weaken the concept. Physical viability remains a separate research gap: numerical model agreement cannot establish manufactured tolerances, actual force, payload cleanliness, cycle reliability or provider compatibility.</w:t>
       </w:r>
     </w:p>
-    <w:bookmarkEnd w:id="68"/>
-    <w:bookmarkStart w:id="69" w:name="objectives-and-outcome"/>
+    <w:bookmarkEnd w:id="71"/>
+    <w:bookmarkStart w:id="72" w:name="objectives-and-outcome"/>
     <w:p>
       <w:pPr>
         <w:pStyle w:val="Heading1"/>
@@ -2224,8 +2293,8 @@
         <w:t xml:space="preserve">These objectives summarize the completed analytical research for this final-review presentation. They are a presentation synthesis, not a claim that the university approved this exact list in advance. The physical development tasks are shown later under future work.</w:t>
       </w:r>
     </w:p>
-    <w:bookmarkEnd w:id="69"/>
-    <w:bookmarkStart w:id="77" w:name="research-methodology"/>
+    <w:bookmarkEnd w:id="72"/>
+    <w:bookmarkStart w:id="80" w:name="research-methodology"/>
     <w:p>
       <w:pPr>
         <w:pStyle w:val="Heading1"/>
@@ -2383,18 +2452,18 @@
           <wp:inline>
             <wp:extent cx="5334000" cy="2028422"/>
             <wp:effectExtent b="0" l="0" r="0" t="0"/>
-            <wp:docPr descr="Historical modeled shot: velocity, bank voltage and current." title="" id="71" name="Picture"/>
+            <wp:docPr descr="Historical modeled shot: velocity, bank voltage and current." title="" id="74" name="Picture"/>
             <a:graphic>
               <a:graphicData uri="http://schemas.openxmlformats.org/drawingml/2006/picture">
                 <pic:pic>
                   <pic:nvPicPr>
-                    <pic:cNvPr descr="../../source/figures/F01_shot.png" id="72" name="Picture"/>
+                    <pic:cNvPr descr="../../source/figures/F01_shot.png" id="75" name="Picture"/>
                     <pic:cNvPicPr>
                       <a:picLocks noChangeArrowheads="1" noChangeAspect="1"/>
                     </pic:cNvPicPr>
                   </pic:nvPicPr>
                   <pic:blipFill>
-                    <a:blip r:embed="rId70"/>
+                    <a:blip r:embed="rId73"/>
                     <a:stretch>
                       <a:fillRect/>
                     </a:stretch>
@@ -2429,7 +2498,7 @@
         <w:t xml:space="preserve">Historical modeled shot: velocity, bank voltage and current.</w:t>
       </w:r>
     </w:p>
-    <w:bookmarkStart w:id="76" w:name="numerical-checks-and-their-limits"/>
+    <w:bookmarkStart w:id="79" w:name="numerical-checks-and-their-limits"/>
     <w:p>
       <w:pPr>
         <w:pStyle w:val="Heading2"/>
@@ -2455,18 +2524,18 @@
           <wp:inline>
             <wp:extent cx="4427220" cy="1990820"/>
             <wp:effectExtent b="0" l="0" r="0" t="0"/>
-            <wp:docPr descr="Representative magnetic-field model output. Source: thesis figure A02." title="" id="74" name="Picture"/>
+            <wp:docPr descr="Representative magnetic-field model output. Source: thesis figure A02." title="" id="77" name="Picture"/>
             <a:graphic>
               <a:graphicData uri="http://schemas.openxmlformats.org/drawingml/2006/picture">
                 <pic:pic>
                   <pic:nvPicPr>
-                    <pic:cNvPr descr="../../source/figures/A02_field_map.png" id="75" name="Picture"/>
+                    <pic:cNvPr descr="../../source/figures/A02_field_map.png" id="78" name="Picture"/>
                     <pic:cNvPicPr>
                       <a:picLocks noChangeArrowheads="1" noChangeAspect="1"/>
                     </pic:cNvPicPr>
                   </pic:nvPicPr>
                   <pic:blipFill>
-                    <a:blip r:embed="rId73"/>
+                    <a:blip r:embed="rId76"/>
                     <a:stretch>
                       <a:fillRect/>
                     </a:stretch>
@@ -2501,9 +2570,9 @@
         <w:t xml:space="preserve">Representative magnetic-field model output. Source: thesis figure A02.</w:t>
       </w:r>
     </w:p>
-    <w:bookmarkEnd w:id="76"/>
-    <w:bookmarkEnd w:id="77"/>
-    <w:bookmarkStart w:id="79" w:name="timeline"/>
+    <w:bookmarkEnd w:id="79"/>
+    <w:bookmarkEnd w:id="80"/>
+    <w:bookmarkStart w:id="82" w:name="timeline"/>
     <w:p>
       <w:pPr>
         <w:pStyle w:val="Heading1"/>
@@ -2512,7 +2581,7 @@
         <w:t xml:space="preserve">6. Timeline</w:t>
       </w:r>
     </w:p>
-    <w:bookmarkStart w:id="78" w:name="documented-evolution"/>
+    <w:bookmarkStart w:id="81" w:name="documented-evolution"/>
     <w:p>
       <w:pPr>
         <w:pStyle w:val="Heading2"/>
@@ -2774,9 +2843,9 @@
         <w:t xml:space="preserve">The thesis repository’s reconstructed history expressly marks several early milestone dates as approximate. The analytical baseline was revised as evidence improved: a CAD-derived sled mass displaced a lighter parametric estimate; a depth-resolved thrust calculation lowered the rated speed; an enclosure buildup exposed the 3U mass penalty; and an independent orbit check rejected an overbroad solar-invariance claim. These revisions are part of the completed study, not signs that the final numbers are placeholders. Gen6 research gates are described only in §10, Future work.</w:t>
       </w:r>
     </w:p>
-    <w:bookmarkEnd w:id="78"/>
-    <w:bookmarkEnd w:id="79"/>
-    <w:bookmarkStart w:id="80" w:name="work-progress"/>
+    <w:bookmarkEnd w:id="81"/>
+    <w:bookmarkEnd w:id="82"/>
+    <w:bookmarkStart w:id="83" w:name="work-progress"/>
     <w:p>
       <w:pPr>
         <w:pStyle w:val="Heading1"/>
@@ -2801,8 +2870,8 @@
         <w:t xml:space="preserve">The deliverable here is a completed computational thesis, not a flight article. The later long gas-guide and independent spring-cell studies are historical comparators. Gen6 has a mission direction and investigation envelope but is not a result of the Gen5 thesis. Its mechanism and exact payload/provider cases remain future choices.</w:t>
       </w:r>
     </w:p>
-    <w:bookmarkEnd w:id="80"/>
-    <w:bookmarkStart w:id="106" w:name="results"/>
+    <w:bookmarkEnd w:id="83"/>
+    <w:bookmarkStart w:id="109" w:name="results"/>
     <w:p>
       <w:pPr>
         <w:pStyle w:val="Heading1"/>
@@ -2811,7 +2880,7 @@
         <w:t xml:space="preserve">8. Results</w:t>
       </w:r>
     </w:p>
-    <w:bookmarkStart w:id="81" w:name="gen5-configuration"/>
+    <w:bookmarkStart w:id="84" w:name="gen5-configuration"/>
     <w:p>
       <w:pPr>
         <w:pStyle w:val="Heading2"/>
@@ -2844,8 +2913,8 @@
         <w:t xml:space="preserve">sled input comes from historical Gen3 CAD solid volumes; this value reduced the exit speed relative to an earlier optimistic parametric estimate. The CAD render conveys a concept, not manufactured or assembled hardware.</w:t>
       </w:r>
     </w:p>
-    <w:bookmarkEnd w:id="81"/>
-    <w:bookmarkStart w:id="83" w:name="rated-3u-shot"/>
+    <w:bookmarkEnd w:id="84"/>
+    <w:bookmarkStart w:id="86" w:name="rated-3u-shot"/>
     <w:p>
       <w:pPr>
         <w:pStyle w:val="Heading2"/>
@@ -3223,7 +3292,7 @@
       <w:r>
         <w:t xml:space="preserve"> </w:t>
       </w:r>
-      <w:hyperlink r:id="rId82">
+      <w:hyperlink r:id="rId85">
         <w:r>
           <w:rPr>
             <w:rStyle w:val="Hyperlink"/>
@@ -3254,8 +3323,8 @@
         <w:t xml:space="preserve">to 90.964 J assumed converter loss, 32.460 J auxiliary draw and 1.064 J of forward-Euler step excess, with a rounded residual below 0.001 J. This closes historical model arithmetic only. Selected hardware, switching and installed power verification remain open.</w:t>
       </w:r>
     </w:p>
-    <w:bookmarkEnd w:id="83"/>
-    <w:bookmarkStart w:id="87" w:name="command-precision"/>
+    <w:bookmarkEnd w:id="86"/>
+    <w:bookmarkStart w:id="90" w:name="command-precision"/>
     <w:p>
       <w:pPr>
         <w:pStyle w:val="Heading2"/>
@@ -3328,18 +3397,18 @@
           <wp:inline>
             <wp:extent cx="3886964" cy="2792131"/>
             <wp:effectExtent b="0" l="0" r="0" t="0"/>
-            <wp:docPr descr="Closed-loop simulation distribution at the fleet setpoint." title="" id="85" name="Picture"/>
+            <wp:docPr descr="Closed-loop simulation distribution at the fleet setpoint." title="" id="88" name="Picture"/>
             <a:graphic>
               <a:graphicData uri="http://schemas.openxmlformats.org/drawingml/2006/picture">
                 <pic:pic>
                   <pic:nvPicPr>
-                    <pic:cNvPr descr="../../source/figures/F03_mc.png" id="86" name="Picture"/>
+                    <pic:cNvPr descr="../../source/figures/F03_mc.png" id="89" name="Picture"/>
                     <pic:cNvPicPr>
                       <a:picLocks noChangeArrowheads="1" noChangeAspect="1"/>
                     </pic:cNvPicPr>
                   </pic:nvPicPr>
                   <pic:blipFill>
-                    <a:blip r:embed="rId84"/>
+                    <a:blip r:embed="rId87"/>
                     <a:stretch>
                       <a:fillRect/>
                     </a:stretch>
@@ -3374,8 +3443,8 @@
         <w:t xml:space="preserve">Closed-loop simulation distribution at the fleet setpoint.</w:t>
       </w:r>
     </w:p>
-    <w:bookmarkEnd w:id="87"/>
-    <w:bookmarkStart w:id="94" w:name="orbital-utility"/>
+    <w:bookmarkEnd w:id="90"/>
+    <w:bookmarkStart w:id="97" w:name="orbital-utility"/>
     <w:p>
       <w:pPr>
         <w:pStyle w:val="Heading2"/>
@@ -3446,18 +3515,18 @@
           <wp:inline>
             <wp:extent cx="4907280" cy="2473613"/>
             <wp:effectExtent b="0" l="0" r="0" t="0"/>
-            <wp:docPr descr="Independent rated-state two-body orbit check. The lifetime claim is outside its scope." title="" id="89" name="Picture"/>
+            <wp:docPr descr="Independent rated-state two-body orbit check. The lifetime claim is outside its scope." title="" id="92" name="Picture"/>
             <a:graphic>
               <a:graphicData uri="http://schemas.openxmlformats.org/drawingml/2006/picture">
                 <pic:pic>
                   <pic:nvPicPr>
-                    <pic:cNvPr descr="../../figures/rated_orbit_crosscheck.png" id="90" name="Picture"/>
+                    <pic:cNvPr descr="../../figures/rated_orbit_crosscheck.png" id="93" name="Picture"/>
                     <pic:cNvPicPr>
                       <a:picLocks noChangeArrowheads="1" noChangeAspect="1"/>
                     </pic:cNvPicPr>
                   </pic:nvPicPr>
                   <pic:blipFill>
-                    <a:blip r:embed="rId88"/>
+                    <a:blip r:embed="rId91"/>
                     <a:stretch>
                       <a:fillRect/>
                     </a:stretch>
@@ -3501,18 +3570,18 @@
           <wp:inline>
             <wp:extent cx="4382391" cy="2697327"/>
             <wp:effectExtent b="0" l="0" r="0" t="0"/>
-            <wp:docPr descr="Modelled orbital-lifetime response. Absolute values depend on atmosphere." title="" id="92" name="Picture"/>
+            <wp:docPr descr="Modelled orbital-lifetime response. Absolute values depend on atmosphere." title="" id="95" name="Picture"/>
             <a:graphic>
               <a:graphicData uri="http://schemas.openxmlformats.org/drawingml/2006/picture">
                 <pic:pic>
                   <pic:nvPicPr>
-                    <pic:cNvPr descr="../../source/figures/F04_life.png" id="93" name="Picture"/>
+                    <pic:cNvPr descr="../../source/figures/F04_life.png" id="96" name="Picture"/>
                     <pic:cNvPicPr>
                       <a:picLocks noChangeArrowheads="1" noChangeAspect="1"/>
                     </pic:cNvPicPr>
                   </pic:nvPicPr>
                   <pic:blipFill>
-                    <a:blip r:embed="rId91"/>
+                    <a:blip r:embed="rId94"/>
                     <a:stretch>
                       <a:fillRect/>
                     </a:stretch>
@@ -3547,8 +3616,8 @@
         <w:t xml:space="preserve">Modelled orbital-lifetime response. Absolute values depend on atmosphere.</w:t>
       </w:r>
     </w:p>
-    <w:bookmarkEnd w:id="94"/>
-    <w:bookmarkStart w:id="98" w:name="installed-mass-changes-the-decision"/>
+    <w:bookmarkEnd w:id="97"/>
+    <w:bookmarkStart w:id="101" w:name="installed-mass-changes-the-decision"/>
     <w:p>
       <w:pPr>
         <w:pStyle w:val="Heading2"/>
@@ -3677,18 +3746,18 @@
           <wp:inline>
             <wp:extent cx="5334000" cy="1915167"/>
             <wp:effectExtent b="0" l="0" r="0" t="0"/>
-            <wp:docPr descr="Constraint and mass-attribution analysis; mass is a model rollup." title="" id="96" name="Picture"/>
+            <wp:docPr descr="Constraint and mass-attribution analysis; mass is a model rollup." title="" id="99" name="Picture"/>
             <a:graphic>
               <a:graphicData uri="http://schemas.openxmlformats.org/drawingml/2006/picture">
                 <pic:pic>
                   <pic:nvPicPr>
-                    <pic:cNvPr descr="../../source/figures/A35_ledger.png" id="97" name="Picture"/>
+                    <pic:cNvPr descr="../../source/figures/A35_ledger.png" id="100" name="Picture"/>
                     <pic:cNvPicPr>
                       <a:picLocks noChangeArrowheads="1" noChangeAspect="1"/>
                     </pic:cNvPicPr>
                   </pic:nvPicPr>
                   <pic:blipFill>
-                    <a:blip r:embed="rId95"/>
+                    <a:blip r:embed="rId98"/>
                     <a:stretch>
                       <a:fillRect/>
                     </a:stretch>
@@ -3723,8 +3792,8 @@
         <w:t xml:space="preserve">Constraint and mass-attribution analysis; mass is a model rollup.</w:t>
       </w:r>
     </w:p>
-    <w:bookmarkEnd w:id="98"/>
-    <w:bookmarkStart w:id="104" w:name="native-cad-and-packaging-review"/>
+    <w:bookmarkEnd w:id="101"/>
+    <w:bookmarkStart w:id="107" w:name="native-cad-and-packaging-review"/>
     <w:p>
       <w:pPr>
         <w:pStyle w:val="Heading2"/>
@@ -3743,7 +3812,7 @@
       <w:r>
         <w:t xml:space="preserve"> </w:t>
       </w:r>
-      <w:hyperlink r:id="rId99">
+      <w:hyperlink r:id="rId102">
         <w:r>
           <w:rPr>
             <w:rStyle w:val="Hyperlink"/>
@@ -3760,7 +3829,7 @@
       <w:r>
         <w:t xml:space="preserve"> </w:t>
       </w:r>
-      <w:hyperlink r:id="rId100">
+      <w:hyperlink r:id="rId103">
         <w:r>
           <w:rPr>
             <w:rStyle w:val="Hyperlink"/>
@@ -3885,18 +3954,18 @@
           <wp:inline>
             <wp:extent cx="4907280" cy="6642781"/>
             <wp:effectExtent b="0" l="0" r="0" t="0"/>
-            <wp:docPr descr="Dimensioned side-fed reference cross-section; this configuration fails the width check." title="" id="102" name="Picture"/>
+            <wp:docPr descr="Dimensioned side-fed reference cross-section; this configuration fails the width check." title="" id="105" name="Picture"/>
             <a:graphic>
               <a:graphicData uri="http://schemas.openxmlformats.org/drawingml/2006/picture">
                 <pic:pic>
                   <pic:nvPicPr>
-                    <pic:cNvPr descr="../../figures/gen5_packaging_section.png" id="103" name="Picture"/>
+                    <pic:cNvPr descr="../../figures/gen5_packaging_section.png" id="106" name="Picture"/>
                     <pic:cNvPicPr>
                       <a:picLocks noChangeArrowheads="1" noChangeAspect="1"/>
                     </pic:cNvPicPr>
                   </pic:nvPicPr>
                   <pic:blipFill>
-                    <a:blip r:embed="rId101"/>
+                    <a:blip r:embed="rId104"/>
                     <a:stretch>
                       <a:fillRect/>
                     </a:stretch>
@@ -3931,8 +4000,8 @@
         <w:t xml:space="preserve">Dimensioned side-fed reference cross-section; this configuration fails the width check.</w:t>
       </w:r>
     </w:p>
-    <w:bookmarkEnd w:id="104"/>
-    <w:bookmarkStart w:id="105" w:name="decision-and-evidence-boundary"/>
+    <w:bookmarkEnd w:id="107"/>
+    <w:bookmarkStart w:id="108" w:name="decision-and-evidence-boundary"/>
     <w:p>
       <w:pPr>
         <w:pStyle w:val="Heading2"/>
@@ -3949,9 +4018,9 @@
         <w:t xml:space="preserve">The analytical result has four parts. The historical model represents a proposed commandable release and a conditional orbital-energy benefit, but its speed is challenged by finite geometry; the full-system 3U mass criterion fails; the stated side-fed layout fails its CAD width check; and physical behavior remains unverified. The latter includes release-cycle reliability, shock and arrest loads transmitted to stowed satellites, field exposure near a customer payload, host attitude/control authority and provider approval. The known-problems register ranks several as potentially design-fatal. These findings limit product claims and define the research conclusion.</w:t>
       </w:r>
     </w:p>
-    <w:bookmarkEnd w:id="105"/>
-    <w:bookmarkEnd w:id="106"/>
-    <w:bookmarkStart w:id="107" w:name="conclusion"/>
+    <w:bookmarkEnd w:id="108"/>
+    <w:bookmarkEnd w:id="109"/>
+    <w:bookmarkStart w:id="110" w:name="conclusion"/>
     <w:p>
       <w:pPr>
         <w:pStyle w:val="Heading1"/>
@@ -3976,8 +4045,8 @@
         <w:t xml:space="preserve">The thesis’s strongest engineering contribution is the transparent decision record: the full machine was modelled, independent numerical checks corrected several claims, and an unfavourable mass result was retained. That closes the Gen5 study and provides a defensible input to a separate future architecture trade.</w:t>
       </w:r>
     </w:p>
-    <w:bookmarkEnd w:id="107"/>
-    <w:bookmarkStart w:id="108" w:name="future-work"/>
+    <w:bookmarkEnd w:id="110"/>
+    <w:bookmarkStart w:id="111" w:name="future-work"/>
     <w:p>
       <w:pPr>
         <w:pStyle w:val="Heading1"/>
@@ -4002,8 +4071,8 @@
         <w:t xml:space="preserve">The near-term milestone is one named test-article configuration that can be independently reviewed. Its package needs controlled geometry and drawings, a bill of materials, host and payload interfaces, full installed mass/energy/thermal accounting, assembly and inspection instructions, instrumented procedures, predetermined pass/fail and stop criteria, uncertainty and model-credibility evidence, retained failures, and an explicit build/test release decision. A rejected candidate is a valid research outcome; it must not be presented as a build-ready survivor.</w:t>
       </w:r>
     </w:p>
-    <w:bookmarkEnd w:id="108"/>
-    <w:bookmarkStart w:id="109" w:name="references-and-project-records"/>
+    <w:bookmarkEnd w:id="111"/>
+    <w:bookmarkStart w:id="112" w:name="references-and-project-records"/>
     <w:p>
       <w:pPr>
         <w:pStyle w:val="Heading1"/>
@@ -4398,7 +4467,7 @@
         <w:t xml:space="preserve">, controlled working baseline, 29 September 2026. Project plan, not achieved performance.</w:t>
       </w:r>
     </w:p>
-    <w:bookmarkEnd w:id="109"/>
+    <w:bookmarkEnd w:id="112"/>
     <w:sectPr/>
   </w:body>
 </w:document>

</xml_diff>

<commit_message>
Synchronize Go 3 presenter and panel materials
</commit_message>
<xml_diff>
--- a/university/final_review_2026_10_10/PANEL_HANDBOOK.docx
+++ b/university/final_review_2026_10_10/PANEL_HANDBOOK.docx
@@ -129,7 +129,7 @@
         <w:pStyle w:val="Date"/>
       </w:pPr>
       <w:r>
-        <w:t xml:space="preserve">10</w:t>
+        <w:t xml:space="preserve">12</w:t>
       </w:r>
       <w:r>
         <w:t xml:space="preserve"> </w:t>
@@ -142,6 +142,18 @@
       </w:r>
       <w:r>
         <w:t xml:space="preserve">2026</w:t>
+      </w:r>
+      <w:r>
+        <w:t xml:space="preserve"> </w:t>
+      </w:r>
+      <w:r>
+        <w:t xml:space="preserve">(post-review</w:t>
+      </w:r>
+      <w:r>
+        <w:t xml:space="preserve"> </w:t>
+      </w:r>
+      <w:r>
+        <w:t xml:space="preserve">update)</w:t>
       </w:r>
     </w:p>
     <w:sdt>
@@ -4046,7 +4058,7 @@
       </w:r>
     </w:p>
     <w:bookmarkEnd w:id="110"/>
-    <w:bookmarkStart w:id="111" w:name="future-work"/>
+    <w:bookmarkStart w:id="115" w:name="future-work"/>
     <w:p>
       <w:pPr>
         <w:pStyle w:val="Heading1"/>
@@ -4071,8 +4083,101 @@
         <w:t xml:space="preserve">The near-term milestone is one named test-article configuration that can be independently reviewed. Its package needs controlled geometry and drawings, a bill of materials, host and payload interfaces, full installed mass/energy/thermal accounting, assembly and inspection instructions, instrumented procedures, predetermined pass/fail and stop criteria, uncertainty and model-credibility evidence, retained failures, and an explicit build/test release decision. A rejected candidate is a valid research outcome; it must not be presented as a build-ready survivor.</w:t>
       </w:r>
     </w:p>
-    <w:bookmarkEnd w:id="111"/>
-    <w:bookmarkStart w:id="112" w:name="references-and-project-records"/>
+    <w:p>
+      <w:pPr>
+        <w:pStyle w:val="BodyText"/>
+      </w:pPr>
+      <w:r>
+        <w:rPr>
+          <w:b/>
+          <w:bCs/>
+        </w:rPr>
+        <w:t xml:space="preserve">12 October post-review evidence update.</w:t>
+      </w:r>
+      <w:r>
+        <w:t xml:space="preserve"> </w:t>
+      </w:r>
+      <w:hyperlink r:id="rId111">
+        <w:r>
+          <w:rPr>
+            <w:rStyle w:val="Hyperlink"/>
+          </w:rPr>
+          <w:t xml:space="preserve">P130</w:t>
+        </w:r>
+      </w:hyperlink>
+      <w:r>
+        <w:t xml:space="preserve"> </w:t>
+      </w:r>
+      <w:r>
+        <w:t xml:space="preserve">models two passive 1U and two passive 3U spacecraft in a 500 km sun-synchronous surrogate. Both commanded release and spring-plus-host controls reach the same ideal full-state targets 24 hours after the last release. With assumed installed devices of 30 and 16 kg, commanded release saves 3.2823 kg of ideal host fuel but loses by 10.7177 kg on device plus consumed fuel. A +0.1 m/s shot error changes one-day terminal position by roughly 25–27 km. These are not customer tolerances or measured precision.</w:t>
+      </w:r>
+      <w:r>
+        <w:t xml:space="preserve"> </w:t>
+      </w:r>
+      <w:hyperlink r:id="rId112">
+        <w:r>
+          <w:rPr>
+            <w:rStyle w:val="Hyperlink"/>
+          </w:rPr>
+          <w:t xml:space="preserve">P131</w:t>
+        </w:r>
+      </w:hyperlink>
+      <w:r>
+        <w:t xml:space="preserve"> </w:t>
+      </w:r>
+      <w:r>
+        <w:t xml:space="preserve">and</w:t>
+      </w:r>
+      <w:r>
+        <w:t xml:space="preserve"> </w:t>
+      </w:r>
+      <w:hyperlink r:id="rId113">
+        <w:r>
+          <w:rPr>
+            <w:rStyle w:val="Hyperlink"/>
+          </w:rPr>
+          <w:t xml:space="preserve">P132</w:t>
+        </w:r>
+      </w:hyperlink>
+      <w:r>
+        <w:t xml:space="preserve"> </w:t>
+      </w:r>
+      <w:r>
+        <w:t xml:space="preserve">add two partial FreeCAD/STEP 3U first-article envelopes and necessary mechanical/source bounds. Their approximately 9.93 kg partial material proxy leaves only about 9.35 kg under the narrow surrogate parity ceiling for all omitted installed hardware. At 6 m/s, roughly 82 J of moving kinetic energy and 818 J of bus energy at an</w:t>
+      </w:r>
+      <w:r>
+        <w:t xml:space="preserve"> </w:t>
+      </w:r>
+      <w:r>
+        <w:rPr>
+          <w:i/>
+          <w:iCs/>
+        </w:rPr>
+        <w:t xml:space="preserve">assumed</w:t>
+      </w:r>
+      <w:r>
+        <w:t xml:space="preserve"> </w:t>
+      </w:r>
+      <w:r>
+        <w:t xml:space="preserve">10% efficiency are lower-bound screens; neither motor nor source is selected. G0/G1 remain open, and 1 km/s remains a separate long-range research question. See the</w:t>
+      </w:r>
+      <w:r>
+        <w:t xml:space="preserve"> </w:t>
+      </w:r>
+      <w:hyperlink r:id="rId114">
+        <w:r>
+          <w:rPr>
+            <w:rStyle w:val="Hyperlink"/>
+          </w:rPr>
+          <w:t xml:space="preserve">Go 3 gate review</w:t>
+        </w:r>
+      </w:hyperlink>
+      <w:r>
+        <w:t xml:space="preserve">.</w:t>
+      </w:r>
+    </w:p>
+    <w:bookmarkEnd w:id="115"/>
+    <w:bookmarkStart w:id="116" w:name="references-and-project-records"/>
     <w:p>
       <w:pPr>
         <w:pStyle w:val="Heading1"/>
@@ -4467,7 +4572,7 @@
         <w:t xml:space="preserve">, controlled working baseline, 29 September 2026. Project plan, not achieved performance.</w:t>
       </w:r>
     </w:p>
-    <w:bookmarkEnd w:id="112"/>
+    <w:bookmarkEnd w:id="116"/>
     <w:sectPr/>
   </w:body>
 </w:document>

</xml_diff>

<commit_message>
Reconcile Gen5 report and review pack with Gen6 CAD study
</commit_message>
<xml_diff>
--- a/university/final_review_2026_10_10/PANEL_HANDBOOK.docx
+++ b/university/final_review_2026_10_10/PANEL_HANDBOOK.docx
@@ -542,13 +542,13 @@
       </w:r>
     </w:p>
     <w:bookmarkEnd w:id="23"/>
-    <w:bookmarkStart w:id="58" w:name="X6be4c09543f80416e16a1bdcc406a9e300f8f3f"/>
+    <w:bookmarkStart w:id="58" w:name="X0a90c0239307c577b2c225485d61c9c794e51ce"/>
     <w:p>
       <w:pPr>
         <w:pStyle w:val="Heading1"/>
       </w:pPr>
       <w:r>
-        <w:t xml:space="preserve">New decisive findings: finite force, feeder route and matched mission</w:t>
+        <w:t xml:space="preserve">Finite-force, feeder-route and mission findings</w:t>
       </w:r>
     </w:p>
     <w:p>
@@ -1120,7 +1120,7 @@
         <w:t xml:space="preserve"> </w:t>
       </w:r>
       <w:r>
-        <w:t xml:space="preserve">uses a 570 mm wide enclosure. Its native FreeCAD document and STEP parts pass exact-solid static fit and twelve scripted 3U envelope transfer paths with conservative fixed-part swept boxes. It lacks the actual lift/carriage, launch restraint, actuation, tolerances, fault recovery and revised installed mass. Its increased envelope has no approved host. This candidate does not alter the evaluated Gen5 configuration or repair the performance discrepancy. See</w:t>
+        <w:t xml:space="preserve">uses a 570 mm wide enclosure. Its native FreeCAD document and STEP parts clear the original cassette/track overlap and scripted 3U envelope transfer paths against selected fixed parts. An expanded exact-solid pair census retains five other intersecting pairs, including sled/track and sled/stator conflicts. It lacks a complete lift/carriage, launch restraint, actuation, tolerances, fault recovery and revised installed mass. Its increased envelope has no approved host. This candidate does not alter the evaluated Gen5 configuration or repair the performance discrepancy. See</w:t>
       </w:r>
       <w:r>
         <w:t xml:space="preserve"> </w:t>
@@ -3938,7 +3938,7 @@
         <w:t xml:space="preserve"> </w:t>
       </w:r>
       <w:r>
-        <w:t xml:space="preserve">shortfall even before running clearance. The exact solids overlap by</w:t>
+        <w:t xml:space="preserve">shortfall even before running clearance. The cassette and track solids overlap by</w:t>
       </w:r>
       <w:r>
         <w:t xml:space="preserve"> </w:t>
@@ -3954,7 +3954,40 @@
         <w:t xml:space="preserve"> </w:t>
       </w:r>
       <w:r>
-        <w:t xml:space="preserve">in this placement. This fails that packaging arrangement. A different feed architecture, enclosure or dimension set requires a new configuration and reassessment; the current render must not be presented as an assembled flight article.</w:t>
+        <w:t xml:space="preserve">in this placement. An all-leaf census finds</w:t>
+      </w:r>
+      <w:r>
+        <w:t xml:space="preserve"> </w:t>
+      </w:r>
+      <w:r>
+        <w:rPr>
+          <w:b/>
+          <w:bCs/>
+        </w:rPr>
+        <w:t xml:space="preserve">17 intersecting pairs</w:t>
+      </w:r>
+      <w:r>
+        <w:t xml:space="preserve">, including sled/track (</w:t>
+      </w:r>
+      <w:r>
+        <w:rPr>
+          <w:b/>
+          <w:bCs/>
+        </w:rPr>
+        <w:t xml:space="preserve">82,983 mm³</w:t>
+      </w:r>
+      <w:r>
+        <w:t xml:space="preserve">) and sled/stator (</w:t>
+      </w:r>
+      <w:r>
+        <w:rPr>
+          <w:b/>
+          <w:bCs/>
+        </w:rPr>
+        <w:t xml:space="preserve">6,300 mm³</w:t>
+      </w:r>
+      <w:r>
+        <w:t xml:space="preserve">) conflicts. This fails the reference assembly as drawn. A different feed architecture, enclosure or dimension set requires a new configuration and reassessment; the current render must not be presented as an assembled flight article.</w:t>
       </w:r>
     </w:p>
     <w:p>
@@ -4058,7 +4091,7 @@
       </w:r>
     </w:p>
     <w:bookmarkEnd w:id="110"/>
-    <w:bookmarkStart w:id="115" w:name="future-work"/>
+    <w:bookmarkStart w:id="116" w:name="future-work"/>
     <w:p>
       <w:pPr>
         <w:pStyle w:val="Heading1"/>
@@ -4159,12 +4192,37 @@
         <w:t xml:space="preserve"> </w:t>
       </w:r>
       <w:r>
-        <w:t xml:space="preserve">10% efficiency are lower-bound screens; neither motor nor source is selected. G0/G1 remain open, and 1 km/s remains a separate long-range research question. See the</w:t>
+        <w:t xml:space="preserve">10% efficiency are lower-bound screens; neither motor nor source is selected. G0/G1 remain open, and 1 km/s remains a separate long-range research question.</w:t>
+      </w:r>
+    </w:p>
+    <w:p>
+      <w:pPr>
+        <w:pStyle w:val="BodyText"/>
+      </w:pPr>
+      <w:r>
+        <w:t xml:space="preserve">A later</w:t>
       </w:r>
       <w:r>
         <w:t xml:space="preserve"> </w:t>
       </w:r>
       <w:hyperlink r:id="rId114">
+        <w:r>
+          <w:rPr>
+            <w:rStyle w:val="Hyperlink"/>
+          </w:rPr>
+          <w:t xml:space="preserve">four-cell FreeCAD/STEP packaging study</w:t>
+        </w:r>
+      </w:hyperlink>
+      <w:r>
+        <w:t xml:space="preserve"> </w:t>
+      </w:r>
+      <w:r>
+        <w:t xml:space="preserve">compares two 1U and two 3U surrogate boxes in staggered and paired side cassettes. Both have 13 nominal represented-solid states and sampled transfer and stowed-carrier paths without penetration. Pairing moves the shortest ideal acceleration distance from 330 mm to 900 mm; at 6 m/s this lowers the corresponding ideal mean acceleration from 5.56 g to 2.04 g. Neither is an achievable-speed rating or a selected feed mechanism. Positive locks, contact loads, positioning, tolerances, installed mass and host fit remain open. This finding appears only in the 12 October post-review revision, not in the original 10 October presentation. See the</w:t>
+      </w:r>
+      <w:r>
+        <w:t xml:space="preserve"> </w:t>
+      </w:r>
+      <w:hyperlink r:id="rId115">
         <w:r>
           <w:rPr>
             <w:rStyle w:val="Hyperlink"/>
@@ -4176,8 +4234,8 @@
         <w:t xml:space="preserve">.</w:t>
       </w:r>
     </w:p>
-    <w:bookmarkEnd w:id="115"/>
-    <w:bookmarkStart w:id="116" w:name="references-and-project-records"/>
+    <w:bookmarkEnd w:id="116"/>
+    <w:bookmarkStart w:id="117" w:name="references-and-project-records"/>
     <w:p>
       <w:pPr>
         <w:pStyle w:val="Heading1"/>
@@ -4572,7 +4630,7 @@
         <w:t xml:space="preserve">, controlled working baseline, 29 September 2026. Project plan, not achieved performance.</w:t>
       </w:r>
     </w:p>
-    <w:bookmarkEnd w:id="116"/>
+    <w:bookmarkEnd w:id="117"/>
     <w:sectPr/>
   </w:body>
 </w:document>

</xml_diff>

<commit_message>
Reconcile Gen5 blackbook evidence, figures and limitations
</commit_message>
<xml_diff>
--- a/university/final_review_2026_10_10/PANEL_HANDBOOK.docx
+++ b/university/final_review_2026_10_10/PANEL_HANDBOOK.docx
@@ -461,7 +461,7 @@
         <w:t xml:space="preserve"> </w:t>
       </w:r>
       <w:r>
-        <w:t xml:space="preserve">modelled lifetime multiplier at mean solar activity. The lifetime result is atmosphere-sensitive and has not been independently rerun for that assumed historical input.</w:t>
+        <w:t xml:space="preserve">modelled lifetime multiplier at mean solar activity. The lifetime result is atmosphere-sensitive and is numerically reproduced by P134 under the same static atmosphere; actual environmental lifetime remains unvalidated.</w:t>
       </w:r>
     </w:p>
     <w:p>
@@ -3515,7 +3515,7 @@
         <w:t xml:space="preserve">28.800775 km</w:t>
       </w:r>
       <w:r>
-        <w:t xml:space="preserve">, agreeing within the declared numerical band. This checks only the immediate orbital-energy result. The atmospheric lifetime multiplier has not been independently reproduced at the exact current point. Timing alone, with zero relative impulse and no host or drag difference, produces neither persistent phasing nor this semi-major-axis change.</w:t>
+        <w:t xml:space="preserve">, agreeing within the declared numerical band. This checks only the immediate orbital-energy result. P134 independently integrates the shared static-atmosphere model and gives a 1.602165 ratio; that numerical agreement does not validate real lifetime or solar invariance. Timing alone, with zero relative impulse and no host or drag difference, produces neither persistent phasing nor this semi-major-axis change.</w:t>
       </w:r>
     </w:p>
     <w:p>
@@ -4087,7 +4087,7 @@
         <w:pStyle w:val="BodyText"/>
       </w:pPr>
       <w:r>
-        <w:t xml:space="preserve">The thesis’s strongest engineering contribution is the transparent decision record: the full machine was modelled, independent numerical checks corrected several claims, and an unfavourable mass result was retained. That closes the Gen5 study and provides a defensible input to a separate future architecture trade.</w:t>
+        <w:t xml:space="preserve">The thesis’s strongest engineering contribution is the transparent decision record: system budgets and idealized mechanisms were modelled, independent numerical checks corrected several claims, and an unfavourable mass result was retained. That closes the Gen5 study and provides a defensible input to a separate future architecture trade.</w:t>
       </w:r>
     </w:p>
     <w:bookmarkEnd w:id="110"/>
@@ -4631,6 +4631,153 @@
       </w:r>
     </w:p>
     <w:bookmarkEnd w:id="117"/>
+    <w:bookmarkStart w:id="124" w:name="X8ade56e31ebe36e7673023e73b24ddf6a50c811"/>
+    <w:p>
+      <w:pPr>
+        <w:pStyle w:val="Heading1"/>
+      </w:pPr>
+      <w:r>
+        <w:t xml:space="preserve">Reconciled engineering record, 16 October 2026</w:t>
+      </w:r>
+    </w:p>
+    <w:p>
+      <w:pPr>
+        <w:pStyle w:val="FirstParagraph"/>
+      </w:pPr>
+      <w:r>
+        <w:t xml:space="preserve">The 23-line historical mass model sums to 126.561588 kg dry, with an assumed axial CG of 0.457690 m. This is not a complete Gen5 material extraction or full inertia tensor. Potential enclosure/thermal/bracket allocation overlap remains unresolved; no unverified mass credit is taken. The original mass failure is retained.</w:t>
+      </w:r>
+    </w:p>
+    <w:p>
+      <w:pPr>
+        <w:pStyle w:val="BodyText"/>
+      </w:pPr>
+      <w:r>
+        <w:t xml:space="preserve">All 17 evaluated Gen5 and five widened-R1 intersections are classified as confirmed conflicts or unresolved adapter/payload proxy intersections. None is accepted as intentional contact without an interface definition; no geometry repair is claimed. Historical isolated FE results do not qualify the failed assembly.</w:t>
+      </w:r>
+    </w:p>
+    <w:p>
+      <w:pPr>
+        <w:pStyle w:val="BodyText"/>
+      </w:pPr>
+      <w:r>
+        <w:t xml:space="preserve">P134 uses a separate orbit-averaged DOP853 integration of the shared static atmosphere. At imposed inertial increments of 2.5, 12.448437 and 16.029 m/s it gives lifetime ratios of 1.082110, 1.451222 and 1.602165. The maximum refinement change is 0.000145%, below its 0.5% numerical band. Space weather, ballistic coefficient history and actual achieved release remain outside that evidence.</w:t>
+      </w:r>
+    </w:p>
+    <w:p>
+      <w:pPr>
+        <w:pStyle w:val="BodyText"/>
+      </w:pPr>
+      <w:r>
+        <w:t xml:space="preserve">The corrected A15 R1 archive was executed in GMAT R2026a on 30 September and reparsed on 16 October. Its circular RAAN span is 14.558545°; the focused window minimum sampled separation is 190.149944 m. No continuous-clearance, coupled sequential host or complete mission verdict follows. The 367° historical span is withdrawn.</w:t>
+      </w:r>
+    </w:p>
+    <w:p>
+      <w:pPr>
+        <w:pStyle w:val="CaptionedFigure"/>
+      </w:pPr>
+      <w:r>
+        <w:drawing>
+          <wp:inline>
+            <wp:extent cx="4907280" cy="2597064"/>
+            <wp:effectExtent b="0" l="0" r="0" t="0"/>
+            <wp:docPr descr="Independent numerical lifetime check under a shared static atmosphere; imposed input speeds, no environmental validation." title="" id="119" name="Picture"/>
+            <a:graphic>
+              <a:graphicData uri="http://schemas.openxmlformats.org/drawingml/2006/picture">
+                <pic:pic>
+                  <pic:nvPicPr>
+                    <pic:cNvPr descr="../../figures/gen5_lifetime_numerical_check.png" id="120" name="Picture"/>
+                    <pic:cNvPicPr>
+                      <a:picLocks noChangeArrowheads="1" noChangeAspect="1"/>
+                    </pic:cNvPicPr>
+                  </pic:nvPicPr>
+                  <pic:blipFill>
+                    <a:blip r:embed="rId118"/>
+                    <a:stretch>
+                      <a:fillRect/>
+                    </a:stretch>
+                  </pic:blipFill>
+                  <pic:spPr bwMode="auto">
+                    <a:xfrm>
+                      <a:off x="0" y="0"/>
+                      <a:ext cx="4907280" cy="2597064"/>
+                    </a:xfrm>
+                    <a:prstGeom prst="rect">
+                      <a:avLst/>
+                    </a:prstGeom>
+                    <a:noFill/>
+                    <a:ln w="9525">
+                      <a:noFill/>
+                      <a:headEnd/>
+                      <a:tailEnd/>
+                    </a:ln>
+                  </pic:spPr>
+                </pic:pic>
+              </a:graphicData>
+            </a:graphic>
+          </wp:inline>
+        </w:drawing>
+      </w:r>
+    </w:p>
+    <w:p>
+      <w:pPr>
+        <w:pStyle w:val="ImageCaption"/>
+      </w:pPr>
+      <w:r>
+        <w:t xml:space="preserve">Independent numerical lifetime check under a shared static atmosphere; imposed input speeds, no environmental validation.</w:t>
+      </w:r>
+    </w:p>
+    <w:p>
+      <w:pPr>
+        <w:pStyle w:val="BodyText"/>
+      </w:pPr>
+      <w:hyperlink r:id="rId121">
+        <w:r>
+          <w:rPr>
+            <w:rStyle w:val="Hyperlink"/>
+          </w:rPr>
+          <w:t xml:space="preserve">Mass and interface ledger</w:t>
+        </w:r>
+      </w:hyperlink>
+      <w:r>
+        <w:t xml:space="preserve"> </w:t>
+      </w:r>
+      <w:r>
+        <w:t xml:space="preserve">·</w:t>
+      </w:r>
+      <w:r>
+        <w:t xml:space="preserve"> </w:t>
+      </w:r>
+      <w:hyperlink r:id="rId122">
+        <w:r>
+          <w:rPr>
+            <w:rStyle w:val="Hyperlink"/>
+          </w:rPr>
+          <w:t xml:space="preserve">Uncertainty and acceptance</w:t>
+        </w:r>
+      </w:hyperlink>
+      <w:r>
+        <w:t xml:space="preserve"> </w:t>
+      </w:r>
+      <w:r>
+        <w:t xml:space="preserve">·</w:t>
+      </w:r>
+      <w:r>
+        <w:t xml:space="preserve"> </w:t>
+      </w:r>
+      <w:hyperlink r:id="rId123">
+        <w:r>
+          <w:rPr>
+            <w:rStyle w:val="Hyperlink"/>
+          </w:rPr>
+          <w:t xml:space="preserve">Solver boundary</w:t>
+        </w:r>
+      </w:hyperlink>
+      <w:r>
+        <w:t xml:space="preserve">.</w:t>
+      </w:r>
+    </w:p>
+    <w:bookmarkEnd w:id="124"/>
     <w:sectPr/>
   </w:body>
 </w:document>

</xml_diff>

<commit_message>
Select guided feeder and release reproducible academic evidence
</commit_message>
<xml_diff>
--- a/university/final_review_2026_10_10/PANEL_HANDBOOK.docx
+++ b/university/final_review_2026_10_10/PANEL_HANDBOOK.docx
@@ -45,37 +45,31 @@
         <w:pStyle w:val="Subtitle"/>
       </w:pPr>
       <w:r>
-        <w:t xml:space="preserve">Panel</w:t>
-      </w:r>
-      <w:r>
-        <w:t xml:space="preserve"> </w:t>
-      </w:r>
-      <w:r>
-        <w:t xml:space="preserve">handbook:</w:t>
-      </w:r>
-      <w:r>
-        <w:t xml:space="preserve"> </w:t>
-      </w:r>
-      <w:r>
-        <w:t xml:space="preserve">completed</w:t>
-      </w:r>
-      <w:r>
-        <w:t xml:space="preserve"> </w:t>
-      </w:r>
-      <w:r>
-        <w:t xml:space="preserve">Gen5</w:t>
-      </w:r>
-      <w:r>
-        <w:t xml:space="preserve"> </w:t>
-      </w:r>
-      <w:r>
-        <w:t xml:space="preserve">study,</w:t>
-      </w:r>
-      <w:r>
-        <w:t xml:space="preserve"> </w:t>
-      </w:r>
-      <w:r>
-        <w:t xml:space="preserve">findings,</w:t>
+        <w:t xml:space="preserve">Evaluated</w:t>
+      </w:r>
+      <w:r>
+        <w:t xml:space="preserve"> </w:t>
+      </w:r>
+      <w:r>
+        <w:t xml:space="preserve">Gen5,</w:t>
+      </w:r>
+      <w:r>
+        <w:t xml:space="preserve"> </w:t>
+      </w:r>
+      <w:r>
+        <w:t xml:space="preserve">selected</w:t>
+      </w:r>
+      <w:r>
+        <w:t xml:space="preserve"> </w:t>
+      </w:r>
+      <w:r>
+        <w:t xml:space="preserve">FM08-R3</w:t>
+      </w:r>
+      <w:r>
+        <w:t xml:space="preserve"> </w:t>
+      </w:r>
+      <w:r>
+        <w:t xml:space="preserve">feeder</w:t>
       </w:r>
       <w:r>
         <w:t xml:space="preserve"> </w:t>
@@ -87,13 +81,13 @@
         <w:t xml:space="preserve"> </w:t>
       </w:r>
       <w:r>
-        <w:t xml:space="preserve">future</w:t>
-      </w:r>
-      <w:r>
-        <w:t xml:space="preserve"> </w:t>
-      </w:r>
-      <w:r>
-        <w:t xml:space="preserve">direction</w:t>
+        <w:t xml:space="preserve">physical</w:t>
+      </w:r>
+      <w:r>
+        <w:t xml:space="preserve"> </w:t>
+      </w:r>
+      <w:r>
+        <w:t xml:space="preserve">development</w:t>
       </w:r>
     </w:p>
     <w:p>
@@ -129,7 +123,7 @@
         <w:pStyle w:val="Date"/>
       </w:pPr>
       <w:r>
-        <w:t xml:space="preserve">12</w:t>
+        <w:t xml:space="preserve">23</w:t>
       </w:r>
       <w:r>
         <w:t xml:space="preserve"> </w:t>
@@ -142,18 +136,6 @@
       </w:r>
       <w:r>
         <w:t xml:space="preserve">2026</w:t>
-      </w:r>
-      <w:r>
-        <w:t xml:space="preserve"> </w:t>
-      </w:r>
-      <w:r>
-        <w:t xml:space="preserve">(post-review</w:t>
-      </w:r>
-      <w:r>
-        <w:t xml:space="preserve"> </w:t>
-      </w:r>
-      <w:r>
-        <w:t xml:space="preserve">update)</w:t>
       </w:r>
     </w:p>
     <w:sdt>
@@ -263,7 +245,7 @@
         <w:t xml:space="preserve"> </w:t>
       </w:r>
       <w:r>
-        <w:t xml:space="preserve">VOLLEY is a system-level engineering design and computational research project. The Gen5 evaluated configuration and adverse numerical findings are documented; decisive force and mission closure remain open. The results are predictions, with numerical cross-checks where identified. Physical prototype testing, CubeSat qualification and provider accommodation belong to a later development phase. Gen6 is presented separately as future work.</w:t>
+        <w:t xml:space="preserve">VOLLEY is a system-level engineering design and computational research project. The Gen5 evaluated configuration and adverse numerical findings are documented; decisive force and mission closure remain open. The results are predictions, with numerical cross-checks where identified. Physical prototype testing, CubeSat qualification and provider accommodation belong to a later development phase. Gen6 is presented separately, including the selected FM08-R3 academic feeder design and its physical development requirements.</w:t>
       </w:r>
     </w:p>
     <w:p>
@@ -538,7 +520,7 @@
         <w:t xml:space="preserve"> </w:t>
       </w:r>
       <w:r>
-        <w:t xml:space="preserve">release-speed envelope across electromagnetic, mechanical, stored-energy, gas/fluid, hybrid, BOLLEY and conventional options. The high end is a requirement to examine and may prove infeasible. The near-term goal is one named, reproducible, independently reviewable test-article configuration with a corresponding build/test release decision.</w:t>
+        <w:t xml:space="preserve">release-speed envelope across electromagnetic, mechanical, stored-energy, gas/fluid, hybrid and conventional options. The high end is a requirement to examine and may prove infeasible. The near-term goal is one named, reproducible, independently reviewable test-article configuration with a corresponding build/test release decision.</w:t>
       </w:r>
     </w:p>
     <w:bookmarkEnd w:id="23"/>
@@ -2165,7 +2147,7 @@
               <w:jc w:val="left"/>
             </w:pPr>
             <w:r>
-              <w:t xml:space="preserve">Rated shot, circuit and closed-loop simulations</w:t>
+              <w:t xml:space="preserve">Historical shot, circuit and closed-loop simulations</w:t>
             </w:r>
           </w:p>
         </w:tc>
@@ -2852,7 +2834,7 @@
         <w:pStyle w:val="BodyText"/>
       </w:pPr>
       <w:r>
-        <w:t xml:space="preserve">The thesis repository’s reconstructed history expressly marks several early milestone dates as approximate. The analytical baseline was revised as evidence improved: a CAD-derived sled mass displaced a lighter parametric estimate; a depth-resolved thrust calculation lowered the rated speed; an enclosure buildup exposed the 3U mass penalty; and an independent orbit check rejected an overbroad solar-invariance claim. These revisions are part of the completed study, not signs that the final numbers are placeholders. Gen6 research gates are described only in §10, Future work.</w:t>
+        <w:t xml:space="preserve">The thesis repository’s reconstructed history expressly marks several early milestone dates as approximate. The analytical baseline was revised as evidence improved: a CAD-derived sled mass displaced a lighter parametric estimate; a depth-resolved thrust calculation lowered the historical periodic-model speed; an enclosure buildup exposed the 3U mass penalty; and an independent orbit check rejected an overbroad solar-invariance claim. These revisions form the documented computational record. The selected Gen6 feeder and its physical development requirements are described separately in Section 10.</w:t>
       </w:r>
     </w:p>
     <w:bookmarkEnd w:id="81"/>
@@ -2926,13 +2908,13 @@
       </w:r>
     </w:p>
     <w:bookmarkEnd w:id="84"/>
-    <w:bookmarkStart w:id="86" w:name="rated-3u-shot"/>
+    <w:bookmarkStart w:id="86" w:name="historical-nominal-3u-shot"/>
     <w:p>
       <w:pPr>
         <w:pStyle w:val="Heading2"/>
       </w:pPr>
       <w:r>
-        <w:t xml:space="preserve">Rated 3U shot</w:t>
+        <w:t xml:space="preserve">Historical nominal 3U shot</w:t>
       </w:r>
     </w:p>
     <w:tbl>
@@ -3527,7 +3509,7 @@
           <wp:inline>
             <wp:extent cx="4907280" cy="2473613"/>
             <wp:effectExtent b="0" l="0" r="0" t="0"/>
-            <wp:docPr descr="Independent rated-state two-body orbit check. The lifetime claim is outside its scope." title="" id="92" name="Picture"/>
+            <wp:docPr descr="Independent historical-state two-body orbit check. The lifetime claim is outside its scope." title="" id="92" name="Picture"/>
             <a:graphic>
               <a:graphicData uri="http://schemas.openxmlformats.org/drawingml/2006/picture">
                 <pic:pic>
@@ -3570,7 +3552,7 @@
         <w:pStyle w:val="ImageCaption"/>
       </w:pPr>
       <w:r>
-        <w:t xml:space="preserve">Independent rated-state two-body orbit check. The lifetime claim is outside its scope.</w:t>
+        <w:t xml:space="preserve">Independent historical-state two-body orbit check. The lifetime claim is outside its scope.</w:t>
       </w:r>
     </w:p>
     <w:p>
@@ -4091,13 +4073,13 @@
       </w:r>
     </w:p>
     <w:bookmarkEnd w:id="110"/>
-    <w:bookmarkStart w:id="116" w:name="future-work"/>
+    <w:bookmarkStart w:id="118" w:name="X2bbd2f2e97b82f86d84bfdc088980c96b387da8"/>
     <w:p>
       <w:pPr>
         <w:pStyle w:val="Heading1"/>
       </w:pPr>
       <w:r>
-        <w:t xml:space="preserve">10. Future work</w:t>
+        <w:t xml:space="preserve">10. Selected Gen6 feeder and physical development</w:t>
       </w:r>
     </w:p>
     <w:p>
@@ -4105,7 +4087,7 @@
         <w:pStyle w:val="FirstParagraph"/>
       </w:pPr>
       <w:r>
-        <w:t xml:space="preserve">Gen6’s controlling objective is a reusable launch path that sequentially accepts different supported CubeSat sizes and commands each departure condition. The approximately 1–2 m/s to 1 km/s span is an investigation envelope; the upper end may force acceleration, energy, travel, payload or provider constraints that reject candidates. Electromagnetic systems are preferred for comparison but are not preselected. Competent springs, electromechanical/stored-energy, gas/fluid, hybrid, BOLLEY and conventional mission substitutes belong in the same comparison boundary.</w:t>
+        <w:t xml:space="preserve">Gen6’s controlling objective is a reusable launch path that sequentially accepts different supported CubeSat sizes and commands each departure condition. The approximately 1–2 m/s to 1 km/s span is an investigation envelope; the upper end may force acceleration, energy, travel, payload or provider constraints that reject candidates. Electromagnetic systems are preferred for comparison but are not preselected. Competent springs, electromechanical/stored-energy, gas/fluid, hybrid and conventional mission substitutes belong in the same comparison boundary.</w:t>
       </w:r>
     </w:p>
     <w:p>
@@ -4234,8 +4216,67 @@
         <w:t xml:space="preserve">.</w:t>
       </w:r>
     </w:p>
-    <w:bookmarkEnd w:id="116"/>
-    <w:bookmarkStart w:id="117" w:name="references-and-project-records"/>
+    <w:bookmarkStart w:id="117" w:name="fm08-r3-selected-feeder-design"/>
+    <w:p>
+      <w:pPr>
+        <w:pStyle w:val="Heading2"/>
+      </w:pPr>
+      <w:r>
+        <w:t xml:space="preserve">FM08-R3 selected feeder design</w:t>
+      </w:r>
+    </w:p>
+    <w:p>
+      <w:pPr>
+        <w:pStyle w:val="FirstParagraph"/>
+      </w:pPr>
+      <w:r>
+        <w:t xml:space="preserve">The current academic feeder design uses independent guided lead-screw cassettes and one indexed receiver for two 1U and two 3U envelopes. Fixed 1U spacers remain in their cassettes. A split clutch disconnects the toothed-belt indexer before launch; stopped-carrier proof precedes re-engagement and return. A capped transfer channel, a proved-closed receiver far stop, near-side capture tabs, guides, hard stops and a normally engaged static brake define the intended containment chain. Nominal transfer is a coast operation. The pusher cannot pull a jammed spacecraft; end-stop impact remains unrated. A failed retained cell may be isolated only after independent common-path proof and supervised recovery; a bridge obstruction inhibits the shared path.</w:t>
+      </w:r>
+    </w:p>
+    <w:p>
+      <w:pPr>
+        <w:pStyle w:val="BodyText"/>
+      </w:pPr>
+      <w:r>
+        <w:t xml:space="preserve">The</w:t>
+      </w:r>
+      <w:r>
+        <w:t xml:space="preserve"> </w:t>
+      </w:r>
+      <w:hyperlink r:id="rId116">
+        <w:r>
+          <w:rPr>
+            <w:rStyle w:val="Hyperlink"/>
+          </w:rPr>
+          <w:t xml:space="preserve">local selected-design package</w:t>
+        </w:r>
+      </w:hyperlink>
+      <w:r>
+        <w:t xml:space="preserve"> </w:t>
+      </w:r>
+      <w:r>
+        <w:t xml:space="preserve">provides native CAD, STEP, calculations and executable sequencing records. The safety-led trade gives the lead screw 7.30/10, rack/pawl 7.10 and spring/two-gate 6.90. These are engineering judgments. Equal weights tie the top three; alternative priorities can change the preferred mechanism. The lead screw is selected for the declared controllability and custody requirements, with rack/pawl retained as runner-up.</w:t>
+      </w:r>
+    </w:p>
+    <w:p>
+      <w:pPr>
+        <w:pStyle w:val="BodyText"/>
+      </w:pPr>
+      <w:r>
+        <w:t xml:space="preserve">The conditional 50 N actuator screen gives 0.01485 N·m local motor demand and 0.02038 N·m receiver demand. At 100 N, receiver demand reaches 0.04058 N·m against a 0.0418 N·m catalog continuous rating. Resistance and 0.50 gear efficiency are assumptions; the small adverse-case margin requires physical correlation. The deterministic sequence model passes its enumerated four- and twelve-cell logical checks, including four-cell progression, empty return/home/reset, power loss, inhibited commands and supervised isolation. This verifies logical contracts, rather than real sensor truth or hardware reliability.</w:t>
+      </w:r>
+    </w:p>
+    <w:p>
+      <w:pPr>
+        <w:pStyle w:val="BodyText"/>
+      </w:pPr>
+      <w:r>
+        <w:t xml:space="preserve">Earlier FM06-R1 rigid-contact convergence remains unestablished and supplies no precision or peak-load rating for FM08-R3. The selected feeder is a controlled academic design baseline. Manufacturing acceptance, environmental qualification, measured repeated releases and provider approval belong to subsequent physical development.</w:t>
+      </w:r>
+    </w:p>
+    <w:bookmarkEnd w:id="117"/>
+    <w:bookmarkEnd w:id="118"/>
+    <w:bookmarkStart w:id="119" w:name="references-and-project-records"/>
     <w:p>
       <w:pPr>
         <w:pStyle w:val="Heading1"/>
@@ -4291,7 +4332,7 @@
         <w:t xml:space="preserve">CubeSat Design Specification</w:t>
       </w:r>
       <w:r>
-        <w:t xml:space="preserve">, Rev. 14, 2020.</w:t>
+        <w:t xml:space="preserve">, Rev. 14.1, 2022.</w:t>
       </w:r>
     </w:p>
     <w:p>
@@ -4590,7 +4631,7 @@
         <w:t xml:space="preserve">VOLLEY-thesis</w:t>
       </w:r>
       <w:r>
-        <w:t xml:space="preserve">: authored manuscript, baseline, provenance, figures and validation records, repository head</w:t>
+        <w:t xml:space="preserve">: authored manuscript, baseline, provenance, figures and validation records, historical technical snapshot</w:t>
       </w:r>
       <w:r>
         <w:t xml:space="preserve"> </w:t>
@@ -4614,7 +4655,7 @@
         </w:numPr>
       </w:pPr>
       <w:r>
-        <w:t xml:space="preserve">VOLLEY/BOLLEY,</w:t>
+        <w:t xml:space="preserve">VOLLEY,</w:t>
       </w:r>
       <w:r>
         <w:t xml:space="preserve"> </w:t>
@@ -4624,14 +4665,14 @@
           <w:i/>
           <w:iCs/>
         </w:rPr>
-        <w:t xml:space="preserve">Current Plan and Status — PLAN-R2</w:t>
+        <w:t xml:space="preserve">Controlled programme plan — PLAN-R2 (historical VOLLEY scope)</w:t>
       </w:r>
       <w:r>
         <w:t xml:space="preserve">, controlled working baseline, 29 September 2026. Project plan, not achieved performance.</w:t>
       </w:r>
     </w:p>
-    <w:bookmarkEnd w:id="117"/>
-    <w:bookmarkStart w:id="124" w:name="X8ade56e31ebe36e7673023e73b24ddf6a50c811"/>
+    <w:bookmarkEnd w:id="119"/>
+    <w:bookmarkStart w:id="126" w:name="X8ade56e31ebe36e7673023e73b24ddf6a50c811"/>
     <w:p>
       <w:pPr>
         <w:pStyle w:val="Heading1"/>
@@ -4681,18 +4722,18 @@
           <wp:inline>
             <wp:extent cx="4907280" cy="2597064"/>
             <wp:effectExtent b="0" l="0" r="0" t="0"/>
-            <wp:docPr descr="Independent numerical lifetime check under a shared static atmosphere; imposed input speeds, no environmental validation." title="" id="119" name="Picture"/>
+            <wp:docPr descr="Independent numerical lifetime check under a shared static atmosphere; imposed input speeds, no environmental validation." title="" id="121" name="Picture"/>
             <a:graphic>
               <a:graphicData uri="http://schemas.openxmlformats.org/drawingml/2006/picture">
                 <pic:pic>
                   <pic:nvPicPr>
-                    <pic:cNvPr descr="../../figures/gen5_lifetime_numerical_check.png" id="120" name="Picture"/>
+                    <pic:cNvPr descr="../../figures/gen5_lifetime_numerical_check.png" id="122" name="Picture"/>
                     <pic:cNvPicPr>
                       <a:picLocks noChangeArrowheads="1" noChangeAspect="1"/>
                     </pic:cNvPicPr>
                   </pic:nvPicPr>
                   <pic:blipFill>
-                    <a:blip r:embed="rId118"/>
+                    <a:blip r:embed="rId120"/>
                     <a:stretch>
                       <a:fillRect/>
                     </a:stretch>
@@ -4731,7 +4772,7 @@
       <w:pPr>
         <w:pStyle w:val="BodyText"/>
       </w:pPr>
-      <w:hyperlink r:id="rId121">
+      <w:hyperlink r:id="rId123">
         <w:r>
           <w:rPr>
             <w:rStyle w:val="Hyperlink"/>
@@ -4748,7 +4789,7 @@
       <w:r>
         <w:t xml:space="preserve"> </w:t>
       </w:r>
-      <w:hyperlink r:id="rId122">
+      <w:hyperlink r:id="rId124">
         <w:r>
           <w:rPr>
             <w:rStyle w:val="Hyperlink"/>
@@ -4765,7 +4806,7 @@
       <w:r>
         <w:t xml:space="preserve"> </w:t>
       </w:r>
-      <w:hyperlink r:id="rId123">
+      <w:hyperlink r:id="rId125">
         <w:r>
           <w:rPr>
             <w:rStyle w:val="Hyperlink"/>
@@ -4777,7 +4818,7 @@
         <w:t xml:space="preserve">.</w:t>
       </w:r>
     </w:p>
-    <w:bookmarkEnd w:id="124"/>
+    <w:bookmarkEnd w:id="126"/>
     <w:sectPr/>
   </w:body>
 </w:document>

</xml_diff>